<commit_message>
Docs: Agregué registros de defectos
Se agregaron los registros de defectos
</commit_message>
<xml_diff>
--- a/docs/entrega4/EPRO_Entrega4_Grupo9_Plataforma de gestión documental con versiones.docx
+++ b/docs/entrega4/EPRO_Entrega4_Grupo9_Plataforma de gestión documental con versiones.docx
@@ -516,6 +516,7 @@
                 <w:rFonts w:ascii="Arial" w:eastAsia="Calibri" w:hAnsi="Arial" w:cs="Arial"/>
               </w:rPr>
             </w:pPr>
+            <w:proofErr w:type="spellStart"/>
             <w:r>
               <w:rPr>
                 <w:rFonts w:ascii="Arial" w:eastAsia="Calibri" w:hAnsi="Arial" w:cs="Arial"/>
@@ -524,7 +525,18 @@
                 <w:sz w:val="24"/>
                 <w:szCs w:val="24"/>
               </w:rPr>
-              <w:t>Alumnos:</w:t>
+              <w:t>Alumnos</w:t>
+            </w:r>
+            <w:proofErr w:type="spellEnd"/>
+            <w:r>
+              <w:rPr>
+                <w:rFonts w:ascii="Arial" w:eastAsia="Calibri" w:hAnsi="Arial" w:cs="Arial"/>
+                <w:b/>
+                <w:bCs/>
+                <w:sz w:val="24"/>
+                <w:szCs w:val="24"/>
+              </w:rPr>
+              <w:t>:</w:t>
             </w:r>
           </w:p>
         </w:tc>
@@ -1045,6 +1057,7 @@
               </w:rPr>
               <w:t xml:space="preserve">20 de </w:t>
             </w:r>
+            <w:proofErr w:type="gramStart"/>
             <w:r>
               <w:rPr>
                 <w:rFonts w:ascii="Arial" w:eastAsia="Calibri" w:hAnsi="Arial" w:cs="Arial"/>
@@ -1052,7 +1065,17 @@
                 <w:szCs w:val="24"/>
                 <w:lang w:val="es-SV"/>
               </w:rPr>
-              <w:t xml:space="preserve">Mayo </w:t>
+              <w:t>Mayo</w:t>
+            </w:r>
+            <w:proofErr w:type="gramEnd"/>
+            <w:r>
+              <w:rPr>
+                <w:rFonts w:ascii="Arial" w:eastAsia="Calibri" w:hAnsi="Arial" w:cs="Arial"/>
+                <w:sz w:val="24"/>
+                <w:szCs w:val="24"/>
+                <w:lang w:val="es-SV"/>
+              </w:rPr>
+              <w:t xml:space="preserve"> </w:t>
             </w:r>
             <w:r>
               <w:rPr>
@@ -1165,7 +1188,11 @@
             <w:rPr>
               <w:rFonts w:cstheme="minorBidi"/>
               <w:noProof/>
+              <w:kern w:val="2"/>
+              <w:sz w:val="24"/>
+              <w:szCs w:val="24"/>
               <w:lang w:eastAsia="es-SV"/>
+              <w14:ligatures w14:val="standardContextual"/>
             </w:rPr>
           </w:pPr>
           <w:r>
@@ -1186,7 +1213,7 @@
             </w:rPr>
             <w:fldChar w:fldCharType="separate"/>
           </w:r>
-          <w:hyperlink w:anchor="_Toc230105203" w:history="1">
+          <w:hyperlink w:anchor="_Toc230111116" w:history="1">
             <w:r>
               <w:rPr>
                 <w:rStyle w:val="Hipervnculo"/>
@@ -1216,7 +1243,7 @@
                 <w:noProof/>
                 <w:webHidden/>
               </w:rPr>
-              <w:instrText xml:space="preserve"> PAGEREF _Toc230105203 \h </w:instrText>
+              <w:instrText xml:space="preserve"> PAGEREF _Toc230111116 \h </w:instrText>
             </w:r>
             <w:r>
               <w:rPr>
@@ -1256,10 +1283,14 @@
             <w:rPr>
               <w:rFonts w:cstheme="minorBidi"/>
               <w:noProof/>
+              <w:kern w:val="2"/>
+              <w:sz w:val="24"/>
+              <w:szCs w:val="24"/>
               <w:lang w:eastAsia="es-SV"/>
+              <w14:ligatures w14:val="standardContextual"/>
             </w:rPr>
           </w:pPr>
-          <w:hyperlink w:anchor="_Toc230105204" w:history="1">
+          <w:hyperlink w:anchor="_Toc230111117" w:history="1">
             <w:r>
               <w:rPr>
                 <w:rStyle w:val="Hipervnculo"/>
@@ -1287,7 +1318,7 @@
                 <w:noProof/>
                 <w:webHidden/>
               </w:rPr>
-              <w:instrText xml:space="preserve"> PAGEREF _Toc230105204 \h </w:instrText>
+              <w:instrText xml:space="preserve"> PAGEREF _Toc230111117 \h </w:instrText>
             </w:r>
             <w:r>
               <w:rPr>
@@ -1327,10 +1358,14 @@
             <w:rPr>
               <w:rFonts w:cstheme="minorBidi"/>
               <w:noProof/>
+              <w:kern w:val="2"/>
+              <w:sz w:val="24"/>
+              <w:szCs w:val="24"/>
               <w:lang w:eastAsia="es-SV"/>
+              <w14:ligatures w14:val="standardContextual"/>
             </w:rPr>
           </w:pPr>
-          <w:hyperlink w:anchor="_Toc230105205" w:history="1">
+          <w:hyperlink w:anchor="_Toc230111118" w:history="1">
             <w:r>
               <w:rPr>
                 <w:rStyle w:val="Hipervnculo"/>
@@ -1358,7 +1393,7 @@
                 <w:noProof/>
                 <w:webHidden/>
               </w:rPr>
-              <w:instrText xml:space="preserve"> PAGEREF _Toc230105205 \h </w:instrText>
+              <w:instrText xml:space="preserve"> PAGEREF _Toc230111118 \h </w:instrText>
             </w:r>
             <w:r>
               <w:rPr>
@@ -1391,17 +1426,21 @@
         </w:p>
         <w:p>
           <w:pPr>
-            <w:pStyle w:val="TDC1"/>
+            <w:pStyle w:val="TDC2"/>
             <w:tabs>
               <w:tab w:val="right" w:leader="dot" w:pos="9350"/>
             </w:tabs>
             <w:rPr>
               <w:rFonts w:cstheme="minorBidi"/>
               <w:noProof/>
+              <w:kern w:val="2"/>
+              <w:sz w:val="24"/>
+              <w:szCs w:val="24"/>
               <w:lang w:eastAsia="es-SV"/>
+              <w14:ligatures w14:val="standardContextual"/>
             </w:rPr>
           </w:pPr>
-          <w:hyperlink w:anchor="_Toc230105206" w:history="1">
+          <w:hyperlink w:anchor="_Toc230111119" w:history="1">
             <w:r>
               <w:rPr>
                 <w:rStyle w:val="Hipervnculo"/>
@@ -1410,7 +1449,7 @@
                 <w:bCs/>
                 <w:noProof/>
               </w:rPr>
-              <w:t>Repositorio de Github</w:t>
+              <w:t>Ambiente de Pruebas</w:t>
             </w:r>
             <w:r>
               <w:rPr>
@@ -1431,7 +1470,7 @@
                 <w:noProof/>
                 <w:webHidden/>
               </w:rPr>
-              <w:instrText xml:space="preserve"> PAGEREF _Toc230105206 \h </w:instrText>
+              <w:instrText xml:space="preserve"> PAGEREF _Toc230111119 \h </w:instrText>
             </w:r>
             <w:r>
               <w:rPr>
@@ -1464,6 +1503,158 @@
         </w:p>
         <w:p>
           <w:pPr>
+            <w:pStyle w:val="TDC2"/>
+            <w:tabs>
+              <w:tab w:val="right" w:leader="dot" w:pos="9350"/>
+            </w:tabs>
+            <w:rPr>
+              <w:rFonts w:cstheme="minorBidi"/>
+              <w:noProof/>
+              <w:kern w:val="2"/>
+              <w:sz w:val="24"/>
+              <w:szCs w:val="24"/>
+              <w:lang w:eastAsia="es-SV"/>
+              <w14:ligatures w14:val="standardContextual"/>
+            </w:rPr>
+          </w:pPr>
+          <w:hyperlink w:anchor="_Toc230111120" w:history="1">
+            <w:r>
+              <w:rPr>
+                <w:rStyle w:val="Hipervnculo"/>
+                <w:rFonts w:ascii="Arial" w:hAnsi="Arial" w:cs="Arial"/>
+                <w:noProof/>
+              </w:rPr>
+              <w:t>Criterios de Aceptación</w:t>
+            </w:r>
+            <w:r>
+              <w:rPr>
+                <w:noProof/>
+                <w:webHidden/>
+              </w:rPr>
+              <w:tab/>
+            </w:r>
+            <w:r>
+              <w:rPr>
+                <w:noProof/>
+                <w:webHidden/>
+              </w:rPr>
+              <w:fldChar w:fldCharType="begin"/>
+            </w:r>
+            <w:r>
+              <w:rPr>
+                <w:noProof/>
+                <w:webHidden/>
+              </w:rPr>
+              <w:instrText xml:space="preserve"> PAGEREF _Toc230111120 \h </w:instrText>
+            </w:r>
+            <w:r>
+              <w:rPr>
+                <w:noProof/>
+                <w:webHidden/>
+              </w:rPr>
+            </w:r>
+            <w:r>
+              <w:rPr>
+                <w:noProof/>
+                <w:webHidden/>
+              </w:rPr>
+              <w:fldChar w:fldCharType="separate"/>
+            </w:r>
+            <w:r>
+              <w:rPr>
+                <w:noProof/>
+                <w:webHidden/>
+              </w:rPr>
+              <w:t>13</w:t>
+            </w:r>
+            <w:r>
+              <w:rPr>
+                <w:noProof/>
+                <w:webHidden/>
+              </w:rPr>
+              <w:fldChar w:fldCharType="end"/>
+            </w:r>
+          </w:hyperlink>
+        </w:p>
+        <w:p>
+          <w:pPr>
+            <w:pStyle w:val="TDC1"/>
+            <w:tabs>
+              <w:tab w:val="right" w:leader="dot" w:pos="9350"/>
+            </w:tabs>
+            <w:rPr>
+              <w:rFonts w:cstheme="minorBidi"/>
+              <w:noProof/>
+              <w:kern w:val="2"/>
+              <w:sz w:val="24"/>
+              <w:szCs w:val="24"/>
+              <w:lang w:eastAsia="es-SV"/>
+              <w14:ligatures w14:val="standardContextual"/>
+            </w:rPr>
+          </w:pPr>
+          <w:hyperlink w:anchor="_Toc230111121" w:history="1">
+            <w:r>
+              <w:rPr>
+                <w:rStyle w:val="Hipervnculo"/>
+                <w:rFonts w:ascii="Arial" w:hAnsi="Arial" w:cs="Arial"/>
+                <w:b/>
+                <w:bCs/>
+                <w:noProof/>
+              </w:rPr>
+              <w:t>Repositorio de Github</w:t>
+            </w:r>
+            <w:r>
+              <w:rPr>
+                <w:noProof/>
+                <w:webHidden/>
+              </w:rPr>
+              <w:tab/>
+            </w:r>
+            <w:r>
+              <w:rPr>
+                <w:noProof/>
+                <w:webHidden/>
+              </w:rPr>
+              <w:fldChar w:fldCharType="begin"/>
+            </w:r>
+            <w:r>
+              <w:rPr>
+                <w:noProof/>
+                <w:webHidden/>
+              </w:rPr>
+              <w:instrText xml:space="preserve"> PAGEREF _Toc230111121 \h </w:instrText>
+            </w:r>
+            <w:r>
+              <w:rPr>
+                <w:noProof/>
+                <w:webHidden/>
+              </w:rPr>
+            </w:r>
+            <w:r>
+              <w:rPr>
+                <w:noProof/>
+                <w:webHidden/>
+              </w:rPr>
+              <w:fldChar w:fldCharType="separate"/>
+            </w:r>
+            <w:r>
+              <w:rPr>
+                <w:noProof/>
+                <w:webHidden/>
+              </w:rPr>
+              <w:t>17</w:t>
+            </w:r>
+            <w:r>
+              <w:rPr>
+                <w:noProof/>
+                <w:webHidden/>
+              </w:rPr>
+              <w:fldChar w:fldCharType="end"/>
+            </w:r>
+          </w:hyperlink>
+        </w:p>
+        <w:p>
+          <w:pPr>
             <w:rPr>
               <w:rFonts w:ascii="Arial" w:hAnsi="Arial" w:cs="Arial"/>
             </w:rPr>
@@ -1553,7 +1744,7 @@
           <w:lang w:val="es-SV"/>
         </w:rPr>
       </w:pPr>
-      <w:bookmarkStart w:id="1" w:name="_Toc230105203"/>
+      <w:bookmarkStart w:id="1" w:name="_Toc230111116"/>
       <w:r>
         <w:rPr>
           <w:rFonts w:ascii="Arial" w:hAnsi="Arial" w:cs="Arial"/>
@@ -1580,7 +1771,7 @@
           <w:lang w:val="es-SV"/>
         </w:rPr>
       </w:pPr>
-      <w:bookmarkStart w:id="2" w:name="_Toc230105204"/>
+      <w:bookmarkStart w:id="2" w:name="_Toc230111117"/>
       <w:r>
         <w:rPr>
           <w:rFonts w:ascii="Arial" w:hAnsi="Arial" w:cs="Arial"/>
@@ -2459,7 +2650,39 @@
           <w:rFonts w:ascii="Arial" w:hAnsi="Arial" w:cs="Arial"/>
           <w:lang w:val="es-ES"/>
         </w:rPr>
-        <w:t xml:space="preserve">Creación de un nuevo usuario: Ya que estamos ocupando usuarios para proteger la integridad de la información, al igual que para lidiar con los permisos específicos a los que tienen acceso estos, es necesario de que haya una manera de administrar los nuevos usuarios. Es aquí donde entra el usuario de administrador, el cual tiene la habilidad de crear nuevos usuarios, asignarles un correo y contraseña para que pueda acceder al sitio web, y asignarle su rol especifico (el cual permite que es lo que los usuarios pueden hacer). Es de esta forma donde se protege la información de la empresa al requerir un login, pero que también se evita que los usuarios puedan realizar acciones a las cuales ellos no tienen permisos (como que un empleado pueda crear nuevos usuarios). </w:t>
+        <w:t xml:space="preserve">Creación de un nuevo usuario: Ya que estamos ocupando usuarios para proteger la integridad de la información, al igual que para lidiar con los permisos específicos a los que tienen acceso estos, es necesario de que haya una manera de administrar los nuevos usuarios. Es aquí donde entra el usuario de administrador, el cual tiene la habilidad de crear nuevos usuarios, asignarles un correo y contraseña para que pueda acceder al sitio web, y asignarle su rol especifico (el cual permite que </w:t>
+      </w:r>
+      <w:proofErr w:type="gramStart"/>
+      <w:r>
+        <w:rPr>
+          <w:rFonts w:ascii="Arial" w:hAnsi="Arial" w:cs="Arial"/>
+          <w:lang w:val="es-ES"/>
+        </w:rPr>
+        <w:t>es</w:t>
+      </w:r>
+      <w:proofErr w:type="gramEnd"/>
+      <w:r>
+        <w:rPr>
+          <w:rFonts w:ascii="Arial" w:hAnsi="Arial" w:cs="Arial"/>
+          <w:lang w:val="es-ES"/>
+        </w:rPr>
+        <w:t xml:space="preserve"> lo que los usuarios pueden hacer). Es de esta forma donde se protege la información de la empresa al requerir un </w:t>
+      </w:r>
+      <w:proofErr w:type="spellStart"/>
+      <w:r>
+        <w:rPr>
+          <w:rFonts w:ascii="Arial" w:hAnsi="Arial" w:cs="Arial"/>
+          <w:lang w:val="es-ES"/>
+        </w:rPr>
+        <w:t>login</w:t>
+      </w:r>
+      <w:proofErr w:type="spellEnd"/>
+      <w:r>
+        <w:rPr>
+          <w:rFonts w:ascii="Arial" w:hAnsi="Arial" w:cs="Arial"/>
+          <w:lang w:val="es-ES"/>
+        </w:rPr>
+        <w:t xml:space="preserve">, pero que también se evita que los usuarios puedan realizar acciones a las cuales ellos no tienen permisos (como que un empleado pueda crear nuevos usuarios). </w:t>
       </w:r>
     </w:p>
     <w:p>
@@ -2569,7 +2792,23 @@
           <w:rFonts w:ascii="Arial" w:hAnsi="Arial" w:cs="Arial"/>
           <w:lang w:val="es-ES"/>
         </w:rPr>
-        <w:t xml:space="preserve">y aclarar las dudas que pueda haber en un área específica de cada documento o de cada versión especifica de un documento. Estos comentarios se ordenan de más viejo al más reciente, lo que permite que se pueda ver de una manera clara, como han avanzado los comentarios en sí, la conversación y dudas que puedan haber sobre el documento especifico. Como ejemplo, digamos que un empleado no entiende porque hubo en cambio especifico entre la versión anterior y la </w:t>
+        <w:t xml:space="preserve">y aclarar las dudas que pueda haber en un área específica de cada documento o de cada versión especifica de un documento. Estos comentarios se ordenan de más viejo al más reciente, lo que permite que se pueda ver de una manera clara, como han avanzado los comentarios en sí, la conversación y dudas que </w:t>
+      </w:r>
+      <w:proofErr w:type="gramStart"/>
+      <w:r>
+        <w:rPr>
+          <w:rFonts w:ascii="Arial" w:hAnsi="Arial" w:cs="Arial"/>
+          <w:lang w:val="es-ES"/>
+        </w:rPr>
+        <w:t>puedan</w:t>
+      </w:r>
+      <w:proofErr w:type="gramEnd"/>
+      <w:r>
+        <w:rPr>
+          <w:rFonts w:ascii="Arial" w:hAnsi="Arial" w:cs="Arial"/>
+          <w:lang w:val="es-ES"/>
+        </w:rPr>
+        <w:t xml:space="preserve"> haber sobre el documento especifico. Como ejemplo, digamos que un empleado no entiende porque hubo en cambio especifico entre la versión anterior y la </w:t>
       </w:r>
       <w:r>
         <w:rPr>
@@ -2693,7 +2932,23 @@
           <w:rFonts w:ascii="Arial" w:hAnsi="Arial" w:cs="Arial"/>
           <w:lang w:val="es-ES"/>
         </w:rPr>
-        <w:t>iene nuestro sistema, es que ha sido planeado e implementado para una pequeña y mediana empresa (pyme), por lo que no ha sido diseñado para manejar una cantidad enorme de documentos o de usuarios (como lo serian en una gran empresa)</w:t>
+        <w:t xml:space="preserve">iene nuestro </w:t>
+      </w:r>
+      <w:proofErr w:type="gramStart"/>
+      <w:r>
+        <w:rPr>
+          <w:rFonts w:ascii="Arial" w:hAnsi="Arial" w:cs="Arial"/>
+          <w:lang w:val="es-ES"/>
+        </w:rPr>
+        <w:t>sistema,</w:t>
+      </w:r>
+      <w:proofErr w:type="gramEnd"/>
+      <w:r>
+        <w:rPr>
+          <w:rFonts w:ascii="Arial" w:hAnsi="Arial" w:cs="Arial"/>
+          <w:lang w:val="es-ES"/>
+        </w:rPr>
+        <w:t xml:space="preserve"> es que ha sido planeado e implementado para una pequeña y mediana empresa (pyme), por lo que no ha sido diseñado para manejar una cantidad enorme de documentos o de usuarios (como lo serian en una gran empresa)</w:t>
       </w:r>
       <w:r>
         <w:rPr>
@@ -2735,7 +2990,7 @@
           <w:lang w:val="es-SV"/>
         </w:rPr>
       </w:pPr>
-      <w:bookmarkStart w:id="3" w:name="_Toc230105205"/>
+      <w:bookmarkStart w:id="3" w:name="_Toc230111118"/>
       <w:r>
         <w:rPr>
           <w:rFonts w:ascii="Arial" w:hAnsi="Arial" w:cs="Arial"/>
@@ -2941,7 +3196,23 @@
           <w:lang w:val="es-ES"/>
         </w:rPr>
         <w:lastRenderedPageBreak/>
-        <w:t xml:space="preserve">nueva versión de un documento existente. Acá se deberá de seleccionar el documento al cual se le quiere subir la nueva versión, luego se llenará toda la información requerida e se ingresará el archivo correcto. Nuevamente, el documento se mostrará como pendiente hasta que un jefe o administrador lo apruebe o rechace. </w:t>
+        <w:t xml:space="preserve">nueva versión de un documento existente. Acá se deberá de seleccionar el documento al cual se le quiere subir la nueva versión, luego se llenará toda la información requerida </w:t>
+      </w:r>
+      <w:proofErr w:type="gramStart"/>
+      <w:r>
+        <w:rPr>
+          <w:rFonts w:ascii="Arial" w:hAnsi="Arial" w:cs="Arial"/>
+          <w:lang w:val="es-ES"/>
+        </w:rPr>
+        <w:t>e</w:t>
+      </w:r>
+      <w:proofErr w:type="gramEnd"/>
+      <w:r>
+        <w:rPr>
+          <w:rFonts w:ascii="Arial" w:hAnsi="Arial" w:cs="Arial"/>
+          <w:lang w:val="es-ES"/>
+        </w:rPr>
+        <w:t xml:space="preserve"> se ingresará el archivo correcto. Nuevamente, el documento se mostrará como pendiente hasta que un jefe o administrador lo apruebe o rechace. </w:t>
       </w:r>
     </w:p>
     <w:p>
@@ -3003,7 +3274,23 @@
           <w:rFonts w:ascii="Arial" w:hAnsi="Arial" w:cs="Arial"/>
           <w:lang w:val="es-ES"/>
         </w:rPr>
-        <w:t xml:space="preserve"> minuciosa, por lo que se reducen los errores que puedan haber.</w:t>
+        <w:t xml:space="preserve"> minuciosa, por lo que se reducen los errores que </w:t>
+      </w:r>
+      <w:proofErr w:type="gramStart"/>
+      <w:r>
+        <w:rPr>
+          <w:rFonts w:ascii="Arial" w:hAnsi="Arial" w:cs="Arial"/>
+          <w:lang w:val="es-ES"/>
+        </w:rPr>
+        <w:t>puedan</w:t>
+      </w:r>
+      <w:proofErr w:type="gramEnd"/>
+      <w:r>
+        <w:rPr>
+          <w:rFonts w:ascii="Arial" w:hAnsi="Arial" w:cs="Arial"/>
+          <w:lang w:val="es-ES"/>
+        </w:rPr>
+        <w:t xml:space="preserve"> haber.</w:t>
       </w:r>
     </w:p>
     <w:p>
@@ -3164,7 +3451,23 @@
           <w:rFonts w:ascii="Arial" w:hAnsi="Arial" w:cs="Arial"/>
           <w:lang w:val="es-ES"/>
         </w:rPr>
-        <w:t xml:space="preserve">: Esta área en si se enfoca en asegurarse de que siempre haya una buena validación de datos al ingresar un documento, usuario o comentario, de manera que se eviten errores de campos vacíos o información repetida. Sigue siendo parte de las pruebas funcionales, pero se enfocan en prevenir e evitar problemas que puedan surgir si no se valida la información y los errores que esto puede traer. </w:t>
+        <w:t xml:space="preserve">: Esta área en si se enfoca en asegurarse de que siempre haya una buena validación de datos al ingresar un documento, usuario o comentario, de manera que se eviten errores de campos vacíos o información repetida. Sigue siendo parte de las pruebas funcionales, pero se enfocan en prevenir </w:t>
+      </w:r>
+      <w:proofErr w:type="gramStart"/>
+      <w:r>
+        <w:rPr>
+          <w:rFonts w:ascii="Arial" w:hAnsi="Arial" w:cs="Arial"/>
+          <w:lang w:val="es-ES"/>
+        </w:rPr>
+        <w:t>e</w:t>
+      </w:r>
+      <w:proofErr w:type="gramEnd"/>
+      <w:r>
+        <w:rPr>
+          <w:rFonts w:ascii="Arial" w:hAnsi="Arial" w:cs="Arial"/>
+          <w:lang w:val="es-ES"/>
+        </w:rPr>
+        <w:t xml:space="preserve"> evitar problemas que puedan surgir si no se valida la información y los errores que esto puede traer. </w:t>
       </w:r>
     </w:p>
     <w:p>
@@ -3304,7 +3607,23 @@
           <w:rFonts w:ascii="Arial" w:hAnsi="Arial" w:cs="Arial"/>
           <w:lang w:val="es-ES"/>
         </w:rPr>
-        <w:t xml:space="preserve">No puede haber dos usuarios que ocupen el mismo correo, por lo que se debe de tirar un error e evitar la creación de un usuario si el correo es el mismo a uno que ya existe en la base de datos. </w:t>
+        <w:t xml:space="preserve">No puede haber dos usuarios que ocupen el mismo correo, por lo que se debe de tirar un error </w:t>
+      </w:r>
+      <w:proofErr w:type="gramStart"/>
+      <w:r>
+        <w:rPr>
+          <w:rFonts w:ascii="Arial" w:hAnsi="Arial" w:cs="Arial"/>
+          <w:lang w:val="es-ES"/>
+        </w:rPr>
+        <w:t>e</w:t>
+      </w:r>
+      <w:proofErr w:type="gramEnd"/>
+      <w:r>
+        <w:rPr>
+          <w:rFonts w:ascii="Arial" w:hAnsi="Arial" w:cs="Arial"/>
+          <w:lang w:val="es-ES"/>
+        </w:rPr>
+        <w:t xml:space="preserve"> evitar la creación de un usuario si el correo es el mismo a uno que ya existe en la base de datos. </w:t>
       </w:r>
     </w:p>
     <w:p>
@@ -3324,7 +3643,23 @@
           <w:rFonts w:ascii="Arial" w:hAnsi="Arial" w:cs="Arial"/>
           <w:lang w:val="es-ES"/>
         </w:rPr>
-        <w:t xml:space="preserve">No se puede permitir una contraseña muy fácil, ya que eso afecta la seguridad de la información en la plataforma, por lo que se debe de mostrar un error si la contraseña es muy fácil e evitar la creación del usuario. </w:t>
+        <w:t xml:space="preserve">No se puede permitir una contraseña muy fácil, ya que eso afecta la seguridad de la información en la plataforma, por lo que se debe de mostrar un error si la contraseña es muy fácil </w:t>
+      </w:r>
+      <w:proofErr w:type="gramStart"/>
+      <w:r>
+        <w:rPr>
+          <w:rFonts w:ascii="Arial" w:hAnsi="Arial" w:cs="Arial"/>
+          <w:lang w:val="es-ES"/>
+        </w:rPr>
+        <w:t>e</w:t>
+      </w:r>
+      <w:proofErr w:type="gramEnd"/>
+      <w:r>
+        <w:rPr>
+          <w:rFonts w:ascii="Arial" w:hAnsi="Arial" w:cs="Arial"/>
+          <w:lang w:val="es-ES"/>
+        </w:rPr>
+        <w:t xml:space="preserve"> evitar la creación del usuario. </w:t>
       </w:r>
     </w:p>
     <w:p>
@@ -3345,7 +3680,23 @@
           <w:lang w:val="es-ES"/>
         </w:rPr>
         <w:lastRenderedPageBreak/>
-        <w:t xml:space="preserve">En caso de que no se seleccione un rol, se debe de mostrar un error e evitar la creación del usuario, ya que esta es la parte más importante de un usuario, ya que limita lo que el usuario puede hacer. </w:t>
+        <w:t xml:space="preserve">En caso de que no se seleccione un rol, se debe de mostrar un error </w:t>
+      </w:r>
+      <w:proofErr w:type="gramStart"/>
+      <w:r>
+        <w:rPr>
+          <w:rFonts w:ascii="Arial" w:hAnsi="Arial" w:cs="Arial"/>
+          <w:lang w:val="es-ES"/>
+        </w:rPr>
+        <w:t>e</w:t>
+      </w:r>
+      <w:proofErr w:type="gramEnd"/>
+      <w:r>
+        <w:rPr>
+          <w:rFonts w:ascii="Arial" w:hAnsi="Arial" w:cs="Arial"/>
+          <w:lang w:val="es-ES"/>
+        </w:rPr>
+        <w:t xml:space="preserve"> evitar la creación del usuario, ya que esta es la parte más importante de un usuario, ya que limita lo que el usuario puede hacer. </w:t>
       </w:r>
     </w:p>
     <w:p>
@@ -3778,7 +4129,39 @@
           <w:rFonts w:ascii="Arial" w:hAnsi="Arial" w:cs="Arial"/>
           <w:lang w:val="es-ES"/>
         </w:rPr>
-        <w:t xml:space="preserve"> correcta entre el front-end, el back-end y la base de datos. El punto de estas es asegurar de que haya una persistencia de datos en toda la plataforma, especialmente al enviar formularios que tengan que ver con la creación de un nuevo usuario o de subir un nuevo documento (o una nueva versión). Aparte de esto, queremos asegurarnos de que se puedan no solo enviar e ingresar los datos de la base de datos, pero que estos se puedan recuperar y mostrar correctamente en la interfaz gráfica, a la cual tendrá acceso los usuarios. </w:t>
+        <w:t xml:space="preserve"> correcta entre el </w:t>
+      </w:r>
+      <w:proofErr w:type="spellStart"/>
+      <w:r>
+        <w:rPr>
+          <w:rFonts w:ascii="Arial" w:hAnsi="Arial" w:cs="Arial"/>
+          <w:lang w:val="es-ES"/>
+        </w:rPr>
+        <w:t>front-end</w:t>
+      </w:r>
+      <w:proofErr w:type="spellEnd"/>
+      <w:r>
+        <w:rPr>
+          <w:rFonts w:ascii="Arial" w:hAnsi="Arial" w:cs="Arial"/>
+          <w:lang w:val="es-ES"/>
+        </w:rPr>
+        <w:t>, el back-</w:t>
+      </w:r>
+      <w:proofErr w:type="spellStart"/>
+      <w:r>
+        <w:rPr>
+          <w:rFonts w:ascii="Arial" w:hAnsi="Arial" w:cs="Arial"/>
+          <w:lang w:val="es-ES"/>
+        </w:rPr>
+        <w:t>end</w:t>
+      </w:r>
+      <w:proofErr w:type="spellEnd"/>
+      <w:r>
+        <w:rPr>
+          <w:rFonts w:ascii="Arial" w:hAnsi="Arial" w:cs="Arial"/>
+          <w:lang w:val="es-ES"/>
+        </w:rPr>
+        <w:t xml:space="preserve"> y la base de datos. El punto de estas es asegurar de que haya una persistencia de datos en toda la plataforma, especialmente al enviar formularios que tengan que ver con la creación de un nuevo usuario o de subir un nuevo documento (o una nueva versión). Aparte de esto, queremos asegurarnos de que se puedan no solo enviar e ingresar los datos de la base de datos, pero que estos se puedan recuperar y mostrar correctamente en la interfaz gráfica, a la cual tendrá acceso los usuarios. </w:t>
       </w:r>
     </w:p>
     <w:p>
@@ -3819,7 +4202,23 @@
           <w:rFonts w:ascii="Arial" w:hAnsi="Arial" w:cs="Arial"/>
           <w:lang w:val="es-ES"/>
         </w:rPr>
-        <w:t xml:space="preserve">También buscamos que el documento aparezca en la lista de documentos ya subidos y que los usuarios puedan tener acceso a este (cuando ya haya sido aprobado) y que se muestre con toda la información necesaria. En esta prueba, buscamos a persistencia de datos a través de todo el sitio web, que se pueda ingresar correctamente todo desde el formulario en la interfaz gráfica, que se pueda grabar la información por medio del back-end en la base de datos y que se pueda recuperar esta información para que los usuarios puedan tener acceso a esta. </w:t>
+        <w:t>También buscamos que el documento aparezca en la lista de documentos ya subidos y que los usuarios puedan tener acceso a este (cuando ya haya sido aprobado) y que se muestre con toda la información necesaria. En esta prueba, buscamos a persistencia de datos a través de todo el sitio web, que se pueda ingresar correctamente todo desde el formulario en la interfaz gráfica, que se pueda grabar la información por medio del back-</w:t>
+      </w:r>
+      <w:proofErr w:type="spellStart"/>
+      <w:r>
+        <w:rPr>
+          <w:rFonts w:ascii="Arial" w:hAnsi="Arial" w:cs="Arial"/>
+          <w:lang w:val="es-ES"/>
+        </w:rPr>
+        <w:t>end</w:t>
+      </w:r>
+      <w:proofErr w:type="spellEnd"/>
+      <w:r>
+        <w:rPr>
+          <w:rFonts w:ascii="Arial" w:hAnsi="Arial" w:cs="Arial"/>
+          <w:lang w:val="es-ES"/>
+        </w:rPr>
+        <w:t xml:space="preserve"> en la base de datos y que se pueda recuperar esta información para que los usuarios puedan tener acceso a esta. </w:t>
       </w:r>
     </w:p>
     <w:p>
@@ -3866,7 +4265,39 @@
           <w:rFonts w:ascii="Arial" w:hAnsi="Arial" w:cs="Arial"/>
           <w:lang w:val="es-ES"/>
         </w:rPr>
-        <w:t xml:space="preserve">La creación de un nuevo usuario: De la misma manera que funciona subiendo un documento, funciona también la creación de un nuevo usuario, el cual lleva a que se envié un formulario desde la interfaz gráfica por medio del back-end hacia la base de datos y que se guarde ahí toda la información necesaria. Es igual de importante que luego se pueda recuperar los datos de la base de datos para que se pueda ingresar sesión como ese nuevo usuario. Es por medio de esta prueba, en la que buscamos, nuevamente, la persistencia de los datos en la base de datos, el envió de datos por parte del formulario y la recuperación de estos mismos. </w:t>
+        <w:t>La creación de un nuevo usuario: De la misma manera que funciona subiendo un documento, funciona también la creación de un nuevo usuario, el cual lleva a que se envié un formulario desde la interfaz gráfica por medio del back-</w:t>
+      </w:r>
+      <w:proofErr w:type="spellStart"/>
+      <w:r>
+        <w:rPr>
+          <w:rFonts w:ascii="Arial" w:hAnsi="Arial" w:cs="Arial"/>
+          <w:lang w:val="es-ES"/>
+        </w:rPr>
+        <w:t>end</w:t>
+      </w:r>
+      <w:proofErr w:type="spellEnd"/>
+      <w:r>
+        <w:rPr>
+          <w:rFonts w:ascii="Arial" w:hAnsi="Arial" w:cs="Arial"/>
+          <w:lang w:val="es-ES"/>
+        </w:rPr>
+        <w:t xml:space="preserve"> hacia la base de datos y que se guarde ahí toda la información necesaria. Es igual de importante que luego se pueda recuperar los datos de la base de datos para que se pueda ingresar sesión como ese nuevo usuario. Es por medio de esta prueba, en la que buscamos, nuevamente, la persistencia de los datos en la base de datos, </w:t>
+      </w:r>
+      <w:proofErr w:type="spellStart"/>
+      <w:r>
+        <w:rPr>
+          <w:rFonts w:ascii="Arial" w:hAnsi="Arial" w:cs="Arial"/>
+          <w:lang w:val="es-ES"/>
+        </w:rPr>
+        <w:t>el</w:t>
+      </w:r>
+      <w:proofErr w:type="spellEnd"/>
+      <w:r>
+        <w:rPr>
+          <w:rFonts w:ascii="Arial" w:hAnsi="Arial" w:cs="Arial"/>
+          <w:lang w:val="es-ES"/>
+        </w:rPr>
+        <w:t xml:space="preserve"> envió de datos por parte del formulario y la recuperación de estos mismos. </w:t>
       </w:r>
     </w:p>
     <w:p>
@@ -4101,6 +4532,7 @@
         </w:rPr>
       </w:pPr>
       <w:bookmarkStart w:id="4" w:name="_Toc229775093"/>
+      <w:bookmarkStart w:id="5" w:name="_Toc230111119"/>
       <w:r>
         <w:rPr>
           <w:rFonts w:ascii="Arial" w:hAnsi="Arial" w:cs="Arial"/>
@@ -4114,6 +4546,7 @@
         <w:t>Ambiente de Pruebas</w:t>
       </w:r>
       <w:bookmarkEnd w:id="4"/>
+      <w:bookmarkEnd w:id="5"/>
     </w:p>
     <w:p>
       <w:pPr>
@@ -4296,23 +4729,41 @@
           <w:rFonts w:ascii="Arial" w:hAnsi="Arial" w:cs="Arial"/>
           <w:lang w:val="es-SV"/>
         </w:rPr>
-        <w:t>Plataforma de Administración y Diseño: MySQL Workbench</w:t>
-      </w:r>
-    </w:p>
-    <w:p>
-      <w:pPr>
-        <w:rPr>
-          <w:rFonts w:ascii="Arial" w:hAnsi="Arial" w:cs="Arial"/>
-          <w:lang w:val="es-SV"/>
-        </w:rPr>
-      </w:pPr>
-      <w:r>
-        <w:rPr>
-          <w:rFonts w:ascii="Arial" w:hAnsi="Arial" w:cs="Arial"/>
-          <w:lang w:val="es-SV"/>
-        </w:rPr>
-        <w:t>Lugar donde se maneja el servidor: LocalHost</w:t>
-      </w:r>
+        <w:t xml:space="preserve">Plataforma de Administración y Diseño: MySQL </w:t>
+      </w:r>
+      <w:proofErr w:type="spellStart"/>
+      <w:r>
+        <w:rPr>
+          <w:rFonts w:ascii="Arial" w:hAnsi="Arial" w:cs="Arial"/>
+          <w:lang w:val="es-SV"/>
+        </w:rPr>
+        <w:t>Workbench</w:t>
+      </w:r>
+      <w:proofErr w:type="spellEnd"/>
+    </w:p>
+    <w:p>
+      <w:pPr>
+        <w:rPr>
+          <w:rFonts w:ascii="Arial" w:hAnsi="Arial" w:cs="Arial"/>
+          <w:lang w:val="es-SV"/>
+        </w:rPr>
+      </w:pPr>
+      <w:r>
+        <w:rPr>
+          <w:rFonts w:ascii="Arial" w:hAnsi="Arial" w:cs="Arial"/>
+          <w:lang w:val="es-SV"/>
+        </w:rPr>
+        <w:t xml:space="preserve">Lugar donde se maneja el servidor: </w:t>
+      </w:r>
+      <w:proofErr w:type="spellStart"/>
+      <w:r>
+        <w:rPr>
+          <w:rFonts w:ascii="Arial" w:hAnsi="Arial" w:cs="Arial"/>
+          <w:lang w:val="es-SV"/>
+        </w:rPr>
+        <w:t>LocalHost</w:t>
+      </w:r>
+      <w:proofErr w:type="spellEnd"/>
     </w:p>
     <w:p>
       <w:pPr>
@@ -4333,7 +4784,8 @@
           <w:lang w:val="es-SV"/>
         </w:rPr>
       </w:pPr>
-      <w:bookmarkStart w:id="5" w:name="_Toc229775094"/>
+      <w:bookmarkStart w:id="6" w:name="_Toc229775094"/>
+      <w:bookmarkStart w:id="7" w:name="_Toc230111120"/>
       <w:r>
         <w:rPr>
           <w:rFonts w:ascii="Arial" w:hAnsi="Arial" w:cs="Arial"/>
@@ -4344,7 +4796,8 @@
         </w:rPr>
         <w:t>Criterios de Aceptación</w:t>
       </w:r>
-      <w:bookmarkEnd w:id="5"/>
+      <w:bookmarkEnd w:id="6"/>
+      <w:bookmarkEnd w:id="7"/>
     </w:p>
     <w:p>
       <w:pPr>
@@ -6220,15 +6673,7 @@
       <w:pPr>
         <w:rPr>
           <w:rFonts w:ascii="Arial" w:hAnsi="Arial" w:cs="Arial"/>
-          <w:lang w:val="es-SV"/>
-        </w:rPr>
-      </w:pPr>
-    </w:p>
-    <w:p>
-      <w:pPr>
-        <w:rPr>
-          <w:rFonts w:ascii="Arial" w:hAnsi="Arial" w:cs="Arial"/>
-          <w:lang w:val="es-SV"/>
+          <w:lang w:val="es-ES"/>
         </w:rPr>
       </w:pPr>
     </w:p>
@@ -6246,7 +6691,7 @@
           <w:lang w:val="es-SV"/>
         </w:rPr>
       </w:pPr>
-      <w:bookmarkStart w:id="6" w:name="_Toc230105206"/>
+      <w:bookmarkStart w:id="8" w:name="_Toc229775098"/>
       <w:r>
         <w:rPr>
           <w:rFonts w:ascii="Arial" w:hAnsi="Arial" w:cs="Arial"/>
@@ -6257,19 +6702,2182 @@
           <w:szCs w:val="24"/>
           <w:lang w:val="es-SV"/>
         </w:rPr>
-        <w:t>Repositorio de Github</w:t>
-      </w:r>
-      <w:bookmarkEnd w:id="6"/>
+        <w:t>Registro de Defectos</w:t>
+      </w:r>
+      <w:bookmarkEnd w:id="8"/>
+    </w:p>
+    <w:p>
+      <w:pPr>
+        <w:rPr>
+          <w:rFonts w:ascii="Arial" w:hAnsi="Arial" w:cs="Arial"/>
+          <w:lang w:val="es-SV"/>
+        </w:rPr>
+      </w:pPr>
+      <w:r>
+        <w:rPr>
+          <w:rFonts w:ascii="Arial" w:hAnsi="Arial" w:cs="Arial"/>
+          <w:lang w:val="es-SV"/>
+        </w:rPr>
+        <w:t xml:space="preserve">Nuestros registros de defectos documentan los que hemos encontrado en nuestra plataforma, específicamente, los pasos necesarios para que ocurran y como estos afectan a los usuarios. Es por medio de estos registros por lo que podemos identificarlos y encontrar posibles soluciones, al igual que catalogar la importancia de cada uno dependiendo de su efecto. </w:t>
+      </w:r>
+    </w:p>
+    <w:p>
+      <w:pPr>
+        <w:rPr>
+          <w:rFonts w:ascii="Arial" w:hAnsi="Arial" w:cs="Arial"/>
+          <w:lang w:val="es-SV"/>
+        </w:rPr>
+      </w:pPr>
+    </w:p>
+    <w:p>
+      <w:pPr>
+        <w:pStyle w:val="Ttulo2"/>
+        <w:rPr>
+          <w:rFonts w:ascii="Arial" w:hAnsi="Arial" w:cs="Arial"/>
+          <w:color w:val="auto"/>
+          <w:sz w:val="24"/>
+          <w:szCs w:val="24"/>
+          <w:lang w:val="es-SV"/>
+        </w:rPr>
+      </w:pPr>
+      <w:bookmarkStart w:id="9" w:name="_Toc229775099"/>
+      <w:r>
+        <w:rPr>
+          <w:rFonts w:ascii="Arial" w:hAnsi="Arial" w:cs="Arial"/>
+          <w:color w:val="auto"/>
+          <w:sz w:val="24"/>
+          <w:szCs w:val="24"/>
+          <w:lang w:val="es-SV"/>
+        </w:rPr>
+        <w:t>Registro de Defecto 1</w:t>
+      </w:r>
+      <w:bookmarkEnd w:id="9"/>
+    </w:p>
+    <w:p>
+      <w:pPr>
+        <w:rPr>
+          <w:rFonts w:ascii="Arial" w:hAnsi="Arial" w:cs="Arial"/>
+          <w:lang w:val="es-SV"/>
+        </w:rPr>
+      </w:pPr>
+      <w:r>
+        <w:rPr>
+          <w:rFonts w:ascii="Arial" w:hAnsi="Arial" w:cs="Arial"/>
+          <w:lang w:val="es-SV"/>
+        </w:rPr>
+        <w:t>Nombre: Creación de un nuevo usuario con correo repetido.</w:t>
+      </w:r>
+    </w:p>
+    <w:p>
+      <w:pPr>
+        <w:rPr>
+          <w:rFonts w:ascii="Arial" w:hAnsi="Arial" w:cs="Arial"/>
+          <w:lang w:val="es-SV"/>
+        </w:rPr>
+      </w:pPr>
+      <w:r>
+        <w:rPr>
+          <w:rFonts w:ascii="Arial" w:hAnsi="Arial" w:cs="Arial"/>
+          <w:lang w:val="es-SV"/>
+        </w:rPr>
+        <w:t xml:space="preserve">Descripción: Para los usuarios, el correo tiene una gran importancia, ya que sirve para poder ingresar a la plataforma. Es debido a esto, por lo que se tiene que asegurar que este no pueda ser repetido, lo que crearía 2 usuarios que compartan el mismo correo. Al crear un usuario, no se había puesto una a categoría de </w:t>
+      </w:r>
+      <w:proofErr w:type="spellStart"/>
+      <w:r>
+        <w:rPr>
+          <w:rFonts w:ascii="Arial" w:hAnsi="Arial" w:cs="Arial"/>
+          <w:lang w:val="es-SV"/>
+        </w:rPr>
+        <w:t>unique</w:t>
+      </w:r>
+      <w:proofErr w:type="spellEnd"/>
+      <w:r>
+        <w:rPr>
+          <w:rFonts w:ascii="Arial" w:hAnsi="Arial" w:cs="Arial"/>
+          <w:lang w:val="es-SV"/>
+        </w:rPr>
+        <w:t xml:space="preserve">, por lo que varios usuarios podían compartir un mismo correo, lo cual afecta la experiencia del usuario y la seguridad de la misma plataforma. </w:t>
+      </w:r>
+    </w:p>
+    <w:p>
+      <w:pPr>
+        <w:rPr>
+          <w:rFonts w:ascii="Arial" w:hAnsi="Arial" w:cs="Arial"/>
+          <w:lang w:val="es-SV"/>
+        </w:rPr>
+      </w:pPr>
+      <w:r>
+        <w:rPr>
+          <w:rFonts w:ascii="Arial" w:hAnsi="Arial" w:cs="Arial"/>
+          <w:lang w:val="es-SV"/>
+        </w:rPr>
+        <w:t xml:space="preserve">Pasos para reproducir defecto: </w:t>
+      </w:r>
+    </w:p>
+    <w:p>
+      <w:pPr>
+        <w:pStyle w:val="Prrafodelista"/>
+        <w:numPr>
+          <w:ilvl w:val="0"/>
+          <w:numId w:val="40"/>
+        </w:numPr>
+        <w:rPr>
+          <w:rFonts w:ascii="Arial" w:hAnsi="Arial" w:cs="Arial"/>
+          <w:lang w:val="es-SV"/>
+        </w:rPr>
+      </w:pPr>
+      <w:r>
+        <w:rPr>
+          <w:rFonts w:ascii="Arial" w:hAnsi="Arial" w:cs="Arial"/>
+          <w:lang w:val="es-SV"/>
+        </w:rPr>
+        <w:t xml:space="preserve">Ingresar a la plataforma por medio de un usuario que tenga el rol de administrador (ya que es el único que puede crear nuevos usuarios). </w:t>
+      </w:r>
+    </w:p>
+    <w:p>
+      <w:pPr>
+        <w:pStyle w:val="Prrafodelista"/>
+        <w:numPr>
+          <w:ilvl w:val="0"/>
+          <w:numId w:val="40"/>
+        </w:numPr>
+        <w:rPr>
+          <w:rFonts w:ascii="Arial" w:hAnsi="Arial" w:cs="Arial"/>
+          <w:lang w:val="es-SV"/>
+        </w:rPr>
+      </w:pPr>
+      <w:r>
+        <w:rPr>
+          <w:rFonts w:ascii="Arial" w:hAnsi="Arial" w:cs="Arial"/>
+          <w:lang w:val="es-SV"/>
+        </w:rPr>
+        <w:t xml:space="preserve">Apretar el botón de crear un nuevo usuario. </w:t>
+      </w:r>
+    </w:p>
+    <w:p>
+      <w:pPr>
+        <w:pStyle w:val="Prrafodelista"/>
+        <w:numPr>
+          <w:ilvl w:val="0"/>
+          <w:numId w:val="40"/>
+        </w:numPr>
+        <w:rPr>
+          <w:rFonts w:ascii="Arial" w:hAnsi="Arial" w:cs="Arial"/>
+          <w:lang w:val="es-SV"/>
+        </w:rPr>
+      </w:pPr>
+      <w:r>
+        <w:rPr>
+          <w:rFonts w:ascii="Arial" w:hAnsi="Arial" w:cs="Arial"/>
+          <w:lang w:val="es-SV"/>
+        </w:rPr>
+        <w:t xml:space="preserve">Llenar la información pertinente del usuario, pero repetir un mismo correo ya existente de otro usuario que este en la base de datos. </w:t>
+      </w:r>
+    </w:p>
+    <w:p>
+      <w:pPr>
+        <w:pStyle w:val="Prrafodelista"/>
+        <w:numPr>
+          <w:ilvl w:val="0"/>
+          <w:numId w:val="40"/>
+        </w:numPr>
+        <w:rPr>
+          <w:rFonts w:ascii="Arial" w:hAnsi="Arial" w:cs="Arial"/>
+          <w:lang w:val="es-SV"/>
+        </w:rPr>
+      </w:pPr>
+      <w:r>
+        <w:rPr>
+          <w:rFonts w:ascii="Arial" w:hAnsi="Arial" w:cs="Arial"/>
+          <w:lang w:val="es-SV"/>
+        </w:rPr>
+        <w:t xml:space="preserve">Apretar el botón de crear usuario. </w:t>
+      </w:r>
+    </w:p>
+    <w:p>
+      <w:pPr>
+        <w:rPr>
+          <w:rFonts w:ascii="Arial" w:hAnsi="Arial" w:cs="Arial"/>
+          <w:lang w:val="es-SV"/>
+        </w:rPr>
+      </w:pPr>
+      <w:r>
+        <w:rPr>
+          <w:rFonts w:ascii="Arial" w:hAnsi="Arial" w:cs="Arial"/>
+          <w:lang w:val="es-SV"/>
+        </w:rPr>
+        <w:t xml:space="preserve">Resultado esperado: Se debería de cancelar el proceso de creación de un usuario, al abortar el proceso y evitar que se envié el formulario, al igual que mostrar un error al administrador sobre el correo repetido. </w:t>
+      </w:r>
+    </w:p>
+    <w:p>
+      <w:pPr>
+        <w:rPr>
+          <w:rFonts w:ascii="Arial" w:hAnsi="Arial" w:cs="Arial"/>
+          <w:lang w:val="es-SV"/>
+        </w:rPr>
+      </w:pPr>
+      <w:r>
+        <w:rPr>
+          <w:rFonts w:ascii="Arial" w:hAnsi="Arial" w:cs="Arial"/>
+          <w:lang w:val="es-SV"/>
+        </w:rPr>
+        <w:t xml:space="preserve">Resultado real: Aunque tira un mensaje de error, el formularia todavía se envía y se procede con la creación del usuario. </w:t>
+      </w:r>
+    </w:p>
+    <w:p>
+      <w:pPr>
+        <w:rPr>
+          <w:rFonts w:ascii="Arial" w:hAnsi="Arial" w:cs="Arial"/>
+          <w:lang w:val="es-SV"/>
+        </w:rPr>
+      </w:pPr>
+      <w:r>
+        <w:rPr>
+          <w:rFonts w:ascii="Arial" w:hAnsi="Arial" w:cs="Arial"/>
+          <w:lang w:val="es-SV"/>
+        </w:rPr>
+        <w:t>Prioridad: Alta</w:t>
+      </w:r>
+    </w:p>
+    <w:p>
+      <w:pPr>
+        <w:rPr>
+          <w:rFonts w:ascii="Arial" w:hAnsi="Arial" w:cs="Arial"/>
+          <w:lang w:val="es-SV"/>
+        </w:rPr>
+      </w:pPr>
+      <w:r>
+        <w:rPr>
+          <w:rFonts w:ascii="Arial" w:hAnsi="Arial" w:cs="Arial"/>
+          <w:lang w:val="es-SV"/>
+        </w:rPr>
+        <w:t>Gravedad: Critica</w:t>
+      </w:r>
+    </w:p>
+    <w:p>
+      <w:pPr>
+        <w:rPr>
+          <w:rFonts w:ascii="Arial" w:hAnsi="Arial" w:cs="Arial"/>
+          <w:lang w:val="es-SV"/>
+        </w:rPr>
+      </w:pPr>
+      <w:r>
+        <w:rPr>
+          <w:rFonts w:ascii="Arial" w:hAnsi="Arial" w:cs="Arial"/>
+          <w:lang w:val="es-SV"/>
+        </w:rPr>
+        <w:t>Estado: Resuelto</w:t>
+      </w:r>
+    </w:p>
+    <w:p>
+      <w:pPr>
+        <w:rPr>
+          <w:rFonts w:ascii="Arial" w:hAnsi="Arial" w:cs="Arial"/>
+          <w:lang w:val="es-SV"/>
+        </w:rPr>
+      </w:pPr>
+      <w:r>
+        <w:rPr>
+          <w:rFonts w:ascii="Arial" w:hAnsi="Arial" w:cs="Arial"/>
+          <w:lang w:val="es-SV"/>
+        </w:rPr>
+        <w:t xml:space="preserve">Evidencia: </w:t>
+      </w:r>
     </w:p>
     <w:p>
       <w:pPr>
         <w:jc w:val="center"/>
         <w:rPr>
           <w:rFonts w:ascii="Arial" w:hAnsi="Arial" w:cs="Arial"/>
-          <w:lang w:val="es-ES"/>
-        </w:rPr>
-      </w:pPr>
-      <w:hyperlink r:id="rId11" w:history="1">
+          <w:lang w:val="es-SV"/>
+        </w:rPr>
+      </w:pPr>
+      <w:r>
+        <w:rPr>
+          <w:rFonts w:ascii="Arial" w:hAnsi="Arial" w:cs="Arial"/>
+          <w:lang w:val="es-SV"/>
+        </w:rPr>
+        <w:lastRenderedPageBreak/>
+        <w:t>Creación de un nuevo usuario</w:t>
+      </w:r>
+    </w:p>
+    <w:p>
+      <w:pPr>
+        <w:jc w:val="center"/>
+        <w:rPr>
+          <w:rFonts w:ascii="Arial" w:hAnsi="Arial" w:cs="Arial"/>
+          <w:lang w:val="es-SV"/>
+        </w:rPr>
+      </w:pPr>
+      <w:r>
+        <w:rPr>
+          <w:rFonts w:ascii="Arial" w:hAnsi="Arial" w:cs="Arial"/>
+          <w:noProof/>
+          <w:lang w:eastAsia="es-SV"/>
+        </w:rPr>
+        <w:drawing>
+          <wp:inline distT="0" distB="0" distL="0" distR="0" wp14:anchorId="2D1974AE" wp14:editId="449E05A9">
+            <wp:extent cx="2834640" cy="2632536"/>
+            <wp:effectExtent l="0" t="0" r="3810" b="0"/>
+            <wp:docPr id="1008436520" name="Imagen 1"/>
+            <wp:cNvGraphicFramePr>
+              <a:graphicFrameLocks xmlns:a="http://schemas.openxmlformats.org/drawingml/2006/main" noChangeAspect="1"/>
+            </wp:cNvGraphicFramePr>
+            <a:graphic xmlns:a="http://schemas.openxmlformats.org/drawingml/2006/main">
+              <a:graphicData uri="http://schemas.openxmlformats.org/drawingml/2006/picture">
+                <pic:pic xmlns:pic="http://schemas.openxmlformats.org/drawingml/2006/picture">
+                  <pic:nvPicPr>
+                    <pic:cNvPr id="1008436520" name=""/>
+                    <pic:cNvPicPr/>
+                  </pic:nvPicPr>
+                  <pic:blipFill>
+                    <a:blip r:embed="rId11"/>
+                    <a:stretch>
+                      <a:fillRect/>
+                    </a:stretch>
+                  </pic:blipFill>
+                  <pic:spPr>
+                    <a:xfrm>
+                      <a:off x="0" y="0"/>
+                      <a:ext cx="2839877" cy="2637400"/>
+                    </a:xfrm>
+                    <a:prstGeom prst="rect">
+                      <a:avLst/>
+                    </a:prstGeom>
+                  </pic:spPr>
+                </pic:pic>
+              </a:graphicData>
+            </a:graphic>
+          </wp:inline>
+        </w:drawing>
+      </w:r>
+    </w:p>
+    <w:p>
+      <w:pPr>
+        <w:rPr>
+          <w:rFonts w:ascii="Arial" w:hAnsi="Arial" w:cs="Arial"/>
+          <w:lang w:val="es-SV"/>
+        </w:rPr>
+      </w:pPr>
+    </w:p>
+    <w:p>
+      <w:pPr>
+        <w:jc w:val="center"/>
+        <w:rPr>
+          <w:rFonts w:ascii="Arial" w:hAnsi="Arial" w:cs="Arial"/>
+          <w:lang w:val="es-SV"/>
+        </w:rPr>
+      </w:pPr>
+    </w:p>
+    <w:p>
+      <w:pPr>
+        <w:jc w:val="center"/>
+        <w:rPr>
+          <w:rFonts w:ascii="Arial" w:hAnsi="Arial" w:cs="Arial"/>
+          <w:lang w:val="es-SV"/>
+        </w:rPr>
+      </w:pPr>
+      <w:r>
+        <w:rPr>
+          <w:rFonts w:ascii="Arial" w:hAnsi="Arial" w:cs="Arial"/>
+          <w:lang w:val="es-SV"/>
+        </w:rPr>
+        <w:t>Error al intentar crear un nuevo usuario con el mismo correo</w:t>
+      </w:r>
+    </w:p>
+    <w:p>
+      <w:pPr>
+        <w:jc w:val="center"/>
+        <w:rPr>
+          <w:rFonts w:ascii="Arial" w:hAnsi="Arial" w:cs="Arial"/>
+          <w:lang w:val="es-SV"/>
+        </w:rPr>
+      </w:pPr>
+      <w:r>
+        <w:rPr>
+          <w:rFonts w:ascii="Arial" w:hAnsi="Arial" w:cs="Arial"/>
+          <w:noProof/>
+          <w:lang w:eastAsia="es-SV"/>
+        </w:rPr>
+        <w:drawing>
+          <wp:inline distT="0" distB="0" distL="0" distR="0" wp14:anchorId="7D4C050C" wp14:editId="686AA9B3">
+            <wp:extent cx="3246120" cy="2965314"/>
+            <wp:effectExtent l="0" t="0" r="0" b="6985"/>
+            <wp:docPr id="1455973521" name="Imagen 1"/>
+            <wp:cNvGraphicFramePr>
+              <a:graphicFrameLocks xmlns:a="http://schemas.openxmlformats.org/drawingml/2006/main" noChangeAspect="1"/>
+            </wp:cNvGraphicFramePr>
+            <a:graphic xmlns:a="http://schemas.openxmlformats.org/drawingml/2006/main">
+              <a:graphicData uri="http://schemas.openxmlformats.org/drawingml/2006/picture">
+                <pic:pic xmlns:pic="http://schemas.openxmlformats.org/drawingml/2006/picture">
+                  <pic:nvPicPr>
+                    <pic:cNvPr id="1455973521" name=""/>
+                    <pic:cNvPicPr/>
+                  </pic:nvPicPr>
+                  <pic:blipFill>
+                    <a:blip r:embed="rId12"/>
+                    <a:stretch>
+                      <a:fillRect/>
+                    </a:stretch>
+                  </pic:blipFill>
+                  <pic:spPr>
+                    <a:xfrm>
+                      <a:off x="0" y="0"/>
+                      <a:ext cx="3250881" cy="2969663"/>
+                    </a:xfrm>
+                    <a:prstGeom prst="rect">
+                      <a:avLst/>
+                    </a:prstGeom>
+                  </pic:spPr>
+                </pic:pic>
+              </a:graphicData>
+            </a:graphic>
+          </wp:inline>
+        </w:drawing>
+      </w:r>
+    </w:p>
+    <w:p>
+      <w:pPr>
+        <w:rPr>
+          <w:rFonts w:ascii="Arial" w:hAnsi="Arial" w:cs="Arial"/>
+          <w:lang w:val="es-SV"/>
+        </w:rPr>
+      </w:pPr>
+    </w:p>
+    <w:p>
+      <w:pPr>
+        <w:rPr>
+          <w:rFonts w:ascii="Arial" w:hAnsi="Arial" w:cs="Arial"/>
+          <w:lang w:val="es-SV"/>
+        </w:rPr>
+      </w:pPr>
+    </w:p>
+    <w:p>
+      <w:pPr>
+        <w:pStyle w:val="Ttulo2"/>
+        <w:rPr>
+          <w:rFonts w:ascii="Arial" w:hAnsi="Arial" w:cs="Arial"/>
+          <w:color w:val="auto"/>
+          <w:sz w:val="24"/>
+          <w:szCs w:val="24"/>
+          <w:lang w:val="es-SV"/>
+        </w:rPr>
+      </w:pPr>
+      <w:bookmarkStart w:id="10" w:name="_Toc229775100"/>
+      <w:r>
+        <w:rPr>
+          <w:rFonts w:ascii="Arial" w:hAnsi="Arial" w:cs="Arial"/>
+          <w:color w:val="auto"/>
+          <w:sz w:val="24"/>
+          <w:szCs w:val="24"/>
+          <w:lang w:val="es-SV"/>
+        </w:rPr>
+        <w:t>Registro de Defecto 2</w:t>
+      </w:r>
+      <w:bookmarkEnd w:id="10"/>
+    </w:p>
+    <w:p>
+      <w:pPr>
+        <w:rPr>
+          <w:rFonts w:ascii="Arial" w:hAnsi="Arial" w:cs="Arial"/>
+          <w:lang w:val="es-SV"/>
+        </w:rPr>
+      </w:pPr>
+      <w:r>
+        <w:rPr>
+          <w:rFonts w:ascii="Arial" w:hAnsi="Arial" w:cs="Arial"/>
+          <w:lang w:val="es-SV"/>
+        </w:rPr>
+        <w:t>Nombre: Subir un nuevo documento con un nombre repetido.</w:t>
+      </w:r>
+    </w:p>
+    <w:p>
+      <w:pPr>
+        <w:rPr>
+          <w:rFonts w:ascii="Arial" w:hAnsi="Arial" w:cs="Arial"/>
+          <w:lang w:val="es-SV"/>
+        </w:rPr>
+      </w:pPr>
+      <w:r>
+        <w:rPr>
+          <w:rFonts w:ascii="Arial" w:hAnsi="Arial" w:cs="Arial"/>
+          <w:lang w:val="es-SV"/>
+        </w:rPr>
+        <w:lastRenderedPageBreak/>
+        <w:t xml:space="preserve">Descripción: Si se desea crear un nuevo documento, pero ya existe uno que tiene el mismo nombre, el documento se vuelve a crear y a subir como un nuevo documento, lo que causa que se repetía el documento. </w:t>
+      </w:r>
+    </w:p>
+    <w:p>
+      <w:pPr>
+        <w:rPr>
+          <w:rFonts w:ascii="Arial" w:hAnsi="Arial" w:cs="Arial"/>
+          <w:lang w:val="es-SV"/>
+        </w:rPr>
+      </w:pPr>
+      <w:r>
+        <w:rPr>
+          <w:rFonts w:ascii="Arial" w:hAnsi="Arial" w:cs="Arial"/>
+          <w:lang w:val="es-SV"/>
+        </w:rPr>
+        <w:t xml:space="preserve">Pasos para reproducir defecto: </w:t>
+      </w:r>
+    </w:p>
+    <w:p>
+      <w:pPr>
+        <w:pStyle w:val="Prrafodelista"/>
+        <w:numPr>
+          <w:ilvl w:val="0"/>
+          <w:numId w:val="42"/>
+        </w:numPr>
+        <w:rPr>
+          <w:rFonts w:ascii="Arial" w:hAnsi="Arial" w:cs="Arial"/>
+          <w:lang w:val="es-SV"/>
+        </w:rPr>
+      </w:pPr>
+      <w:r>
+        <w:rPr>
+          <w:rFonts w:ascii="Arial" w:hAnsi="Arial" w:cs="Arial"/>
+          <w:lang w:val="es-SV"/>
+        </w:rPr>
+        <w:t>Ingresar a la plataforma por medio de un usuario.</w:t>
+      </w:r>
+    </w:p>
+    <w:p>
+      <w:pPr>
+        <w:pStyle w:val="Prrafodelista"/>
+        <w:numPr>
+          <w:ilvl w:val="0"/>
+          <w:numId w:val="42"/>
+        </w:numPr>
+        <w:rPr>
+          <w:rFonts w:ascii="Arial" w:hAnsi="Arial" w:cs="Arial"/>
+          <w:lang w:val="es-SV"/>
+        </w:rPr>
+      </w:pPr>
+      <w:r>
+        <w:rPr>
+          <w:rFonts w:ascii="Arial" w:hAnsi="Arial" w:cs="Arial"/>
+          <w:lang w:val="es-SV"/>
+        </w:rPr>
+        <w:t xml:space="preserve">Apretar el botón de subir documento. </w:t>
+      </w:r>
+    </w:p>
+    <w:p>
+      <w:pPr>
+        <w:pStyle w:val="Prrafodelista"/>
+        <w:numPr>
+          <w:ilvl w:val="0"/>
+          <w:numId w:val="42"/>
+        </w:numPr>
+        <w:rPr>
+          <w:rFonts w:ascii="Arial" w:hAnsi="Arial" w:cs="Arial"/>
+          <w:lang w:val="es-SV"/>
+        </w:rPr>
+      </w:pPr>
+      <w:r>
+        <w:rPr>
+          <w:rFonts w:ascii="Arial" w:hAnsi="Arial" w:cs="Arial"/>
+          <w:lang w:val="es-SV"/>
+        </w:rPr>
+        <w:t xml:space="preserve">Llenar la información y elegir el archivo indicado. Uno tiene que ponerle el mismo nombre al documento de uno que ya existe en la plataforma. </w:t>
+      </w:r>
+    </w:p>
+    <w:p>
+      <w:pPr>
+        <w:pStyle w:val="Prrafodelista"/>
+        <w:numPr>
+          <w:ilvl w:val="0"/>
+          <w:numId w:val="42"/>
+        </w:numPr>
+        <w:rPr>
+          <w:rFonts w:ascii="Arial" w:hAnsi="Arial" w:cs="Arial"/>
+          <w:lang w:val="es-SV"/>
+        </w:rPr>
+      </w:pPr>
+      <w:r>
+        <w:rPr>
+          <w:rFonts w:ascii="Arial" w:hAnsi="Arial" w:cs="Arial"/>
+          <w:lang w:val="es-SV"/>
+        </w:rPr>
+        <w:t xml:space="preserve">Apretar el botón de subir documento. </w:t>
+      </w:r>
+    </w:p>
+    <w:p>
+      <w:pPr>
+        <w:rPr>
+          <w:rFonts w:ascii="Arial" w:hAnsi="Arial" w:cs="Arial"/>
+          <w:lang w:val="es-SV"/>
+        </w:rPr>
+      </w:pPr>
+      <w:r>
+        <w:rPr>
+          <w:rFonts w:ascii="Arial" w:hAnsi="Arial" w:cs="Arial"/>
+          <w:lang w:val="es-SV"/>
+        </w:rPr>
+        <w:t xml:space="preserve">Resultado esperado: Se tira un mensaje de error, el cual aborta el proceso y evita que se envié el formulario, por lo que no se puede repetir un mismo documento. </w:t>
+      </w:r>
+    </w:p>
+    <w:p>
+      <w:pPr>
+        <w:rPr>
+          <w:rFonts w:ascii="Arial" w:hAnsi="Arial" w:cs="Arial"/>
+          <w:lang w:val="es-SV"/>
+        </w:rPr>
+      </w:pPr>
+      <w:r>
+        <w:rPr>
+          <w:rFonts w:ascii="Arial" w:hAnsi="Arial" w:cs="Arial"/>
+          <w:lang w:val="es-SV"/>
+        </w:rPr>
+        <w:t xml:space="preserve">Resultado real: Se crea un nuevo documento, con el mismo nombre del que ya está en la base de datos. </w:t>
+      </w:r>
+    </w:p>
+    <w:p>
+      <w:pPr>
+        <w:rPr>
+          <w:rFonts w:ascii="Arial" w:hAnsi="Arial" w:cs="Arial"/>
+          <w:lang w:val="es-SV"/>
+        </w:rPr>
+      </w:pPr>
+      <w:r>
+        <w:rPr>
+          <w:rFonts w:ascii="Arial" w:hAnsi="Arial" w:cs="Arial"/>
+          <w:lang w:val="es-SV"/>
+        </w:rPr>
+        <w:t>Prioridad: Alta</w:t>
+      </w:r>
+    </w:p>
+    <w:p>
+      <w:pPr>
+        <w:rPr>
+          <w:rFonts w:ascii="Arial" w:hAnsi="Arial" w:cs="Arial"/>
+          <w:lang w:val="es-SV"/>
+        </w:rPr>
+      </w:pPr>
+      <w:r>
+        <w:rPr>
+          <w:rFonts w:ascii="Arial" w:hAnsi="Arial" w:cs="Arial"/>
+          <w:lang w:val="es-SV"/>
+        </w:rPr>
+        <w:t>Gravedad: Mayor</w:t>
+      </w:r>
+    </w:p>
+    <w:p>
+      <w:pPr>
+        <w:rPr>
+          <w:rFonts w:ascii="Arial" w:hAnsi="Arial" w:cs="Arial"/>
+          <w:lang w:val="es-SV"/>
+        </w:rPr>
+      </w:pPr>
+      <w:r>
+        <w:rPr>
+          <w:rFonts w:ascii="Arial" w:hAnsi="Arial" w:cs="Arial"/>
+          <w:lang w:val="es-SV"/>
+        </w:rPr>
+        <w:t>Estado: En proceso</w:t>
+      </w:r>
+    </w:p>
+    <w:p>
+      <w:pPr>
+        <w:rPr>
+          <w:rFonts w:ascii="Arial" w:hAnsi="Arial" w:cs="Arial"/>
+          <w:lang w:val="es-SV"/>
+        </w:rPr>
+      </w:pPr>
+      <w:r>
+        <w:rPr>
+          <w:rFonts w:ascii="Arial" w:hAnsi="Arial" w:cs="Arial"/>
+          <w:lang w:val="es-SV"/>
+        </w:rPr>
+        <w:t xml:space="preserve">Evidencia: </w:t>
+      </w:r>
+    </w:p>
+    <w:p>
+      <w:pPr>
+        <w:jc w:val="center"/>
+        <w:rPr>
+          <w:rFonts w:ascii="Arial" w:hAnsi="Arial" w:cs="Arial"/>
+          <w:lang w:val="es-SV"/>
+        </w:rPr>
+      </w:pPr>
+      <w:r>
+        <w:rPr>
+          <w:rFonts w:ascii="Arial" w:hAnsi="Arial" w:cs="Arial"/>
+          <w:lang w:val="es-SV"/>
+        </w:rPr>
+        <w:t>Dos documentos con el mismo nombre en la plataforma</w:t>
+      </w:r>
+    </w:p>
+    <w:p>
+      <w:pPr>
+        <w:jc w:val="center"/>
+        <w:rPr>
+          <w:rFonts w:ascii="Arial" w:hAnsi="Arial" w:cs="Arial"/>
+          <w:lang w:val="es-SV"/>
+        </w:rPr>
+      </w:pPr>
+      <w:r>
+        <w:rPr>
+          <w:rFonts w:ascii="Arial" w:hAnsi="Arial" w:cs="Arial"/>
+          <w:noProof/>
+          <w:lang w:eastAsia="es-SV"/>
+        </w:rPr>
+        <w:drawing>
+          <wp:inline distT="0" distB="0" distL="0" distR="0" wp14:anchorId="5EFD1A1B" wp14:editId="2EDF7519">
+            <wp:extent cx="5612130" cy="1204595"/>
+            <wp:effectExtent l="0" t="0" r="7620" b="0"/>
+            <wp:docPr id="409874021" name="Imagen 1"/>
+            <wp:cNvGraphicFramePr>
+              <a:graphicFrameLocks xmlns:a="http://schemas.openxmlformats.org/drawingml/2006/main" noChangeAspect="1"/>
+            </wp:cNvGraphicFramePr>
+            <a:graphic xmlns:a="http://schemas.openxmlformats.org/drawingml/2006/main">
+              <a:graphicData uri="http://schemas.openxmlformats.org/drawingml/2006/picture">
+                <pic:pic xmlns:pic="http://schemas.openxmlformats.org/drawingml/2006/picture">
+                  <pic:nvPicPr>
+                    <pic:cNvPr id="409874021" name=""/>
+                    <pic:cNvPicPr/>
+                  </pic:nvPicPr>
+                  <pic:blipFill>
+                    <a:blip r:embed="rId13"/>
+                    <a:stretch>
+                      <a:fillRect/>
+                    </a:stretch>
+                  </pic:blipFill>
+                  <pic:spPr>
+                    <a:xfrm>
+                      <a:off x="0" y="0"/>
+                      <a:ext cx="5612130" cy="1204595"/>
+                    </a:xfrm>
+                    <a:prstGeom prst="rect">
+                      <a:avLst/>
+                    </a:prstGeom>
+                  </pic:spPr>
+                </pic:pic>
+              </a:graphicData>
+            </a:graphic>
+          </wp:inline>
+        </w:drawing>
+      </w:r>
+    </w:p>
+    <w:p>
+      <w:pPr>
+        <w:rPr>
+          <w:rFonts w:ascii="Arial" w:hAnsi="Arial" w:cs="Arial"/>
+          <w:lang w:val="es-SV"/>
+        </w:rPr>
+      </w:pPr>
+    </w:p>
+    <w:p>
+      <w:pPr>
+        <w:rPr>
+          <w:rFonts w:ascii="Arial" w:hAnsi="Arial" w:cs="Arial"/>
+          <w:lang w:val="es-SV"/>
+        </w:rPr>
+      </w:pPr>
+    </w:p>
+    <w:p>
+      <w:pPr>
+        <w:pStyle w:val="Ttulo2"/>
+        <w:rPr>
+          <w:rFonts w:ascii="Arial" w:hAnsi="Arial" w:cs="Arial"/>
+          <w:color w:val="auto"/>
+          <w:sz w:val="24"/>
+          <w:szCs w:val="24"/>
+          <w:lang w:val="es-SV"/>
+        </w:rPr>
+      </w:pPr>
+      <w:bookmarkStart w:id="11" w:name="_Toc229775101"/>
+      <w:r>
+        <w:rPr>
+          <w:rFonts w:ascii="Arial" w:hAnsi="Arial" w:cs="Arial"/>
+          <w:color w:val="auto"/>
+          <w:sz w:val="24"/>
+          <w:szCs w:val="24"/>
+          <w:lang w:val="es-SV"/>
+        </w:rPr>
+        <w:t>Registro de Defecto 3</w:t>
+      </w:r>
+      <w:bookmarkEnd w:id="11"/>
+    </w:p>
+    <w:p>
+      <w:pPr>
+        <w:rPr>
+          <w:rFonts w:ascii="Arial" w:hAnsi="Arial" w:cs="Arial"/>
+          <w:lang w:val="es-SV"/>
+        </w:rPr>
+      </w:pPr>
+      <w:r>
+        <w:rPr>
+          <w:rFonts w:ascii="Arial" w:hAnsi="Arial" w:cs="Arial"/>
+          <w:lang w:val="es-SV"/>
+        </w:rPr>
+        <w:t>Nombre: Permite que se dejen comentarios vacíos.</w:t>
+      </w:r>
+    </w:p>
+    <w:p>
+      <w:pPr>
+        <w:rPr>
+          <w:rFonts w:ascii="Arial" w:hAnsi="Arial" w:cs="Arial"/>
+          <w:lang w:val="es-SV"/>
+        </w:rPr>
+      </w:pPr>
+      <w:r>
+        <w:rPr>
+          <w:rFonts w:ascii="Arial" w:hAnsi="Arial" w:cs="Arial"/>
+          <w:lang w:val="es-SV"/>
+        </w:rPr>
+        <w:t xml:space="preserve">Descripción: Al ingresar un comentario, no se cuenta con una validación especifica que evita que se puedan enviar, por parte del formulario, comentarios vacíos. </w:t>
+      </w:r>
+    </w:p>
+    <w:p>
+      <w:pPr>
+        <w:rPr>
+          <w:rFonts w:ascii="Arial" w:hAnsi="Arial" w:cs="Arial"/>
+          <w:lang w:val="es-SV"/>
+        </w:rPr>
+      </w:pPr>
+      <w:r>
+        <w:rPr>
+          <w:rFonts w:ascii="Arial" w:hAnsi="Arial" w:cs="Arial"/>
+          <w:lang w:val="es-SV"/>
+        </w:rPr>
+        <w:t xml:space="preserve">Pasos para reproducir defecto: </w:t>
+      </w:r>
+    </w:p>
+    <w:p>
+      <w:pPr>
+        <w:pStyle w:val="Prrafodelista"/>
+        <w:numPr>
+          <w:ilvl w:val="0"/>
+          <w:numId w:val="44"/>
+        </w:numPr>
+        <w:rPr>
+          <w:rFonts w:ascii="Arial" w:hAnsi="Arial" w:cs="Arial"/>
+          <w:lang w:val="es-SV"/>
+        </w:rPr>
+      </w:pPr>
+      <w:r>
+        <w:rPr>
+          <w:rFonts w:ascii="Arial" w:hAnsi="Arial" w:cs="Arial"/>
+          <w:lang w:val="es-SV"/>
+        </w:rPr>
+        <w:t xml:space="preserve">Ingresa a la plataforma por medio de un usuario. </w:t>
+      </w:r>
+    </w:p>
+    <w:p>
+      <w:pPr>
+        <w:pStyle w:val="Prrafodelista"/>
+        <w:numPr>
+          <w:ilvl w:val="0"/>
+          <w:numId w:val="44"/>
+        </w:numPr>
+        <w:rPr>
+          <w:rFonts w:ascii="Arial" w:hAnsi="Arial" w:cs="Arial"/>
+          <w:lang w:val="es-SV"/>
+        </w:rPr>
+      </w:pPr>
+      <w:r>
+        <w:rPr>
+          <w:rFonts w:ascii="Arial" w:hAnsi="Arial" w:cs="Arial"/>
+          <w:lang w:val="es-SV"/>
+        </w:rPr>
+        <w:lastRenderedPageBreak/>
+        <w:t xml:space="preserve">Apretar el botón de ver documentos. </w:t>
+      </w:r>
+    </w:p>
+    <w:p>
+      <w:pPr>
+        <w:pStyle w:val="Prrafodelista"/>
+        <w:numPr>
+          <w:ilvl w:val="0"/>
+          <w:numId w:val="44"/>
+        </w:numPr>
+        <w:rPr>
+          <w:rFonts w:ascii="Arial" w:hAnsi="Arial" w:cs="Arial"/>
+          <w:lang w:val="es-SV"/>
+        </w:rPr>
+      </w:pPr>
+      <w:r>
+        <w:rPr>
+          <w:rFonts w:ascii="Arial" w:hAnsi="Arial" w:cs="Arial"/>
+          <w:lang w:val="es-SV"/>
+        </w:rPr>
+        <w:t xml:space="preserve">Seleccionar el documento y su respectiva versión a la cual se le quiere dejar un comentario. </w:t>
+      </w:r>
+    </w:p>
+    <w:p>
+      <w:pPr>
+        <w:pStyle w:val="Prrafodelista"/>
+        <w:numPr>
+          <w:ilvl w:val="0"/>
+          <w:numId w:val="44"/>
+        </w:numPr>
+        <w:rPr>
+          <w:rFonts w:ascii="Arial" w:hAnsi="Arial" w:cs="Arial"/>
+          <w:lang w:val="es-SV"/>
+        </w:rPr>
+      </w:pPr>
+      <w:r>
+        <w:rPr>
+          <w:rFonts w:ascii="Arial" w:hAnsi="Arial" w:cs="Arial"/>
+          <w:lang w:val="es-SV"/>
+        </w:rPr>
+        <w:t xml:space="preserve">Apretar el botón de detalle. </w:t>
+      </w:r>
+    </w:p>
+    <w:p>
+      <w:pPr>
+        <w:pStyle w:val="Prrafodelista"/>
+        <w:numPr>
+          <w:ilvl w:val="0"/>
+          <w:numId w:val="44"/>
+        </w:numPr>
+        <w:rPr>
+          <w:rFonts w:ascii="Arial" w:hAnsi="Arial" w:cs="Arial"/>
+          <w:lang w:val="es-SV"/>
+        </w:rPr>
+      </w:pPr>
+      <w:r>
+        <w:rPr>
+          <w:rFonts w:ascii="Arial" w:hAnsi="Arial" w:cs="Arial"/>
+          <w:lang w:val="es-SV"/>
+        </w:rPr>
+        <w:t xml:space="preserve">Apretar la caja de texto del comentario, pero no escribir nada. </w:t>
+      </w:r>
+    </w:p>
+    <w:p>
+      <w:pPr>
+        <w:pStyle w:val="Prrafodelista"/>
+        <w:numPr>
+          <w:ilvl w:val="0"/>
+          <w:numId w:val="44"/>
+        </w:numPr>
+        <w:rPr>
+          <w:rFonts w:ascii="Arial" w:hAnsi="Arial" w:cs="Arial"/>
+          <w:lang w:val="es-SV"/>
+        </w:rPr>
+      </w:pPr>
+      <w:r>
+        <w:rPr>
+          <w:rFonts w:ascii="Arial" w:hAnsi="Arial" w:cs="Arial"/>
+          <w:lang w:val="es-SV"/>
+        </w:rPr>
+        <w:t xml:space="preserve">Apretar el botón de agregar comentario. </w:t>
+      </w:r>
+    </w:p>
+    <w:p>
+      <w:pPr>
+        <w:rPr>
+          <w:rFonts w:ascii="Arial" w:hAnsi="Arial" w:cs="Arial"/>
+          <w:lang w:val="es-SV"/>
+        </w:rPr>
+      </w:pPr>
+      <w:r>
+        <w:rPr>
+          <w:rFonts w:ascii="Arial" w:hAnsi="Arial" w:cs="Arial"/>
+          <w:lang w:val="es-SV"/>
+        </w:rPr>
+        <w:t xml:space="preserve">Resultado esperado: La plataforma tiraría un error y evitaría que se pudiera dejar el comentario vacío al abortar el proceso y evitar que se envié el formulario. </w:t>
+      </w:r>
+    </w:p>
+    <w:p>
+      <w:pPr>
+        <w:rPr>
+          <w:rFonts w:ascii="Arial" w:hAnsi="Arial" w:cs="Arial"/>
+          <w:lang w:val="es-SV"/>
+        </w:rPr>
+      </w:pPr>
+      <w:r>
+        <w:rPr>
+          <w:rFonts w:ascii="Arial" w:hAnsi="Arial" w:cs="Arial"/>
+          <w:lang w:val="es-SV"/>
+        </w:rPr>
+        <w:t xml:space="preserve">Resultado real: Tira el error, pero el formularia todavía se envía, por lo que se pueden dejar comentarios vacíos. </w:t>
+      </w:r>
+    </w:p>
+    <w:p>
+      <w:pPr>
+        <w:rPr>
+          <w:rFonts w:ascii="Arial" w:hAnsi="Arial" w:cs="Arial"/>
+          <w:lang w:val="es-SV"/>
+        </w:rPr>
+      </w:pPr>
+      <w:r>
+        <w:rPr>
+          <w:rFonts w:ascii="Arial" w:hAnsi="Arial" w:cs="Arial"/>
+          <w:lang w:val="es-SV"/>
+        </w:rPr>
+        <w:t>Prioridad: Media</w:t>
+      </w:r>
+    </w:p>
+    <w:p>
+      <w:pPr>
+        <w:rPr>
+          <w:rFonts w:ascii="Arial" w:hAnsi="Arial" w:cs="Arial"/>
+          <w:lang w:val="es-SV"/>
+        </w:rPr>
+      </w:pPr>
+      <w:r>
+        <w:rPr>
+          <w:rFonts w:ascii="Arial" w:hAnsi="Arial" w:cs="Arial"/>
+          <w:lang w:val="es-SV"/>
+        </w:rPr>
+        <w:t>Gravedad: Mayor</w:t>
+      </w:r>
+    </w:p>
+    <w:p>
+      <w:pPr>
+        <w:rPr>
+          <w:rFonts w:ascii="Arial" w:hAnsi="Arial" w:cs="Arial"/>
+          <w:lang w:val="es-SV"/>
+        </w:rPr>
+      </w:pPr>
+      <w:r>
+        <w:rPr>
+          <w:rFonts w:ascii="Arial" w:hAnsi="Arial" w:cs="Arial"/>
+          <w:lang w:val="es-SV"/>
+        </w:rPr>
+        <w:t>Estado: Resuelto</w:t>
+      </w:r>
+    </w:p>
+    <w:p>
+      <w:pPr>
+        <w:rPr>
+          <w:rFonts w:ascii="Arial" w:hAnsi="Arial" w:cs="Arial"/>
+          <w:lang w:val="es-SV"/>
+        </w:rPr>
+      </w:pPr>
+      <w:r>
+        <w:rPr>
+          <w:rFonts w:ascii="Arial" w:hAnsi="Arial" w:cs="Arial"/>
+          <w:lang w:val="es-SV"/>
+        </w:rPr>
+        <w:t xml:space="preserve">Evidencia: </w:t>
+      </w:r>
+    </w:p>
+    <w:p>
+      <w:pPr>
+        <w:jc w:val="center"/>
+        <w:rPr>
+          <w:rFonts w:ascii="Arial" w:hAnsi="Arial" w:cs="Arial"/>
+          <w:lang w:val="es-SV"/>
+        </w:rPr>
+      </w:pPr>
+      <w:r>
+        <w:rPr>
+          <w:rFonts w:ascii="Arial" w:hAnsi="Arial" w:cs="Arial"/>
+          <w:lang w:val="es-SV"/>
+        </w:rPr>
+        <w:t>Mensaje de error al evitar dejar un comentario vacío</w:t>
+      </w:r>
+    </w:p>
+    <w:p>
+      <w:pPr>
+        <w:jc w:val="center"/>
+        <w:rPr>
+          <w:rFonts w:ascii="Arial" w:hAnsi="Arial" w:cs="Arial"/>
+          <w:lang w:val="es-SV"/>
+        </w:rPr>
+      </w:pPr>
+      <w:r>
+        <w:rPr>
+          <w:rFonts w:ascii="Arial" w:hAnsi="Arial" w:cs="Arial"/>
+          <w:noProof/>
+          <w:lang w:val="es-SV"/>
+        </w:rPr>
+        <w:drawing>
+          <wp:inline distT="0" distB="0" distL="0" distR="0" wp14:anchorId="4D9BFA27" wp14:editId="73D87B3D">
+            <wp:extent cx="3574600" cy="2743200"/>
+            <wp:effectExtent l="0" t="0" r="6985" b="0"/>
+            <wp:docPr id="18" name="Imagen 18"/>
+            <wp:cNvGraphicFramePr>
+              <a:graphicFrameLocks xmlns:a="http://schemas.openxmlformats.org/drawingml/2006/main" noChangeAspect="1"/>
+            </wp:cNvGraphicFramePr>
+            <a:graphic xmlns:a="http://schemas.openxmlformats.org/drawingml/2006/main">
+              <a:graphicData uri="http://schemas.openxmlformats.org/drawingml/2006/picture">
+                <pic:pic xmlns:pic="http://schemas.openxmlformats.org/drawingml/2006/picture">
+                  <pic:nvPicPr>
+                    <pic:cNvPr id="1" name=""/>
+                    <pic:cNvPicPr/>
+                  </pic:nvPicPr>
+                  <pic:blipFill>
+                    <a:blip r:embed="rId14"/>
+                    <a:stretch>
+                      <a:fillRect/>
+                    </a:stretch>
+                  </pic:blipFill>
+                  <pic:spPr>
+                    <a:xfrm>
+                      <a:off x="0" y="0"/>
+                      <a:ext cx="3579989" cy="2747336"/>
+                    </a:xfrm>
+                    <a:prstGeom prst="rect">
+                      <a:avLst/>
+                    </a:prstGeom>
+                  </pic:spPr>
+                </pic:pic>
+              </a:graphicData>
+            </a:graphic>
+          </wp:inline>
+        </w:drawing>
+      </w:r>
+    </w:p>
+    <w:p>
+      <w:pPr>
+        <w:rPr>
+          <w:rFonts w:ascii="Arial" w:hAnsi="Arial" w:cs="Arial"/>
+          <w:lang w:val="es-SV"/>
+        </w:rPr>
+      </w:pPr>
+    </w:p>
+    <w:p>
+      <w:pPr>
+        <w:rPr>
+          <w:rFonts w:ascii="Arial" w:hAnsi="Arial" w:cs="Arial"/>
+          <w:lang w:val="es-SV"/>
+        </w:rPr>
+      </w:pPr>
+    </w:p>
+    <w:p>
+      <w:pPr>
+        <w:pStyle w:val="Ttulo2"/>
+        <w:rPr>
+          <w:rFonts w:ascii="Arial" w:hAnsi="Arial" w:cs="Arial"/>
+          <w:color w:val="auto"/>
+          <w:sz w:val="24"/>
+          <w:szCs w:val="24"/>
+          <w:lang w:val="es-SV"/>
+        </w:rPr>
+      </w:pPr>
+      <w:bookmarkStart w:id="12" w:name="_Toc229775102"/>
+      <w:r>
+        <w:rPr>
+          <w:rFonts w:ascii="Arial" w:hAnsi="Arial" w:cs="Arial"/>
+          <w:color w:val="auto"/>
+          <w:sz w:val="24"/>
+          <w:szCs w:val="24"/>
+          <w:lang w:val="es-SV"/>
+        </w:rPr>
+        <w:t>Registro de Defecto 4</w:t>
+      </w:r>
+      <w:bookmarkEnd w:id="12"/>
+    </w:p>
+    <w:p>
+      <w:pPr>
+        <w:rPr>
+          <w:rFonts w:ascii="Arial" w:hAnsi="Arial" w:cs="Arial"/>
+          <w:lang w:val="es-SV"/>
+        </w:rPr>
+      </w:pPr>
+      <w:r>
+        <w:rPr>
+          <w:rFonts w:ascii="Arial" w:hAnsi="Arial" w:cs="Arial"/>
+          <w:lang w:val="es-SV"/>
+        </w:rPr>
+        <w:t>Nombre: Subir documentos en formatos no permitidos.</w:t>
+      </w:r>
+    </w:p>
+    <w:p>
+      <w:pPr>
+        <w:rPr>
+          <w:rFonts w:ascii="Arial" w:hAnsi="Arial" w:cs="Arial"/>
+          <w:lang w:val="es-SV"/>
+        </w:rPr>
+      </w:pPr>
+      <w:r>
+        <w:rPr>
+          <w:rFonts w:ascii="Arial" w:hAnsi="Arial" w:cs="Arial"/>
+          <w:lang w:val="es-SV"/>
+        </w:rPr>
+        <w:lastRenderedPageBreak/>
+        <w:t xml:space="preserve">Descripción: Se permite que se suban documentos que no tienen el formato permitido por la plataforma y por los administradores, lo cual afecta el rendimiento ya que es una plataforma especifica de gestión documental. </w:t>
+      </w:r>
+    </w:p>
+    <w:p>
+      <w:pPr>
+        <w:rPr>
+          <w:rFonts w:ascii="Arial" w:hAnsi="Arial" w:cs="Arial"/>
+          <w:lang w:val="es-SV"/>
+        </w:rPr>
+      </w:pPr>
+      <w:r>
+        <w:rPr>
+          <w:rFonts w:ascii="Arial" w:hAnsi="Arial" w:cs="Arial"/>
+          <w:lang w:val="es-SV"/>
+        </w:rPr>
+        <w:t xml:space="preserve">Pasos para reproducir defecto: </w:t>
+      </w:r>
+    </w:p>
+    <w:p>
+      <w:pPr>
+        <w:pStyle w:val="Prrafodelista"/>
+        <w:numPr>
+          <w:ilvl w:val="0"/>
+          <w:numId w:val="46"/>
+        </w:numPr>
+        <w:rPr>
+          <w:rFonts w:ascii="Arial" w:hAnsi="Arial" w:cs="Arial"/>
+          <w:lang w:val="es-SV"/>
+        </w:rPr>
+      </w:pPr>
+      <w:r>
+        <w:rPr>
+          <w:rFonts w:ascii="Arial" w:hAnsi="Arial" w:cs="Arial"/>
+          <w:lang w:val="es-SV"/>
+        </w:rPr>
+        <w:t xml:space="preserve">Ingresa a la plataforma por medio de un usuario. </w:t>
+      </w:r>
+    </w:p>
+    <w:p>
+      <w:pPr>
+        <w:pStyle w:val="Prrafodelista"/>
+        <w:numPr>
+          <w:ilvl w:val="0"/>
+          <w:numId w:val="46"/>
+        </w:numPr>
+        <w:rPr>
+          <w:rFonts w:ascii="Arial" w:hAnsi="Arial" w:cs="Arial"/>
+          <w:lang w:val="es-SV"/>
+        </w:rPr>
+      </w:pPr>
+      <w:r>
+        <w:rPr>
+          <w:rFonts w:ascii="Arial" w:hAnsi="Arial" w:cs="Arial"/>
+          <w:lang w:val="es-SV"/>
+        </w:rPr>
+        <w:t xml:space="preserve">Apretar el botón de subir documento. </w:t>
+      </w:r>
+    </w:p>
+    <w:p>
+      <w:pPr>
+        <w:pStyle w:val="Prrafodelista"/>
+        <w:numPr>
+          <w:ilvl w:val="0"/>
+          <w:numId w:val="46"/>
+        </w:numPr>
+        <w:rPr>
+          <w:rFonts w:ascii="Arial" w:hAnsi="Arial" w:cs="Arial"/>
+          <w:lang w:val="es-SV"/>
+        </w:rPr>
+      </w:pPr>
+      <w:r>
+        <w:rPr>
+          <w:rFonts w:ascii="Arial" w:hAnsi="Arial" w:cs="Arial"/>
+          <w:lang w:val="es-SV"/>
+        </w:rPr>
+        <w:t xml:space="preserve">Llenar la información requerida y subir un archivo con un formato no permitido (como .exe). </w:t>
+      </w:r>
+    </w:p>
+    <w:p>
+      <w:pPr>
+        <w:pStyle w:val="Prrafodelista"/>
+        <w:numPr>
+          <w:ilvl w:val="0"/>
+          <w:numId w:val="46"/>
+        </w:numPr>
+        <w:rPr>
+          <w:rFonts w:ascii="Arial" w:hAnsi="Arial" w:cs="Arial"/>
+          <w:lang w:val="es-SV"/>
+        </w:rPr>
+      </w:pPr>
+      <w:r>
+        <w:rPr>
+          <w:rFonts w:ascii="Arial" w:hAnsi="Arial" w:cs="Arial"/>
+          <w:lang w:val="es-SV"/>
+        </w:rPr>
+        <w:t>Apretar el botón de subir documento.</w:t>
+      </w:r>
+    </w:p>
+    <w:p>
+      <w:pPr>
+        <w:rPr>
+          <w:rFonts w:ascii="Arial" w:hAnsi="Arial" w:cs="Arial"/>
+          <w:lang w:val="es-SV"/>
+        </w:rPr>
+      </w:pPr>
+      <w:r>
+        <w:rPr>
+          <w:rFonts w:ascii="Arial" w:hAnsi="Arial" w:cs="Arial"/>
+          <w:lang w:val="es-SV"/>
+        </w:rPr>
+        <w:t>Resultado esperado: Se tiraría un error, el cual menciona que no se puede subir un formato no permitido al sitio web, aparte de abortar el proceso y evitar que se envié el formulario y que se suba a la base de datos.</w:t>
+      </w:r>
+    </w:p>
+    <w:p>
+      <w:pPr>
+        <w:rPr>
+          <w:rFonts w:ascii="Arial" w:hAnsi="Arial" w:cs="Arial"/>
+          <w:lang w:val="es-SV"/>
+        </w:rPr>
+      </w:pPr>
+      <w:r>
+        <w:rPr>
+          <w:rFonts w:ascii="Arial" w:hAnsi="Arial" w:cs="Arial"/>
+          <w:lang w:val="es-SV"/>
+        </w:rPr>
+        <w:t xml:space="preserve">Resultado real: Aun se pueden subir distintos formatos no especificados a la base de datos y a la plataforma en sí. </w:t>
+      </w:r>
+    </w:p>
+    <w:p>
+      <w:pPr>
+        <w:rPr>
+          <w:rFonts w:ascii="Arial" w:hAnsi="Arial" w:cs="Arial"/>
+          <w:lang w:val="es-SV"/>
+        </w:rPr>
+      </w:pPr>
+      <w:r>
+        <w:rPr>
+          <w:rFonts w:ascii="Arial" w:hAnsi="Arial" w:cs="Arial"/>
+          <w:lang w:val="es-SV"/>
+        </w:rPr>
+        <w:t>Prioridad: Alta</w:t>
+      </w:r>
+    </w:p>
+    <w:p>
+      <w:pPr>
+        <w:rPr>
+          <w:rFonts w:ascii="Arial" w:hAnsi="Arial" w:cs="Arial"/>
+          <w:lang w:val="es-SV"/>
+        </w:rPr>
+      </w:pPr>
+      <w:r>
+        <w:rPr>
+          <w:rFonts w:ascii="Arial" w:hAnsi="Arial" w:cs="Arial"/>
+          <w:lang w:val="es-SV"/>
+        </w:rPr>
+        <w:t>Gravedad: Mayor</w:t>
+      </w:r>
+    </w:p>
+    <w:p>
+      <w:pPr>
+        <w:rPr>
+          <w:rFonts w:ascii="Arial" w:hAnsi="Arial" w:cs="Arial"/>
+          <w:lang w:val="es-SV"/>
+        </w:rPr>
+      </w:pPr>
+      <w:r>
+        <w:rPr>
+          <w:rFonts w:ascii="Arial" w:hAnsi="Arial" w:cs="Arial"/>
+          <w:lang w:val="es-SV"/>
+        </w:rPr>
+        <w:t>Estado: En proceso</w:t>
+      </w:r>
+    </w:p>
+    <w:p>
+      <w:pPr>
+        <w:rPr>
+          <w:rFonts w:ascii="Arial" w:hAnsi="Arial" w:cs="Arial"/>
+          <w:lang w:val="es-SV"/>
+        </w:rPr>
+      </w:pPr>
+      <w:r>
+        <w:rPr>
+          <w:rFonts w:ascii="Arial" w:hAnsi="Arial" w:cs="Arial"/>
+          <w:lang w:val="es-SV"/>
+        </w:rPr>
+        <w:t xml:space="preserve">Evidencia: </w:t>
+      </w:r>
+    </w:p>
+    <w:p>
+      <w:pPr>
+        <w:jc w:val="center"/>
+        <w:rPr>
+          <w:rFonts w:ascii="Arial" w:hAnsi="Arial" w:cs="Arial"/>
+          <w:lang w:val="es-SV"/>
+        </w:rPr>
+      </w:pPr>
+      <w:r>
+        <w:rPr>
+          <w:rFonts w:ascii="Arial" w:hAnsi="Arial" w:cs="Arial"/>
+          <w:lang w:val="es-SV"/>
+        </w:rPr>
+        <w:t>Subiendo un .exe</w:t>
+      </w:r>
+    </w:p>
+    <w:p>
+      <w:pPr>
+        <w:jc w:val="center"/>
+        <w:rPr>
+          <w:rFonts w:ascii="Arial" w:hAnsi="Arial" w:cs="Arial"/>
+          <w:lang w:val="es-SV"/>
+        </w:rPr>
+      </w:pPr>
+      <w:r>
+        <w:rPr>
+          <w:rFonts w:ascii="Arial" w:hAnsi="Arial" w:cs="Arial"/>
+          <w:noProof/>
+          <w:lang w:eastAsia="es-SV"/>
+        </w:rPr>
+        <w:drawing>
+          <wp:inline distT="0" distB="0" distL="0" distR="0" wp14:anchorId="52FCC187" wp14:editId="45994750">
+            <wp:extent cx="5006340" cy="2526395"/>
+            <wp:effectExtent l="0" t="0" r="3810" b="7620"/>
+            <wp:docPr id="1790819508" name="Imagen 1"/>
+            <wp:cNvGraphicFramePr>
+              <a:graphicFrameLocks xmlns:a="http://schemas.openxmlformats.org/drawingml/2006/main" noChangeAspect="1"/>
+            </wp:cNvGraphicFramePr>
+            <a:graphic xmlns:a="http://schemas.openxmlformats.org/drawingml/2006/main">
+              <a:graphicData uri="http://schemas.openxmlformats.org/drawingml/2006/picture">
+                <pic:pic xmlns:pic="http://schemas.openxmlformats.org/drawingml/2006/picture">
+                  <pic:nvPicPr>
+                    <pic:cNvPr id="1790819508" name=""/>
+                    <pic:cNvPicPr/>
+                  </pic:nvPicPr>
+                  <pic:blipFill>
+                    <a:blip r:embed="rId15"/>
+                    <a:stretch>
+                      <a:fillRect/>
+                    </a:stretch>
+                  </pic:blipFill>
+                  <pic:spPr>
+                    <a:xfrm>
+                      <a:off x="0" y="0"/>
+                      <a:ext cx="5008492" cy="2527481"/>
+                    </a:xfrm>
+                    <a:prstGeom prst="rect">
+                      <a:avLst/>
+                    </a:prstGeom>
+                  </pic:spPr>
+                </pic:pic>
+              </a:graphicData>
+            </a:graphic>
+          </wp:inline>
+        </w:drawing>
+      </w:r>
+    </w:p>
+    <w:p>
+      <w:pPr>
+        <w:jc w:val="center"/>
+        <w:rPr>
+          <w:rFonts w:ascii="Arial" w:hAnsi="Arial" w:cs="Arial"/>
+          <w:lang w:val="es-SV"/>
+        </w:rPr>
+      </w:pPr>
+    </w:p>
+    <w:p>
+      <w:pPr>
+        <w:jc w:val="center"/>
+        <w:rPr>
+          <w:rFonts w:ascii="Arial" w:hAnsi="Arial" w:cs="Arial"/>
+          <w:lang w:val="es-SV"/>
+        </w:rPr>
+      </w:pPr>
+      <w:r>
+        <w:rPr>
+          <w:rFonts w:ascii="Arial" w:hAnsi="Arial" w:cs="Arial"/>
+          <w:lang w:val="es-SV"/>
+        </w:rPr>
+        <w:t>El documento en la plataforma</w:t>
+      </w:r>
+    </w:p>
+    <w:p>
+      <w:pPr>
+        <w:jc w:val="center"/>
+        <w:rPr>
+          <w:rFonts w:ascii="Arial" w:hAnsi="Arial" w:cs="Arial"/>
+          <w:lang w:val="es-SV"/>
+        </w:rPr>
+      </w:pPr>
+      <w:r>
+        <w:rPr>
+          <w:rFonts w:ascii="Arial" w:hAnsi="Arial" w:cs="Arial"/>
+          <w:noProof/>
+          <w:lang w:eastAsia="es-SV"/>
+        </w:rPr>
+        <w:lastRenderedPageBreak/>
+        <w:drawing>
+          <wp:inline distT="0" distB="0" distL="0" distR="0" wp14:anchorId="245197CA" wp14:editId="6938DE0C">
+            <wp:extent cx="4198620" cy="1264147"/>
+            <wp:effectExtent l="0" t="0" r="0" b="0"/>
+            <wp:docPr id="24989913" name="Imagen 1"/>
+            <wp:cNvGraphicFramePr>
+              <a:graphicFrameLocks xmlns:a="http://schemas.openxmlformats.org/drawingml/2006/main" noChangeAspect="1"/>
+            </wp:cNvGraphicFramePr>
+            <a:graphic xmlns:a="http://schemas.openxmlformats.org/drawingml/2006/main">
+              <a:graphicData uri="http://schemas.openxmlformats.org/drawingml/2006/picture">
+                <pic:pic xmlns:pic="http://schemas.openxmlformats.org/drawingml/2006/picture">
+                  <pic:nvPicPr>
+                    <pic:cNvPr id="24989913" name=""/>
+                    <pic:cNvPicPr/>
+                  </pic:nvPicPr>
+                  <pic:blipFill>
+                    <a:blip r:embed="rId16"/>
+                    <a:stretch>
+                      <a:fillRect/>
+                    </a:stretch>
+                  </pic:blipFill>
+                  <pic:spPr>
+                    <a:xfrm>
+                      <a:off x="0" y="0"/>
+                      <a:ext cx="4221569" cy="1271057"/>
+                    </a:xfrm>
+                    <a:prstGeom prst="rect">
+                      <a:avLst/>
+                    </a:prstGeom>
+                  </pic:spPr>
+                </pic:pic>
+              </a:graphicData>
+            </a:graphic>
+          </wp:inline>
+        </w:drawing>
+      </w:r>
+    </w:p>
+    <w:p>
+      <w:pPr>
+        <w:rPr>
+          <w:rFonts w:ascii="Arial" w:hAnsi="Arial" w:cs="Arial"/>
+          <w:lang w:val="es-SV"/>
+        </w:rPr>
+      </w:pPr>
+    </w:p>
+    <w:p>
+      <w:pPr>
+        <w:pStyle w:val="Ttulo2"/>
+        <w:rPr>
+          <w:rFonts w:ascii="Arial" w:hAnsi="Arial" w:cs="Arial"/>
+          <w:color w:val="auto"/>
+          <w:sz w:val="24"/>
+          <w:szCs w:val="24"/>
+          <w:lang w:val="es-SV"/>
+        </w:rPr>
+      </w:pPr>
+      <w:bookmarkStart w:id="13" w:name="_Toc229775103"/>
+      <w:r>
+        <w:rPr>
+          <w:rFonts w:ascii="Arial" w:hAnsi="Arial" w:cs="Arial"/>
+          <w:color w:val="auto"/>
+          <w:sz w:val="24"/>
+          <w:szCs w:val="24"/>
+          <w:lang w:val="es-SV"/>
+        </w:rPr>
+        <w:t>Registro de Defecto 5</w:t>
+      </w:r>
+      <w:bookmarkEnd w:id="13"/>
+    </w:p>
+    <w:p>
+      <w:pPr>
+        <w:rPr>
+          <w:rFonts w:ascii="Arial" w:hAnsi="Arial" w:cs="Arial"/>
+          <w:lang w:val="es-SV"/>
+        </w:rPr>
+      </w:pPr>
+      <w:r>
+        <w:rPr>
+          <w:rFonts w:ascii="Arial" w:hAnsi="Arial" w:cs="Arial"/>
+          <w:lang w:val="es-SV"/>
+        </w:rPr>
+        <w:t xml:space="preserve">Nombre: Acceso a páginas restringidas por tipo de rol. </w:t>
+      </w:r>
+    </w:p>
+    <w:p>
+      <w:pPr>
+        <w:rPr>
+          <w:rFonts w:ascii="Arial" w:hAnsi="Arial" w:cs="Arial"/>
+          <w:lang w:val="es-SV"/>
+        </w:rPr>
+      </w:pPr>
+      <w:r>
+        <w:rPr>
+          <w:rFonts w:ascii="Arial" w:hAnsi="Arial" w:cs="Arial"/>
+          <w:lang w:val="es-SV"/>
+        </w:rPr>
+        <w:t xml:space="preserve">Descripción: Que un usuario pudiera copiar el URL de otro tipo de usuario con un rol distinto (como administrador) y luego, al ingresar el, acceder a los permisos que tiene el usuario administrador al pegar el URL. </w:t>
+      </w:r>
+    </w:p>
+    <w:p>
+      <w:pPr>
+        <w:rPr>
+          <w:rFonts w:ascii="Arial" w:hAnsi="Arial" w:cs="Arial"/>
+          <w:lang w:val="es-SV"/>
+        </w:rPr>
+      </w:pPr>
+      <w:r>
+        <w:rPr>
+          <w:rFonts w:ascii="Arial" w:hAnsi="Arial" w:cs="Arial"/>
+          <w:lang w:val="es-SV"/>
+        </w:rPr>
+        <w:t xml:space="preserve">Pasos para reproducir defecto: </w:t>
+      </w:r>
+    </w:p>
+    <w:p>
+      <w:pPr>
+        <w:pStyle w:val="Prrafodelista"/>
+        <w:numPr>
+          <w:ilvl w:val="0"/>
+          <w:numId w:val="48"/>
+        </w:numPr>
+        <w:rPr>
+          <w:rFonts w:ascii="Arial" w:hAnsi="Arial" w:cs="Arial"/>
+          <w:lang w:val="es-SV"/>
+        </w:rPr>
+      </w:pPr>
+      <w:r>
+        <w:rPr>
+          <w:rFonts w:ascii="Arial" w:hAnsi="Arial" w:cs="Arial"/>
+          <w:lang w:val="es-SV"/>
+        </w:rPr>
+        <w:t xml:space="preserve">Ingresa a la plataforma por medio de un usuario de tipo administrador. </w:t>
+      </w:r>
+    </w:p>
+    <w:p>
+      <w:pPr>
+        <w:pStyle w:val="Prrafodelista"/>
+        <w:numPr>
+          <w:ilvl w:val="0"/>
+          <w:numId w:val="48"/>
+        </w:numPr>
+        <w:rPr>
+          <w:rFonts w:ascii="Arial" w:hAnsi="Arial" w:cs="Arial"/>
+          <w:lang w:val="es-SV"/>
+        </w:rPr>
+      </w:pPr>
+      <w:r>
+        <w:rPr>
+          <w:rFonts w:ascii="Arial" w:hAnsi="Arial" w:cs="Arial"/>
+          <w:lang w:val="es-SV"/>
+        </w:rPr>
+        <w:t xml:space="preserve">Copiar el URL. </w:t>
+      </w:r>
+    </w:p>
+    <w:p>
+      <w:pPr>
+        <w:pStyle w:val="Prrafodelista"/>
+        <w:numPr>
+          <w:ilvl w:val="0"/>
+          <w:numId w:val="48"/>
+        </w:numPr>
+        <w:rPr>
+          <w:rFonts w:ascii="Arial" w:hAnsi="Arial" w:cs="Arial"/>
+          <w:lang w:val="es-SV"/>
+        </w:rPr>
+      </w:pPr>
+      <w:r>
+        <w:rPr>
+          <w:rFonts w:ascii="Arial" w:hAnsi="Arial" w:cs="Arial"/>
+          <w:lang w:val="es-SV"/>
+        </w:rPr>
+        <w:t xml:space="preserve">Salir de la plataforma. </w:t>
+      </w:r>
+    </w:p>
+    <w:p>
+      <w:pPr>
+        <w:pStyle w:val="Prrafodelista"/>
+        <w:numPr>
+          <w:ilvl w:val="0"/>
+          <w:numId w:val="48"/>
+        </w:numPr>
+        <w:rPr>
+          <w:rFonts w:ascii="Arial" w:hAnsi="Arial" w:cs="Arial"/>
+          <w:lang w:val="es-SV"/>
+        </w:rPr>
+      </w:pPr>
+      <w:r>
+        <w:rPr>
+          <w:rFonts w:ascii="Arial" w:hAnsi="Arial" w:cs="Arial"/>
+          <w:lang w:val="es-SV"/>
+        </w:rPr>
+        <w:t xml:space="preserve">Ingresar a la plataforma por medio de un usuario tipo empleado. </w:t>
+      </w:r>
+    </w:p>
+    <w:p>
+      <w:pPr>
+        <w:pStyle w:val="Prrafodelista"/>
+        <w:numPr>
+          <w:ilvl w:val="0"/>
+          <w:numId w:val="48"/>
+        </w:numPr>
+        <w:rPr>
+          <w:rFonts w:ascii="Arial" w:hAnsi="Arial" w:cs="Arial"/>
+          <w:lang w:val="es-SV"/>
+        </w:rPr>
+      </w:pPr>
+      <w:r>
+        <w:rPr>
+          <w:rFonts w:ascii="Arial" w:hAnsi="Arial" w:cs="Arial"/>
+          <w:lang w:val="es-SV"/>
+        </w:rPr>
+        <w:t xml:space="preserve">Pegar el URL. </w:t>
+      </w:r>
+    </w:p>
+    <w:p>
+      <w:pPr>
+        <w:rPr>
+          <w:rFonts w:ascii="Arial" w:hAnsi="Arial" w:cs="Arial"/>
+          <w:lang w:val="es-SV"/>
+        </w:rPr>
+      </w:pPr>
+      <w:r>
+        <w:rPr>
+          <w:rFonts w:ascii="Arial" w:hAnsi="Arial" w:cs="Arial"/>
+          <w:lang w:val="es-SV"/>
+        </w:rPr>
+        <w:t xml:space="preserve">Resultado esperado: Que el usuario sea redireccionado a su página principal, donde no aparecen las opciones avanzadas del administrador. </w:t>
+      </w:r>
+    </w:p>
+    <w:p>
+      <w:pPr>
+        <w:rPr>
+          <w:rFonts w:ascii="Arial" w:hAnsi="Arial" w:cs="Arial"/>
+          <w:lang w:val="es-SV"/>
+        </w:rPr>
+      </w:pPr>
+      <w:r>
+        <w:rPr>
+          <w:rFonts w:ascii="Arial" w:hAnsi="Arial" w:cs="Arial"/>
+          <w:lang w:val="es-SV"/>
+        </w:rPr>
+        <w:t xml:space="preserve">Resultado real: Se puede ir al menú principal de administrador, con las opciones avanzadas visibles. </w:t>
+      </w:r>
+    </w:p>
+    <w:p>
+      <w:pPr>
+        <w:rPr>
+          <w:rFonts w:ascii="Arial" w:hAnsi="Arial" w:cs="Arial"/>
+          <w:lang w:val="es-SV"/>
+        </w:rPr>
+      </w:pPr>
+      <w:r>
+        <w:rPr>
+          <w:rFonts w:ascii="Arial" w:hAnsi="Arial" w:cs="Arial"/>
+          <w:lang w:val="es-SV"/>
+        </w:rPr>
+        <w:t>Prioridad: Alta</w:t>
+      </w:r>
+    </w:p>
+    <w:p>
+      <w:pPr>
+        <w:rPr>
+          <w:rFonts w:ascii="Arial" w:hAnsi="Arial" w:cs="Arial"/>
+          <w:lang w:val="es-SV"/>
+        </w:rPr>
+      </w:pPr>
+      <w:r>
+        <w:rPr>
+          <w:rFonts w:ascii="Arial" w:hAnsi="Arial" w:cs="Arial"/>
+          <w:lang w:val="es-SV"/>
+        </w:rPr>
+        <w:t>Gravedad: Mayor</w:t>
+      </w:r>
+    </w:p>
+    <w:p>
+      <w:pPr>
+        <w:rPr>
+          <w:rFonts w:ascii="Arial" w:hAnsi="Arial" w:cs="Arial"/>
+          <w:lang w:val="es-SV"/>
+        </w:rPr>
+      </w:pPr>
+      <w:r>
+        <w:rPr>
+          <w:rFonts w:ascii="Arial" w:hAnsi="Arial" w:cs="Arial"/>
+          <w:lang w:val="es-SV"/>
+        </w:rPr>
+        <w:t>Estado: En proceso</w:t>
+      </w:r>
+    </w:p>
+    <w:p>
+      <w:pPr>
+        <w:rPr>
+          <w:rFonts w:ascii="Arial" w:hAnsi="Arial" w:cs="Arial"/>
+          <w:lang w:val="es-SV"/>
+        </w:rPr>
+      </w:pPr>
+      <w:r>
+        <w:rPr>
+          <w:rFonts w:ascii="Arial" w:hAnsi="Arial" w:cs="Arial"/>
+          <w:lang w:val="es-SV"/>
+        </w:rPr>
+        <w:t xml:space="preserve">Evidencia: </w:t>
+      </w:r>
+    </w:p>
+    <w:p>
+      <w:pPr>
+        <w:jc w:val="center"/>
+        <w:rPr>
+          <w:rFonts w:ascii="Arial" w:hAnsi="Arial" w:cs="Arial"/>
+          <w:lang w:val="es-SV"/>
+        </w:rPr>
+      </w:pPr>
+    </w:p>
+    <w:p>
+      <w:pPr>
+        <w:jc w:val="center"/>
+        <w:rPr>
+          <w:rFonts w:ascii="Arial" w:hAnsi="Arial" w:cs="Arial"/>
+          <w:lang w:val="es-SV"/>
+        </w:rPr>
+      </w:pPr>
+      <w:r>
+        <w:rPr>
+          <w:rFonts w:ascii="Arial" w:hAnsi="Arial" w:cs="Arial"/>
+          <w:lang w:val="es-SV"/>
+        </w:rPr>
+        <w:t>Cuando se entra como administrador se puede ver este menú principal</w:t>
+      </w:r>
+    </w:p>
+    <w:p>
+      <w:pPr>
+        <w:jc w:val="center"/>
+        <w:rPr>
+          <w:rFonts w:ascii="Arial" w:hAnsi="Arial" w:cs="Arial"/>
+          <w:lang w:val="es-SV"/>
+        </w:rPr>
+      </w:pPr>
+      <w:r>
+        <w:rPr>
+          <w:rFonts w:ascii="Arial" w:hAnsi="Arial" w:cs="Arial"/>
+          <w:noProof/>
+          <w:lang w:eastAsia="es-SV"/>
+        </w:rPr>
+        <w:lastRenderedPageBreak/>
+        <w:drawing>
+          <wp:inline distT="0" distB="0" distL="0" distR="0" wp14:anchorId="45AB5F01" wp14:editId="5A6891BD">
+            <wp:extent cx="5059680" cy="1221124"/>
+            <wp:effectExtent l="0" t="0" r="7620" b="0"/>
+            <wp:docPr id="761149427" name="Imagen 1"/>
+            <wp:cNvGraphicFramePr>
+              <a:graphicFrameLocks xmlns:a="http://schemas.openxmlformats.org/drawingml/2006/main" noChangeAspect="1"/>
+            </wp:cNvGraphicFramePr>
+            <a:graphic xmlns:a="http://schemas.openxmlformats.org/drawingml/2006/main">
+              <a:graphicData uri="http://schemas.openxmlformats.org/drawingml/2006/picture">
+                <pic:pic xmlns:pic="http://schemas.openxmlformats.org/drawingml/2006/picture">
+                  <pic:nvPicPr>
+                    <pic:cNvPr id="761149427" name=""/>
+                    <pic:cNvPicPr/>
+                  </pic:nvPicPr>
+                  <pic:blipFill>
+                    <a:blip r:embed="rId17"/>
+                    <a:stretch>
+                      <a:fillRect/>
+                    </a:stretch>
+                  </pic:blipFill>
+                  <pic:spPr>
+                    <a:xfrm>
+                      <a:off x="0" y="0"/>
+                      <a:ext cx="5090513" cy="1228565"/>
+                    </a:xfrm>
+                    <a:prstGeom prst="rect">
+                      <a:avLst/>
+                    </a:prstGeom>
+                  </pic:spPr>
+                </pic:pic>
+              </a:graphicData>
+            </a:graphic>
+          </wp:inline>
+        </w:drawing>
+      </w:r>
+    </w:p>
+    <w:p>
+      <w:pPr>
+        <w:jc w:val="center"/>
+        <w:rPr>
+          <w:rFonts w:ascii="Arial" w:hAnsi="Arial" w:cs="Arial"/>
+          <w:lang w:val="es-SV"/>
+        </w:rPr>
+      </w:pPr>
+    </w:p>
+    <w:p>
+      <w:pPr>
+        <w:jc w:val="center"/>
+        <w:rPr>
+          <w:rFonts w:ascii="Arial" w:hAnsi="Arial" w:cs="Arial"/>
+          <w:lang w:val="es-SV"/>
+        </w:rPr>
+      </w:pPr>
+      <w:r>
+        <w:rPr>
+          <w:rFonts w:ascii="Arial" w:hAnsi="Arial" w:cs="Arial"/>
+          <w:lang w:val="es-SV"/>
+        </w:rPr>
+        <w:t>Al apretar el botón de crear usuario, permite crearlo</w:t>
+      </w:r>
+    </w:p>
+    <w:p>
+      <w:pPr>
+        <w:jc w:val="center"/>
+        <w:rPr>
+          <w:rFonts w:ascii="Arial" w:hAnsi="Arial" w:cs="Arial"/>
+          <w:lang w:val="es-SV"/>
+        </w:rPr>
+      </w:pPr>
+      <w:r>
+        <w:rPr>
+          <w:rFonts w:ascii="Arial" w:hAnsi="Arial" w:cs="Arial"/>
+          <w:noProof/>
+          <w:lang w:eastAsia="es-SV"/>
+        </w:rPr>
+        <w:drawing>
+          <wp:inline distT="0" distB="0" distL="0" distR="0" wp14:anchorId="78ABDA78" wp14:editId="73E9337D">
+            <wp:extent cx="3642360" cy="2358179"/>
+            <wp:effectExtent l="0" t="0" r="0" b="4445"/>
+            <wp:docPr id="1494674427" name="Imagen 1"/>
+            <wp:cNvGraphicFramePr>
+              <a:graphicFrameLocks xmlns:a="http://schemas.openxmlformats.org/drawingml/2006/main" noChangeAspect="1"/>
+            </wp:cNvGraphicFramePr>
+            <a:graphic xmlns:a="http://schemas.openxmlformats.org/drawingml/2006/main">
+              <a:graphicData uri="http://schemas.openxmlformats.org/drawingml/2006/picture">
+                <pic:pic xmlns:pic="http://schemas.openxmlformats.org/drawingml/2006/picture">
+                  <pic:nvPicPr>
+                    <pic:cNvPr id="1494674427" name=""/>
+                    <pic:cNvPicPr/>
+                  </pic:nvPicPr>
+                  <pic:blipFill>
+                    <a:blip r:embed="rId18"/>
+                    <a:stretch>
+                      <a:fillRect/>
+                    </a:stretch>
+                  </pic:blipFill>
+                  <pic:spPr>
+                    <a:xfrm>
+                      <a:off x="0" y="0"/>
+                      <a:ext cx="3647422" cy="2361457"/>
+                    </a:xfrm>
+                    <a:prstGeom prst="rect">
+                      <a:avLst/>
+                    </a:prstGeom>
+                  </pic:spPr>
+                </pic:pic>
+              </a:graphicData>
+            </a:graphic>
+          </wp:inline>
+        </w:drawing>
+      </w:r>
+    </w:p>
+    <w:p>
+      <w:pPr>
+        <w:jc w:val="center"/>
+        <w:rPr>
+          <w:rFonts w:ascii="Arial" w:hAnsi="Arial" w:cs="Arial"/>
+          <w:lang w:val="es-SV"/>
+        </w:rPr>
+      </w:pPr>
+    </w:p>
+    <w:p>
+      <w:pPr>
+        <w:jc w:val="center"/>
+        <w:rPr>
+          <w:rFonts w:ascii="Arial" w:hAnsi="Arial" w:cs="Arial"/>
+          <w:lang w:val="es-SV"/>
+        </w:rPr>
+      </w:pPr>
+      <w:r>
+        <w:rPr>
+          <w:rFonts w:ascii="Arial" w:hAnsi="Arial" w:cs="Arial"/>
+          <w:lang w:val="es-SV"/>
+        </w:rPr>
+        <w:t>Cuando uno entra como un empleado, no aparecen esas opciones en el menú</w:t>
+      </w:r>
+    </w:p>
+    <w:p>
+      <w:pPr>
+        <w:jc w:val="center"/>
+        <w:rPr>
+          <w:rFonts w:ascii="Arial" w:hAnsi="Arial" w:cs="Arial"/>
+          <w:lang w:val="es-SV"/>
+        </w:rPr>
+      </w:pPr>
+      <w:r>
+        <w:rPr>
+          <w:rFonts w:ascii="Arial" w:hAnsi="Arial" w:cs="Arial"/>
+          <w:noProof/>
+          <w:lang w:eastAsia="es-SV"/>
+        </w:rPr>
+        <w:drawing>
+          <wp:inline distT="0" distB="0" distL="0" distR="0" wp14:anchorId="54693307" wp14:editId="62D76DAE">
+            <wp:extent cx="5612130" cy="2263775"/>
+            <wp:effectExtent l="0" t="0" r="7620" b="3175"/>
+            <wp:docPr id="667149291" name="Imagen 1"/>
+            <wp:cNvGraphicFramePr>
+              <a:graphicFrameLocks xmlns:a="http://schemas.openxmlformats.org/drawingml/2006/main" noChangeAspect="1"/>
+            </wp:cNvGraphicFramePr>
+            <a:graphic xmlns:a="http://schemas.openxmlformats.org/drawingml/2006/main">
+              <a:graphicData uri="http://schemas.openxmlformats.org/drawingml/2006/picture">
+                <pic:pic xmlns:pic="http://schemas.openxmlformats.org/drawingml/2006/picture">
+                  <pic:nvPicPr>
+                    <pic:cNvPr id="667149291" name=""/>
+                    <pic:cNvPicPr/>
+                  </pic:nvPicPr>
+                  <pic:blipFill>
+                    <a:blip r:embed="rId19"/>
+                    <a:stretch>
+                      <a:fillRect/>
+                    </a:stretch>
+                  </pic:blipFill>
+                  <pic:spPr>
+                    <a:xfrm>
+                      <a:off x="0" y="0"/>
+                      <a:ext cx="5612130" cy="2263775"/>
+                    </a:xfrm>
+                    <a:prstGeom prst="rect">
+                      <a:avLst/>
+                    </a:prstGeom>
+                  </pic:spPr>
+                </pic:pic>
+              </a:graphicData>
+            </a:graphic>
+          </wp:inline>
+        </w:drawing>
+      </w:r>
+    </w:p>
+    <w:p>
+      <w:pPr>
+        <w:jc w:val="center"/>
+        <w:rPr>
+          <w:rFonts w:ascii="Arial" w:hAnsi="Arial" w:cs="Arial"/>
+          <w:lang w:val="es-SV"/>
+        </w:rPr>
+      </w:pPr>
+    </w:p>
+    <w:p>
+      <w:pPr>
+        <w:jc w:val="center"/>
+        <w:rPr>
+          <w:rFonts w:ascii="Arial" w:hAnsi="Arial" w:cs="Arial"/>
+          <w:lang w:val="es-SV"/>
+        </w:rPr>
+      </w:pPr>
+      <w:r>
+        <w:rPr>
+          <w:rFonts w:ascii="Arial" w:hAnsi="Arial" w:cs="Arial"/>
+          <w:lang w:val="es-SV"/>
+        </w:rPr>
+        <w:t>Pero si uno copia el enlace y lo pega, uno tiene permitido el acceso a crear usuario</w:t>
+      </w:r>
+    </w:p>
+    <w:p>
+      <w:pPr>
+        <w:rPr>
+          <w:rFonts w:ascii="Arial" w:hAnsi="Arial" w:cs="Arial"/>
+          <w:lang w:val="es-SV"/>
+        </w:rPr>
+      </w:pPr>
+      <w:r>
+        <w:rPr>
+          <w:rFonts w:ascii="Arial" w:hAnsi="Arial" w:cs="Arial"/>
+          <w:noProof/>
+          <w:lang w:eastAsia="es-SV"/>
+        </w:rPr>
+        <w:lastRenderedPageBreak/>
+        <w:drawing>
+          <wp:inline distT="0" distB="0" distL="0" distR="0" wp14:anchorId="39E9C857" wp14:editId="58B77291">
+            <wp:extent cx="4216124" cy="2857500"/>
+            <wp:effectExtent l="0" t="0" r="0" b="0"/>
+            <wp:docPr id="500720233" name="Imagen 1"/>
+            <wp:cNvGraphicFramePr>
+              <a:graphicFrameLocks xmlns:a="http://schemas.openxmlformats.org/drawingml/2006/main" noChangeAspect="1"/>
+            </wp:cNvGraphicFramePr>
+            <a:graphic xmlns:a="http://schemas.openxmlformats.org/drawingml/2006/main">
+              <a:graphicData uri="http://schemas.openxmlformats.org/drawingml/2006/picture">
+                <pic:pic xmlns:pic="http://schemas.openxmlformats.org/drawingml/2006/picture">
+                  <pic:nvPicPr>
+                    <pic:cNvPr id="500720233" name=""/>
+                    <pic:cNvPicPr/>
+                  </pic:nvPicPr>
+                  <pic:blipFill>
+                    <a:blip r:embed="rId20"/>
+                    <a:stretch>
+                      <a:fillRect/>
+                    </a:stretch>
+                  </pic:blipFill>
+                  <pic:spPr>
+                    <a:xfrm>
+                      <a:off x="0" y="0"/>
+                      <a:ext cx="4220378" cy="2860383"/>
+                    </a:xfrm>
+                    <a:prstGeom prst="rect">
+                      <a:avLst/>
+                    </a:prstGeom>
+                  </pic:spPr>
+                </pic:pic>
+              </a:graphicData>
+            </a:graphic>
+          </wp:inline>
+        </w:drawing>
+      </w:r>
+    </w:p>
+    <w:p>
+      <w:pPr>
+        <w:rPr>
+          <w:rFonts w:ascii="Arial" w:hAnsi="Arial" w:cs="Arial"/>
+          <w:lang w:val="es-SV"/>
+        </w:rPr>
+      </w:pPr>
+    </w:p>
+    <w:p>
+      <w:pPr>
+        <w:rPr>
+          <w:rFonts w:ascii="Arial" w:hAnsi="Arial" w:cs="Arial"/>
+          <w:lang w:val="es-SV"/>
+        </w:rPr>
+      </w:pPr>
+    </w:p>
+    <w:p>
+      <w:pPr>
+        <w:rPr>
+          <w:rFonts w:ascii="Arial" w:hAnsi="Arial" w:cs="Arial"/>
+          <w:lang w:val="es-SV"/>
+        </w:rPr>
+      </w:pPr>
+    </w:p>
+    <w:p>
+      <w:pPr>
+        <w:rPr>
+          <w:rFonts w:ascii="Arial" w:hAnsi="Arial" w:cs="Arial"/>
+          <w:lang w:val="es-SV"/>
+        </w:rPr>
+      </w:pPr>
+    </w:p>
+    <w:p>
+      <w:pPr>
+        <w:pStyle w:val="Ttulo1"/>
+        <w:spacing w:line="360" w:lineRule="auto"/>
+        <w:rPr>
+          <w:rFonts w:ascii="Arial" w:hAnsi="Arial" w:cs="Arial"/>
+          <w:b/>
+          <w:bCs/>
+          <w:color w:val="auto"/>
+          <w:sz w:val="24"/>
+          <w:szCs w:val="24"/>
+          <w:lang w:val="es-SV"/>
+        </w:rPr>
+      </w:pPr>
+      <w:bookmarkStart w:id="14" w:name="_Toc230111121"/>
+      <w:r>
+        <w:rPr>
+          <w:rFonts w:ascii="Arial" w:hAnsi="Arial" w:cs="Arial"/>
+          <w:b/>
+          <w:bCs/>
+          <w:color w:val="auto"/>
+          <w:sz w:val="24"/>
+          <w:szCs w:val="24"/>
+          <w:lang w:val="es-SV"/>
+        </w:rPr>
+        <w:t xml:space="preserve">Repositorio de </w:t>
+      </w:r>
+      <w:proofErr w:type="spellStart"/>
+      <w:r>
+        <w:rPr>
+          <w:rFonts w:ascii="Arial" w:hAnsi="Arial" w:cs="Arial"/>
+          <w:b/>
+          <w:bCs/>
+          <w:color w:val="auto"/>
+          <w:sz w:val="24"/>
+          <w:szCs w:val="24"/>
+          <w:lang w:val="es-SV"/>
+        </w:rPr>
+        <w:t>Github</w:t>
+      </w:r>
+      <w:bookmarkEnd w:id="14"/>
+      <w:proofErr w:type="spellEnd"/>
+    </w:p>
+    <w:p>
+      <w:pPr>
+        <w:jc w:val="center"/>
+        <w:rPr>
+          <w:rFonts w:ascii="Arial" w:hAnsi="Arial" w:cs="Arial"/>
+          <w:lang w:val="es-ES"/>
+        </w:rPr>
+      </w:pPr>
+      <w:hyperlink r:id="rId21" w:history="1">
         <w:r>
           <w:rPr>
             <w:rStyle w:val="Hipervnculo"/>
@@ -6386,8 +8994,8 @@
       </w:pPr>
     </w:p>
     <w:sectPr>
-      <w:headerReference w:type="default" r:id="rId12"/>
-      <w:headerReference w:type="first" r:id="rId13"/>
+      <w:headerReference w:type="default" r:id="rId22"/>
+      <w:headerReference w:type="first" r:id="rId23"/>
       <w:pgSz w:w="12240" w:h="15840"/>
       <w:pgMar w:top="1440" w:right="1440" w:bottom="1440" w:left="1440" w:header="720" w:footer="720" w:gutter="0"/>
       <w:pgNumType w:start="1"/>
@@ -6475,7 +9083,6 @@
         <w:docPartUnique/>
       </w:docPartObj>
     </w:sdtPr>
-    <w:sdtEndPr/>
     <w:sdtContent>
       <w:p>
         <w:pPr>
@@ -6522,7 +9129,6 @@
         <w:docPartUnique/>
       </w:docPartObj>
     </w:sdtPr>
-    <w:sdtEndPr/>
     <w:sdtContent>
       <w:p>
         <w:pPr>

</xml_diff>

<commit_message>
Update EPRO_Entrega4_Grupo9_Plataforma de gestión documental con versiones.docx
</commit_message>
<xml_diff>
--- a/docs/entrega4/EPRO_Entrega4_Grupo9_Plataforma de gestión documental con versiones.docx
+++ b/docs/entrega4/EPRO_Entrega4_Grupo9_Plataforma de gestión documental con versiones.docx
@@ -1213,7 +1213,7 @@
             </w:rPr>
             <w:fldChar w:fldCharType="separate"/>
           </w:r>
-          <w:hyperlink w:anchor="_Toc230111116" w:history="1">
+          <w:hyperlink w:anchor="_Toc230112261" w:history="1">
             <w:r>
               <w:rPr>
                 <w:rStyle w:val="Hipervnculo"/>
@@ -1243,7 +1243,7 @@
                 <w:noProof/>
                 <w:webHidden/>
               </w:rPr>
-              <w:instrText xml:space="preserve"> PAGEREF _Toc230111116 \h </w:instrText>
+              <w:instrText xml:space="preserve"> PAGEREF _Toc230112261 \h </w:instrText>
             </w:r>
             <w:r>
               <w:rPr>
@@ -1290,7 +1290,7 @@
               <w14:ligatures w14:val="standardContextual"/>
             </w:rPr>
           </w:pPr>
-          <w:hyperlink w:anchor="_Toc230111117" w:history="1">
+          <w:hyperlink w:anchor="_Toc230112262" w:history="1">
             <w:r>
               <w:rPr>
                 <w:rStyle w:val="Hipervnculo"/>
@@ -1318,7 +1318,7 @@
                 <w:noProof/>
                 <w:webHidden/>
               </w:rPr>
-              <w:instrText xml:space="preserve"> PAGEREF _Toc230111117 \h </w:instrText>
+              <w:instrText xml:space="preserve"> PAGEREF _Toc230112262 \h </w:instrText>
             </w:r>
             <w:r>
               <w:rPr>
@@ -1365,7 +1365,7 @@
               <w14:ligatures w14:val="standardContextual"/>
             </w:rPr>
           </w:pPr>
-          <w:hyperlink w:anchor="_Toc230111118" w:history="1">
+          <w:hyperlink w:anchor="_Toc230112263" w:history="1">
             <w:r>
               <w:rPr>
                 <w:rStyle w:val="Hipervnculo"/>
@@ -1393,7 +1393,7 @@
                 <w:noProof/>
                 <w:webHidden/>
               </w:rPr>
-              <w:instrText xml:space="preserve"> PAGEREF _Toc230111118 \h </w:instrText>
+              <w:instrText xml:space="preserve"> PAGEREF _Toc230112263 \h </w:instrText>
             </w:r>
             <w:r>
               <w:rPr>
@@ -1440,7 +1440,7 @@
               <w14:ligatures w14:val="standardContextual"/>
             </w:rPr>
           </w:pPr>
-          <w:hyperlink w:anchor="_Toc230111119" w:history="1">
+          <w:hyperlink w:anchor="_Toc230112264" w:history="1">
             <w:r>
               <w:rPr>
                 <w:rStyle w:val="Hipervnculo"/>
@@ -1470,7 +1470,7 @@
                 <w:noProof/>
                 <w:webHidden/>
               </w:rPr>
-              <w:instrText xml:space="preserve"> PAGEREF _Toc230111119 \h </w:instrText>
+              <w:instrText xml:space="preserve"> PAGEREF _Toc230112264 \h </w:instrText>
             </w:r>
             <w:r>
               <w:rPr>
@@ -1517,7 +1517,7 @@
               <w14:ligatures w14:val="standardContextual"/>
             </w:rPr>
           </w:pPr>
-          <w:hyperlink w:anchor="_Toc230111120" w:history="1">
+          <w:hyperlink w:anchor="_Toc230112265" w:history="1">
             <w:r>
               <w:rPr>
                 <w:rStyle w:val="Hipervnculo"/>
@@ -1545,7 +1545,7 @@
                 <w:noProof/>
                 <w:webHidden/>
               </w:rPr>
-              <w:instrText xml:space="preserve"> PAGEREF _Toc230111120 \h </w:instrText>
+              <w:instrText xml:space="preserve"> PAGEREF _Toc230112265 \h </w:instrText>
             </w:r>
             <w:r>
               <w:rPr>
@@ -1592,7 +1592,7 @@
               <w14:ligatures w14:val="standardContextual"/>
             </w:rPr>
           </w:pPr>
-          <w:hyperlink w:anchor="_Toc230111121" w:history="1">
+          <w:hyperlink w:anchor="_Toc230112266" w:history="1">
             <w:r>
               <w:rPr>
                 <w:rStyle w:val="Hipervnculo"/>
@@ -1601,7 +1601,7 @@
                 <w:bCs/>
                 <w:noProof/>
               </w:rPr>
-              <w:t>Repositorio de Github</w:t>
+              <w:t>Registro de Defectos</w:t>
             </w:r>
             <w:r>
               <w:rPr>
@@ -1622,7 +1622,7 @@
                 <w:noProof/>
                 <w:webHidden/>
               </w:rPr>
-              <w:instrText xml:space="preserve"> PAGEREF _Toc230111121 \h </w:instrText>
+              <w:instrText xml:space="preserve"> PAGEREF _Toc230112266 \h </w:instrText>
             </w:r>
             <w:r>
               <w:rPr>
@@ -1655,6 +1655,458 @@
         </w:p>
         <w:p>
           <w:pPr>
+            <w:pStyle w:val="TDC2"/>
+            <w:tabs>
+              <w:tab w:val="right" w:leader="dot" w:pos="9350"/>
+            </w:tabs>
+            <w:rPr>
+              <w:rFonts w:cstheme="minorBidi"/>
+              <w:noProof/>
+              <w:kern w:val="2"/>
+              <w:sz w:val="24"/>
+              <w:szCs w:val="24"/>
+              <w:lang w:eastAsia="es-SV"/>
+              <w14:ligatures w14:val="standardContextual"/>
+            </w:rPr>
+          </w:pPr>
+          <w:hyperlink w:anchor="_Toc230112267" w:history="1">
+            <w:r>
+              <w:rPr>
+                <w:rStyle w:val="Hipervnculo"/>
+                <w:rFonts w:ascii="Arial" w:hAnsi="Arial" w:cs="Arial"/>
+                <w:noProof/>
+              </w:rPr>
+              <w:t>Registro de Defecto 1</w:t>
+            </w:r>
+            <w:r>
+              <w:rPr>
+                <w:noProof/>
+                <w:webHidden/>
+              </w:rPr>
+              <w:tab/>
+            </w:r>
+            <w:r>
+              <w:rPr>
+                <w:noProof/>
+                <w:webHidden/>
+              </w:rPr>
+              <w:fldChar w:fldCharType="begin"/>
+            </w:r>
+            <w:r>
+              <w:rPr>
+                <w:noProof/>
+                <w:webHidden/>
+              </w:rPr>
+              <w:instrText xml:space="preserve"> PAGEREF _Toc230112267 \h </w:instrText>
+            </w:r>
+            <w:r>
+              <w:rPr>
+                <w:noProof/>
+                <w:webHidden/>
+              </w:rPr>
+            </w:r>
+            <w:r>
+              <w:rPr>
+                <w:noProof/>
+                <w:webHidden/>
+              </w:rPr>
+              <w:fldChar w:fldCharType="separate"/>
+            </w:r>
+            <w:r>
+              <w:rPr>
+                <w:noProof/>
+                <w:webHidden/>
+              </w:rPr>
+              <w:t>17</w:t>
+            </w:r>
+            <w:r>
+              <w:rPr>
+                <w:noProof/>
+                <w:webHidden/>
+              </w:rPr>
+              <w:fldChar w:fldCharType="end"/>
+            </w:r>
+          </w:hyperlink>
+        </w:p>
+        <w:p>
+          <w:pPr>
+            <w:pStyle w:val="TDC2"/>
+            <w:tabs>
+              <w:tab w:val="right" w:leader="dot" w:pos="9350"/>
+            </w:tabs>
+            <w:rPr>
+              <w:rFonts w:cstheme="minorBidi"/>
+              <w:noProof/>
+              <w:kern w:val="2"/>
+              <w:sz w:val="24"/>
+              <w:szCs w:val="24"/>
+              <w:lang w:eastAsia="es-SV"/>
+              <w14:ligatures w14:val="standardContextual"/>
+            </w:rPr>
+          </w:pPr>
+          <w:hyperlink w:anchor="_Toc230112268" w:history="1">
+            <w:r>
+              <w:rPr>
+                <w:rStyle w:val="Hipervnculo"/>
+                <w:rFonts w:ascii="Arial" w:hAnsi="Arial" w:cs="Arial"/>
+                <w:noProof/>
+              </w:rPr>
+              <w:t>Registro de Defecto 2</w:t>
+            </w:r>
+            <w:r>
+              <w:rPr>
+                <w:noProof/>
+                <w:webHidden/>
+              </w:rPr>
+              <w:tab/>
+            </w:r>
+            <w:r>
+              <w:rPr>
+                <w:noProof/>
+                <w:webHidden/>
+              </w:rPr>
+              <w:fldChar w:fldCharType="begin"/>
+            </w:r>
+            <w:r>
+              <w:rPr>
+                <w:noProof/>
+                <w:webHidden/>
+              </w:rPr>
+              <w:instrText xml:space="preserve"> PAGEREF _Toc230112268 \h </w:instrText>
+            </w:r>
+            <w:r>
+              <w:rPr>
+                <w:noProof/>
+                <w:webHidden/>
+              </w:rPr>
+            </w:r>
+            <w:r>
+              <w:rPr>
+                <w:noProof/>
+                <w:webHidden/>
+              </w:rPr>
+              <w:fldChar w:fldCharType="separate"/>
+            </w:r>
+            <w:r>
+              <w:rPr>
+                <w:noProof/>
+                <w:webHidden/>
+              </w:rPr>
+              <w:t>18</w:t>
+            </w:r>
+            <w:r>
+              <w:rPr>
+                <w:noProof/>
+                <w:webHidden/>
+              </w:rPr>
+              <w:fldChar w:fldCharType="end"/>
+            </w:r>
+          </w:hyperlink>
+        </w:p>
+        <w:p>
+          <w:pPr>
+            <w:pStyle w:val="TDC2"/>
+            <w:tabs>
+              <w:tab w:val="right" w:leader="dot" w:pos="9350"/>
+            </w:tabs>
+            <w:rPr>
+              <w:rFonts w:cstheme="minorBidi"/>
+              <w:noProof/>
+              <w:kern w:val="2"/>
+              <w:sz w:val="24"/>
+              <w:szCs w:val="24"/>
+              <w:lang w:eastAsia="es-SV"/>
+              <w14:ligatures w14:val="standardContextual"/>
+            </w:rPr>
+          </w:pPr>
+          <w:hyperlink w:anchor="_Toc230112269" w:history="1">
+            <w:r>
+              <w:rPr>
+                <w:rStyle w:val="Hipervnculo"/>
+                <w:rFonts w:ascii="Arial" w:hAnsi="Arial" w:cs="Arial"/>
+                <w:noProof/>
+              </w:rPr>
+              <w:t>Registro de Defecto 3</w:t>
+            </w:r>
+            <w:r>
+              <w:rPr>
+                <w:noProof/>
+                <w:webHidden/>
+              </w:rPr>
+              <w:tab/>
+            </w:r>
+            <w:r>
+              <w:rPr>
+                <w:noProof/>
+                <w:webHidden/>
+              </w:rPr>
+              <w:fldChar w:fldCharType="begin"/>
+            </w:r>
+            <w:r>
+              <w:rPr>
+                <w:noProof/>
+                <w:webHidden/>
+              </w:rPr>
+              <w:instrText xml:space="preserve"> PAGEREF _Toc230112269 \h </w:instrText>
+            </w:r>
+            <w:r>
+              <w:rPr>
+                <w:noProof/>
+                <w:webHidden/>
+              </w:rPr>
+            </w:r>
+            <w:r>
+              <w:rPr>
+                <w:noProof/>
+                <w:webHidden/>
+              </w:rPr>
+              <w:fldChar w:fldCharType="separate"/>
+            </w:r>
+            <w:r>
+              <w:rPr>
+                <w:noProof/>
+                <w:webHidden/>
+              </w:rPr>
+              <w:t>19</w:t>
+            </w:r>
+            <w:r>
+              <w:rPr>
+                <w:noProof/>
+                <w:webHidden/>
+              </w:rPr>
+              <w:fldChar w:fldCharType="end"/>
+            </w:r>
+          </w:hyperlink>
+        </w:p>
+        <w:p>
+          <w:pPr>
+            <w:pStyle w:val="TDC2"/>
+            <w:tabs>
+              <w:tab w:val="right" w:leader="dot" w:pos="9350"/>
+            </w:tabs>
+            <w:rPr>
+              <w:rFonts w:cstheme="minorBidi"/>
+              <w:noProof/>
+              <w:kern w:val="2"/>
+              <w:sz w:val="24"/>
+              <w:szCs w:val="24"/>
+              <w:lang w:eastAsia="es-SV"/>
+              <w14:ligatures w14:val="standardContextual"/>
+            </w:rPr>
+          </w:pPr>
+          <w:hyperlink w:anchor="_Toc230112270" w:history="1">
+            <w:r>
+              <w:rPr>
+                <w:rStyle w:val="Hipervnculo"/>
+                <w:rFonts w:ascii="Arial" w:hAnsi="Arial" w:cs="Arial"/>
+                <w:noProof/>
+              </w:rPr>
+              <w:t>Registro de Defecto 4</w:t>
+            </w:r>
+            <w:r>
+              <w:rPr>
+                <w:noProof/>
+                <w:webHidden/>
+              </w:rPr>
+              <w:tab/>
+            </w:r>
+            <w:r>
+              <w:rPr>
+                <w:noProof/>
+                <w:webHidden/>
+              </w:rPr>
+              <w:fldChar w:fldCharType="begin"/>
+            </w:r>
+            <w:r>
+              <w:rPr>
+                <w:noProof/>
+                <w:webHidden/>
+              </w:rPr>
+              <w:instrText xml:space="preserve"> PAGEREF _Toc230112270 \h </w:instrText>
+            </w:r>
+            <w:r>
+              <w:rPr>
+                <w:noProof/>
+                <w:webHidden/>
+              </w:rPr>
+            </w:r>
+            <w:r>
+              <w:rPr>
+                <w:noProof/>
+                <w:webHidden/>
+              </w:rPr>
+              <w:fldChar w:fldCharType="separate"/>
+            </w:r>
+            <w:r>
+              <w:rPr>
+                <w:noProof/>
+                <w:webHidden/>
+              </w:rPr>
+              <w:t>20</w:t>
+            </w:r>
+            <w:r>
+              <w:rPr>
+                <w:noProof/>
+                <w:webHidden/>
+              </w:rPr>
+              <w:fldChar w:fldCharType="end"/>
+            </w:r>
+          </w:hyperlink>
+        </w:p>
+        <w:p>
+          <w:pPr>
+            <w:pStyle w:val="TDC2"/>
+            <w:tabs>
+              <w:tab w:val="right" w:leader="dot" w:pos="9350"/>
+            </w:tabs>
+            <w:rPr>
+              <w:rFonts w:cstheme="minorBidi"/>
+              <w:noProof/>
+              <w:kern w:val="2"/>
+              <w:sz w:val="24"/>
+              <w:szCs w:val="24"/>
+              <w:lang w:eastAsia="es-SV"/>
+              <w14:ligatures w14:val="standardContextual"/>
+            </w:rPr>
+          </w:pPr>
+          <w:hyperlink w:anchor="_Toc230112271" w:history="1">
+            <w:r>
+              <w:rPr>
+                <w:rStyle w:val="Hipervnculo"/>
+                <w:rFonts w:ascii="Arial" w:hAnsi="Arial" w:cs="Arial"/>
+                <w:noProof/>
+              </w:rPr>
+              <w:t>Registro de Defecto 5</w:t>
+            </w:r>
+            <w:r>
+              <w:rPr>
+                <w:noProof/>
+                <w:webHidden/>
+              </w:rPr>
+              <w:tab/>
+            </w:r>
+            <w:r>
+              <w:rPr>
+                <w:noProof/>
+                <w:webHidden/>
+              </w:rPr>
+              <w:fldChar w:fldCharType="begin"/>
+            </w:r>
+            <w:r>
+              <w:rPr>
+                <w:noProof/>
+                <w:webHidden/>
+              </w:rPr>
+              <w:instrText xml:space="preserve"> PAGEREF _Toc230112271 \h </w:instrText>
+            </w:r>
+            <w:r>
+              <w:rPr>
+                <w:noProof/>
+                <w:webHidden/>
+              </w:rPr>
+            </w:r>
+            <w:r>
+              <w:rPr>
+                <w:noProof/>
+                <w:webHidden/>
+              </w:rPr>
+              <w:fldChar w:fldCharType="separate"/>
+            </w:r>
+            <w:r>
+              <w:rPr>
+                <w:noProof/>
+                <w:webHidden/>
+              </w:rPr>
+              <w:t>22</w:t>
+            </w:r>
+            <w:r>
+              <w:rPr>
+                <w:noProof/>
+                <w:webHidden/>
+              </w:rPr>
+              <w:fldChar w:fldCharType="end"/>
+            </w:r>
+          </w:hyperlink>
+        </w:p>
+        <w:p>
+          <w:pPr>
+            <w:pStyle w:val="TDC1"/>
+            <w:tabs>
+              <w:tab w:val="right" w:leader="dot" w:pos="9350"/>
+            </w:tabs>
+            <w:rPr>
+              <w:rFonts w:cstheme="minorBidi"/>
+              <w:noProof/>
+              <w:kern w:val="2"/>
+              <w:sz w:val="24"/>
+              <w:szCs w:val="24"/>
+              <w:lang w:eastAsia="es-SV"/>
+              <w14:ligatures w14:val="standardContextual"/>
+            </w:rPr>
+          </w:pPr>
+          <w:hyperlink w:anchor="_Toc230112272" w:history="1">
+            <w:r>
+              <w:rPr>
+                <w:rStyle w:val="Hipervnculo"/>
+                <w:rFonts w:ascii="Arial" w:hAnsi="Arial" w:cs="Arial"/>
+                <w:b/>
+                <w:bCs/>
+                <w:noProof/>
+              </w:rPr>
+              <w:t>Repositorio de Github</w:t>
+            </w:r>
+            <w:r>
+              <w:rPr>
+                <w:noProof/>
+                <w:webHidden/>
+              </w:rPr>
+              <w:tab/>
+            </w:r>
+            <w:r>
+              <w:rPr>
+                <w:noProof/>
+                <w:webHidden/>
+              </w:rPr>
+              <w:fldChar w:fldCharType="begin"/>
+            </w:r>
+            <w:r>
+              <w:rPr>
+                <w:noProof/>
+                <w:webHidden/>
+              </w:rPr>
+              <w:instrText xml:space="preserve"> PAGEREF _Toc230112272 \h </w:instrText>
+            </w:r>
+            <w:r>
+              <w:rPr>
+                <w:noProof/>
+                <w:webHidden/>
+              </w:rPr>
+            </w:r>
+            <w:r>
+              <w:rPr>
+                <w:noProof/>
+                <w:webHidden/>
+              </w:rPr>
+              <w:fldChar w:fldCharType="separate"/>
+            </w:r>
+            <w:r>
+              <w:rPr>
+                <w:noProof/>
+                <w:webHidden/>
+              </w:rPr>
+              <w:t>24</w:t>
+            </w:r>
+            <w:r>
+              <w:rPr>
+                <w:noProof/>
+                <w:webHidden/>
+              </w:rPr>
+              <w:fldChar w:fldCharType="end"/>
+            </w:r>
+          </w:hyperlink>
+        </w:p>
+        <w:p>
+          <w:pPr>
             <w:rPr>
               <w:rFonts w:ascii="Arial" w:hAnsi="Arial" w:cs="Arial"/>
             </w:rPr>
@@ -1744,7 +2196,7 @@
           <w:lang w:val="es-SV"/>
         </w:rPr>
       </w:pPr>
-      <w:bookmarkStart w:id="1" w:name="_Toc230111116"/>
+      <w:bookmarkStart w:id="1" w:name="_Toc230112261"/>
       <w:r>
         <w:rPr>
           <w:rFonts w:ascii="Arial" w:hAnsi="Arial" w:cs="Arial"/>
@@ -1771,7 +2223,7 @@
           <w:lang w:val="es-SV"/>
         </w:rPr>
       </w:pPr>
-      <w:bookmarkStart w:id="2" w:name="_Toc230111117"/>
+      <w:bookmarkStart w:id="2" w:name="_Toc230112262"/>
       <w:r>
         <w:rPr>
           <w:rFonts w:ascii="Arial" w:hAnsi="Arial" w:cs="Arial"/>
@@ -2990,7 +3442,7 @@
           <w:lang w:val="es-SV"/>
         </w:rPr>
       </w:pPr>
-      <w:bookmarkStart w:id="3" w:name="_Toc230111118"/>
+      <w:bookmarkStart w:id="3" w:name="_Toc230112263"/>
       <w:r>
         <w:rPr>
           <w:rFonts w:ascii="Arial" w:hAnsi="Arial" w:cs="Arial"/>
@@ -4532,7 +4984,7 @@
         </w:rPr>
       </w:pPr>
       <w:bookmarkStart w:id="4" w:name="_Toc229775093"/>
-      <w:bookmarkStart w:id="5" w:name="_Toc230111119"/>
+      <w:bookmarkStart w:id="5" w:name="_Toc230112264"/>
       <w:r>
         <w:rPr>
           <w:rFonts w:ascii="Arial" w:hAnsi="Arial" w:cs="Arial"/>
@@ -4785,7 +5237,7 @@
         </w:rPr>
       </w:pPr>
       <w:bookmarkStart w:id="6" w:name="_Toc229775094"/>
-      <w:bookmarkStart w:id="7" w:name="_Toc230111120"/>
+      <w:bookmarkStart w:id="7" w:name="_Toc230112265"/>
       <w:r>
         <w:rPr>
           <w:rFonts w:ascii="Arial" w:hAnsi="Arial" w:cs="Arial"/>
@@ -6692,6 +7144,7 @@
         </w:rPr>
       </w:pPr>
       <w:bookmarkStart w:id="8" w:name="_Toc229775098"/>
+      <w:bookmarkStart w:id="9" w:name="_Toc230112266"/>
       <w:r>
         <w:rPr>
           <w:rFonts w:ascii="Arial" w:hAnsi="Arial" w:cs="Arial"/>
@@ -6705,6 +7158,7 @@
         <w:t>Registro de Defectos</w:t>
       </w:r>
       <w:bookmarkEnd w:id="8"/>
+      <w:bookmarkEnd w:id="9"/>
     </w:p>
     <w:p>
       <w:pPr>
@@ -6740,7 +7194,8 @@
           <w:lang w:val="es-SV"/>
         </w:rPr>
       </w:pPr>
-      <w:bookmarkStart w:id="9" w:name="_Toc229775099"/>
+      <w:bookmarkStart w:id="10" w:name="_Toc229775099"/>
+      <w:bookmarkStart w:id="11" w:name="_Toc230112267"/>
       <w:r>
         <w:rPr>
           <w:rFonts w:ascii="Arial" w:hAnsi="Arial" w:cs="Arial"/>
@@ -6751,7 +7206,8 @@
         </w:rPr>
         <w:t>Registro de Defecto 1</w:t>
       </w:r>
-      <w:bookmarkEnd w:id="9"/>
+      <w:bookmarkEnd w:id="10"/>
+      <w:bookmarkEnd w:id="11"/>
     </w:p>
     <w:p>
       <w:pPr>
@@ -7163,7 +7619,8 @@
           <w:lang w:val="es-SV"/>
         </w:rPr>
       </w:pPr>
-      <w:bookmarkStart w:id="10" w:name="_Toc229775100"/>
+      <w:bookmarkStart w:id="12" w:name="_Toc229775100"/>
+      <w:bookmarkStart w:id="13" w:name="_Toc230112268"/>
       <w:r>
         <w:rPr>
           <w:rFonts w:ascii="Arial" w:hAnsi="Arial" w:cs="Arial"/>
@@ -7174,7 +7631,8 @@
         </w:rPr>
         <w:t>Registro de Defecto 2</w:t>
       </w:r>
-      <w:bookmarkEnd w:id="10"/>
+      <w:bookmarkEnd w:id="12"/>
+      <w:bookmarkEnd w:id="13"/>
     </w:p>
     <w:p>
       <w:pPr>
@@ -7486,7 +7944,8 @@
           <w:lang w:val="es-SV"/>
         </w:rPr>
       </w:pPr>
-      <w:bookmarkStart w:id="11" w:name="_Toc229775101"/>
+      <w:bookmarkStart w:id="14" w:name="_Toc229775101"/>
+      <w:bookmarkStart w:id="15" w:name="_Toc230112269"/>
       <w:r>
         <w:rPr>
           <w:rFonts w:ascii="Arial" w:hAnsi="Arial" w:cs="Arial"/>
@@ -7497,7 +7956,8 @@
         </w:rPr>
         <w:t>Registro de Defecto 3</w:t>
       </w:r>
-      <w:bookmarkEnd w:id="11"/>
+      <w:bookmarkEnd w:id="14"/>
+      <w:bookmarkEnd w:id="15"/>
     </w:p>
     <w:p>
       <w:pPr>
@@ -7849,7 +8309,8 @@
           <w:lang w:val="es-SV"/>
         </w:rPr>
       </w:pPr>
-      <w:bookmarkStart w:id="12" w:name="_Toc229775102"/>
+      <w:bookmarkStart w:id="16" w:name="_Toc229775102"/>
+      <w:bookmarkStart w:id="17" w:name="_Toc230112270"/>
       <w:r>
         <w:rPr>
           <w:rFonts w:ascii="Arial" w:hAnsi="Arial" w:cs="Arial"/>
@@ -7860,7 +8321,8 @@
         </w:rPr>
         <w:t>Registro de Defecto 4</w:t>
       </w:r>
-      <w:bookmarkEnd w:id="12"/>
+      <w:bookmarkEnd w:id="16"/>
+      <w:bookmarkEnd w:id="17"/>
     </w:p>
     <w:p>
       <w:pPr>
@@ -8241,7 +8703,8 @@
           <w:lang w:val="es-SV"/>
         </w:rPr>
       </w:pPr>
-      <w:bookmarkStart w:id="13" w:name="_Toc229775103"/>
+      <w:bookmarkStart w:id="18" w:name="_Toc229775103"/>
+      <w:bookmarkStart w:id="19" w:name="_Toc230112271"/>
       <w:r>
         <w:rPr>
           <w:rFonts w:ascii="Arial" w:hAnsi="Arial" w:cs="Arial"/>
@@ -8252,7 +8715,8 @@
         </w:rPr>
         <w:t>Registro de Defecto 5</w:t>
       </w:r>
-      <w:bookmarkEnd w:id="13"/>
+      <w:bookmarkEnd w:id="18"/>
+      <w:bookmarkEnd w:id="19"/>
     </w:p>
     <w:p>
       <w:pPr>
@@ -8840,7 +9304,7 @@
           <w:lang w:val="es-SV"/>
         </w:rPr>
       </w:pPr>
-      <w:bookmarkStart w:id="14" w:name="_Toc230111121"/>
+      <w:bookmarkStart w:id="20" w:name="_Toc230112272"/>
       <w:r>
         <w:rPr>
           <w:rFonts w:ascii="Arial" w:hAnsi="Arial" w:cs="Arial"/>
@@ -8866,7 +9330,7 @@
         </w:rPr>
         <w:t>Github</w:t>
       </w:r>
-      <w:bookmarkEnd w:id="14"/>
+      <w:bookmarkEnd w:id="20"/>
       <w:proofErr w:type="spellEnd"/>
     </w:p>
     <w:p>

</xml_diff>

<commit_message>
Docs: Formato del cocumento
Corregí el formato
</commit_message>
<xml_diff>
--- a/docs/entrega4/EPRO_Entrega4_Grupo9_Plataforma de gestión documental con versiones.docx
+++ b/docs/entrega4/EPRO_Entrega4_Grupo9_Plataforma de gestión documental con versiones.docx
@@ -1055,7 +1055,16 @@
                 <w:szCs w:val="24"/>
                 <w:lang w:val="es-SV"/>
               </w:rPr>
-              <w:t xml:space="preserve">20 de </w:t>
+              <w:t xml:space="preserve">23 </w:t>
+            </w:r>
+            <w:r>
+              <w:rPr>
+                <w:rFonts w:ascii="Arial" w:eastAsia="Calibri" w:hAnsi="Arial" w:cs="Arial"/>
+                <w:sz w:val="24"/>
+                <w:szCs w:val="24"/>
+                <w:lang w:val="es-SV"/>
+              </w:rPr>
+              <w:t xml:space="preserve">de </w:t>
             </w:r>
             <w:proofErr w:type="gramStart"/>
             <w:r>
@@ -1167,7 +1176,7 @@
       <w:sdtContent>
         <w:p>
           <w:pPr>
-            <w:pStyle w:val="TOCHeading"/>
+            <w:pStyle w:val="TtuloTDC"/>
             <w:rPr>
               <w:rFonts w:cs="Arial"/>
             </w:rPr>
@@ -1181,7 +1190,7 @@
         </w:p>
         <w:p>
           <w:pPr>
-            <w:pStyle w:val="TOC1"/>
+            <w:pStyle w:val="TDC1"/>
             <w:tabs>
               <w:tab w:val="right" w:leader="dot" w:pos="9350"/>
             </w:tabs>
@@ -1191,7 +1200,7 @@
               <w:kern w:val="2"/>
               <w:sz w:val="24"/>
               <w:szCs w:val="24"/>
-              <w:lang w:val="es-ES" w:eastAsia="es-ES"/>
+              <w:lang w:eastAsia="es-SV"/>
               <w14:ligatures w14:val="standardContextual"/>
             </w:rPr>
           </w:pPr>
@@ -1213,10 +1222,10 @@
             </w:rPr>
             <w:fldChar w:fldCharType="separate"/>
           </w:r>
-          <w:hyperlink w:anchor="_Toc230280253" w:history="1">
-            <w:r>
-              <w:rPr>
-                <w:rStyle w:val="Hyperlink"/>
+          <w:hyperlink w:anchor="_Toc230370778" w:history="1">
+            <w:r>
+              <w:rPr>
+                <w:rStyle w:val="Hipervnculo"/>
                 <w:rFonts w:ascii="Arial" w:hAnsi="Arial" w:cs="Arial"/>
                 <w:b/>
                 <w:bCs/>
@@ -1243,7 +1252,7 @@
                 <w:noProof/>
                 <w:webHidden/>
               </w:rPr>
-              <w:instrText xml:space="preserve"> PAGEREF _Toc230280253 \h </w:instrText>
+              <w:instrText xml:space="preserve"> PAGEREF _Toc230370778 \h </w:instrText>
             </w:r>
             <w:r>
               <w:rPr>
@@ -1276,7 +1285,7 @@
         </w:p>
         <w:p>
           <w:pPr>
-            <w:pStyle w:val="TOC2"/>
+            <w:pStyle w:val="TDC2"/>
             <w:tabs>
               <w:tab w:val="right" w:leader="dot" w:pos="9350"/>
             </w:tabs>
@@ -1286,14 +1295,14 @@
               <w:kern w:val="2"/>
               <w:sz w:val="24"/>
               <w:szCs w:val="24"/>
-              <w:lang w:val="es-ES" w:eastAsia="es-ES"/>
+              <w:lang w:eastAsia="es-SV"/>
               <w14:ligatures w14:val="standardContextual"/>
             </w:rPr>
           </w:pPr>
-          <w:hyperlink w:anchor="_Toc230280254" w:history="1">
-            <w:r>
-              <w:rPr>
-                <w:rStyle w:val="Hyperlink"/>
+          <w:hyperlink w:anchor="_Toc230370779" w:history="1">
+            <w:r>
+              <w:rPr>
+                <w:rStyle w:val="Hipervnculo"/>
                 <w:rFonts w:ascii="Arial" w:hAnsi="Arial" w:cs="Arial"/>
                 <w:noProof/>
               </w:rPr>
@@ -1318,7 +1327,7 @@
                 <w:noProof/>
                 <w:webHidden/>
               </w:rPr>
-              <w:instrText xml:space="preserve"> PAGEREF _Toc230280254 \h </w:instrText>
+              <w:instrText xml:space="preserve"> PAGEREF _Toc230370779 \h </w:instrText>
             </w:r>
             <w:r>
               <w:rPr>
@@ -1351,7 +1360,7 @@
         </w:p>
         <w:p>
           <w:pPr>
-            <w:pStyle w:val="TOC2"/>
+            <w:pStyle w:val="TDC2"/>
             <w:tabs>
               <w:tab w:val="right" w:leader="dot" w:pos="9350"/>
             </w:tabs>
@@ -1361,14 +1370,14 @@
               <w:kern w:val="2"/>
               <w:sz w:val="24"/>
               <w:szCs w:val="24"/>
-              <w:lang w:val="es-ES" w:eastAsia="es-ES"/>
+              <w:lang w:eastAsia="es-SV"/>
               <w14:ligatures w14:val="standardContextual"/>
             </w:rPr>
           </w:pPr>
-          <w:hyperlink w:anchor="_Toc230280255" w:history="1">
-            <w:r>
-              <w:rPr>
-                <w:rStyle w:val="Hyperlink"/>
+          <w:hyperlink w:anchor="_Toc230370780" w:history="1">
+            <w:r>
+              <w:rPr>
+                <w:rStyle w:val="Hipervnculo"/>
                 <w:rFonts w:ascii="Arial" w:hAnsi="Arial" w:cs="Arial"/>
                 <w:noProof/>
               </w:rPr>
@@ -1393,7 +1402,7 @@
                 <w:noProof/>
                 <w:webHidden/>
               </w:rPr>
-              <w:instrText xml:space="preserve"> PAGEREF _Toc230280255 \h </w:instrText>
+              <w:instrText xml:space="preserve"> PAGEREF _Toc230370780 \h </w:instrText>
             </w:r>
             <w:r>
               <w:rPr>
@@ -1426,7 +1435,7 @@
         </w:p>
         <w:p>
           <w:pPr>
-            <w:pStyle w:val="TOC2"/>
+            <w:pStyle w:val="TDC2"/>
             <w:tabs>
               <w:tab w:val="right" w:leader="dot" w:pos="9350"/>
             </w:tabs>
@@ -1436,14 +1445,14 @@
               <w:kern w:val="2"/>
               <w:sz w:val="24"/>
               <w:szCs w:val="24"/>
-              <w:lang w:val="es-ES" w:eastAsia="es-ES"/>
+              <w:lang w:eastAsia="es-SV"/>
               <w14:ligatures w14:val="standardContextual"/>
             </w:rPr>
           </w:pPr>
-          <w:hyperlink w:anchor="_Toc230280256" w:history="1">
-            <w:r>
-              <w:rPr>
-                <w:rStyle w:val="Hyperlink"/>
+          <w:hyperlink w:anchor="_Toc230370781" w:history="1">
+            <w:r>
+              <w:rPr>
+                <w:rStyle w:val="Hipervnculo"/>
                 <w:rFonts w:ascii="Arial" w:hAnsi="Arial" w:cs="Arial"/>
                 <w:b/>
                 <w:bCs/>
@@ -1470,7 +1479,7 @@
                 <w:noProof/>
                 <w:webHidden/>
               </w:rPr>
-              <w:instrText xml:space="preserve"> PAGEREF _Toc230280256 \h </w:instrText>
+              <w:instrText xml:space="preserve"> PAGEREF _Toc230370781 \h </w:instrText>
             </w:r>
             <w:r>
               <w:rPr>
@@ -1503,7 +1512,7 @@
         </w:p>
         <w:p>
           <w:pPr>
-            <w:pStyle w:val="TOC2"/>
+            <w:pStyle w:val="TDC2"/>
             <w:tabs>
               <w:tab w:val="right" w:leader="dot" w:pos="9350"/>
             </w:tabs>
@@ -1513,14 +1522,14 @@
               <w:kern w:val="2"/>
               <w:sz w:val="24"/>
               <w:szCs w:val="24"/>
-              <w:lang w:val="es-ES" w:eastAsia="es-ES"/>
+              <w:lang w:eastAsia="es-SV"/>
               <w14:ligatures w14:val="standardContextual"/>
             </w:rPr>
           </w:pPr>
-          <w:hyperlink w:anchor="_Toc230280257" w:history="1">
-            <w:r>
-              <w:rPr>
-                <w:rStyle w:val="Hyperlink"/>
+          <w:hyperlink w:anchor="_Toc230370782" w:history="1">
+            <w:r>
+              <w:rPr>
+                <w:rStyle w:val="Hipervnculo"/>
                 <w:rFonts w:ascii="Arial" w:hAnsi="Arial" w:cs="Arial"/>
                 <w:noProof/>
               </w:rPr>
@@ -1545,7 +1554,7 @@
                 <w:noProof/>
                 <w:webHidden/>
               </w:rPr>
-              <w:instrText xml:space="preserve"> PAGEREF _Toc230280257 \h </w:instrText>
+              <w:instrText xml:space="preserve"> PAGEREF _Toc230370782 \h </w:instrText>
             </w:r>
             <w:r>
               <w:rPr>
@@ -1578,7 +1587,7 @@
         </w:p>
         <w:p>
           <w:pPr>
-            <w:pStyle w:val="TOC2"/>
+            <w:pStyle w:val="TDC2"/>
             <w:tabs>
               <w:tab w:val="right" w:leader="dot" w:pos="9350"/>
             </w:tabs>
@@ -1588,15 +1597,17 @@
               <w:kern w:val="2"/>
               <w:sz w:val="24"/>
               <w:szCs w:val="24"/>
-              <w:lang w:val="es-ES" w:eastAsia="es-ES"/>
+              <w:lang w:eastAsia="es-SV"/>
               <w14:ligatures w14:val="standardContextual"/>
             </w:rPr>
           </w:pPr>
-          <w:hyperlink w:anchor="_Toc230280258" w:history="1">
-            <w:r>
-              <w:rPr>
-                <w:rStyle w:val="Hyperlink"/>
-                <w:rFonts w:ascii="Arial" w:hAnsi="Arial" w:cs="Arial"/>
+          <w:hyperlink w:anchor="_Toc230370783" w:history="1">
+            <w:r>
+              <w:rPr>
+                <w:rStyle w:val="Hipervnculo"/>
+                <w:rFonts w:ascii="Arial" w:hAnsi="Arial" w:cs="Arial"/>
+                <w:b/>
+                <w:bCs/>
                 <w:noProof/>
               </w:rPr>
               <w:t>Matriz de Pruebas</w:t>
@@ -1620,7 +1631,7 @@
                 <w:noProof/>
                 <w:webHidden/>
               </w:rPr>
-              <w:instrText xml:space="preserve"> PAGEREF _Toc230280258 \h </w:instrText>
+              <w:instrText xml:space="preserve"> PAGEREF _Toc230370783 \h </w:instrText>
             </w:r>
             <w:r>
               <w:rPr>
@@ -1653,7 +1664,7 @@
         </w:p>
         <w:p>
           <w:pPr>
-            <w:pStyle w:val="TOC3"/>
+            <w:pStyle w:val="TDC3"/>
             <w:tabs>
               <w:tab w:val="right" w:leader="dot" w:pos="9350"/>
             </w:tabs>
@@ -1663,14 +1674,14 @@
               <w:kern w:val="2"/>
               <w:sz w:val="24"/>
               <w:szCs w:val="24"/>
-              <w:lang w:val="es-ES" w:eastAsia="es-ES"/>
+              <w:lang w:eastAsia="es-SV"/>
               <w14:ligatures w14:val="standardContextual"/>
             </w:rPr>
           </w:pPr>
-          <w:hyperlink w:anchor="_Toc230280259" w:history="1">
-            <w:r>
-              <w:rPr>
-                <w:rStyle w:val="Hyperlink"/>
+          <w:hyperlink w:anchor="_Toc230370784" w:history="1">
+            <w:r>
+              <w:rPr>
+                <w:rStyle w:val="Hipervnculo"/>
                 <w:rFonts w:ascii="Arial" w:hAnsi="Arial" w:cs="Arial"/>
                 <w:noProof/>
               </w:rPr>
@@ -1695,7 +1706,7 @@
                 <w:noProof/>
                 <w:webHidden/>
               </w:rPr>
-              <w:instrText xml:space="preserve"> PAGEREF _Toc230280259 \h </w:instrText>
+              <w:instrText xml:space="preserve"> PAGEREF _Toc230370784 \h </w:instrText>
             </w:r>
             <w:r>
               <w:rPr>
@@ -1728,7 +1739,7 @@
         </w:p>
         <w:p>
           <w:pPr>
-            <w:pStyle w:val="TOC3"/>
+            <w:pStyle w:val="TDC3"/>
             <w:tabs>
               <w:tab w:val="right" w:leader="dot" w:pos="9350"/>
             </w:tabs>
@@ -1738,14 +1749,14 @@
               <w:kern w:val="2"/>
               <w:sz w:val="24"/>
               <w:szCs w:val="24"/>
-              <w:lang w:val="es-ES" w:eastAsia="es-ES"/>
+              <w:lang w:eastAsia="es-SV"/>
               <w14:ligatures w14:val="standardContextual"/>
             </w:rPr>
           </w:pPr>
-          <w:hyperlink w:anchor="_Toc230280260" w:history="1">
-            <w:r>
-              <w:rPr>
-                <w:rStyle w:val="Hyperlink"/>
+          <w:hyperlink w:anchor="_Toc230370785" w:history="1">
+            <w:r>
+              <w:rPr>
+                <w:rStyle w:val="Hipervnculo"/>
                 <w:rFonts w:ascii="Arial" w:hAnsi="Arial" w:cs="Arial"/>
                 <w:noProof/>
               </w:rPr>
@@ -1770,7 +1781,7 @@
                 <w:noProof/>
                 <w:webHidden/>
               </w:rPr>
-              <w:instrText xml:space="preserve"> PAGEREF _Toc230280260 \h </w:instrText>
+              <w:instrText xml:space="preserve"> PAGEREF _Toc230370785 \h </w:instrText>
             </w:r>
             <w:r>
               <w:rPr>
@@ -1803,7 +1814,7 @@
         </w:p>
         <w:p>
           <w:pPr>
-            <w:pStyle w:val="TOC1"/>
+            <w:pStyle w:val="TDC1"/>
             <w:tabs>
               <w:tab w:val="right" w:leader="dot" w:pos="9350"/>
             </w:tabs>
@@ -1813,14 +1824,14 @@
               <w:kern w:val="2"/>
               <w:sz w:val="24"/>
               <w:szCs w:val="24"/>
-              <w:lang w:val="es-ES" w:eastAsia="es-ES"/>
+              <w:lang w:eastAsia="es-SV"/>
               <w14:ligatures w14:val="standardContextual"/>
             </w:rPr>
           </w:pPr>
-          <w:hyperlink w:anchor="_Toc230280261" w:history="1">
-            <w:r>
-              <w:rPr>
-                <w:rStyle w:val="Hyperlink"/>
+          <w:hyperlink w:anchor="_Toc230370786" w:history="1">
+            <w:r>
+              <w:rPr>
+                <w:rStyle w:val="Hipervnculo"/>
                 <w:rFonts w:ascii="Arial" w:hAnsi="Arial" w:cs="Arial"/>
                 <w:b/>
                 <w:bCs/>
@@ -1847,7 +1858,7 @@
                 <w:noProof/>
                 <w:webHidden/>
               </w:rPr>
-              <w:instrText xml:space="preserve"> PAGEREF _Toc230280261 \h </w:instrText>
+              <w:instrText xml:space="preserve"> PAGEREF _Toc230370786 \h </w:instrText>
             </w:r>
             <w:r>
               <w:rPr>
@@ -1880,7 +1891,7 @@
         </w:p>
         <w:p>
           <w:pPr>
-            <w:pStyle w:val="TOC2"/>
+            <w:pStyle w:val="TDC2"/>
             <w:tabs>
               <w:tab w:val="right" w:leader="dot" w:pos="9350"/>
             </w:tabs>
@@ -1890,14 +1901,14 @@
               <w:kern w:val="2"/>
               <w:sz w:val="24"/>
               <w:szCs w:val="24"/>
-              <w:lang w:val="es-ES" w:eastAsia="es-ES"/>
+              <w:lang w:eastAsia="es-SV"/>
               <w14:ligatures w14:val="standardContextual"/>
             </w:rPr>
           </w:pPr>
-          <w:hyperlink w:anchor="_Toc230280262" w:history="1">
-            <w:r>
-              <w:rPr>
-                <w:rStyle w:val="Hyperlink"/>
+          <w:hyperlink w:anchor="_Toc230370787" w:history="1">
+            <w:r>
+              <w:rPr>
+                <w:rStyle w:val="Hipervnculo"/>
                 <w:rFonts w:ascii="Arial" w:hAnsi="Arial" w:cs="Arial"/>
                 <w:noProof/>
               </w:rPr>
@@ -1922,7 +1933,7 @@
                 <w:noProof/>
                 <w:webHidden/>
               </w:rPr>
-              <w:instrText xml:space="preserve"> PAGEREF _Toc230280262 \h </w:instrText>
+              <w:instrText xml:space="preserve"> PAGEREF _Toc230370787 \h </w:instrText>
             </w:r>
             <w:r>
               <w:rPr>
@@ -1955,7 +1966,7 @@
         </w:p>
         <w:p>
           <w:pPr>
-            <w:pStyle w:val="TOC2"/>
+            <w:pStyle w:val="TDC2"/>
             <w:tabs>
               <w:tab w:val="right" w:leader="dot" w:pos="9350"/>
             </w:tabs>
@@ -1965,14 +1976,14 @@
               <w:kern w:val="2"/>
               <w:sz w:val="24"/>
               <w:szCs w:val="24"/>
-              <w:lang w:val="es-ES" w:eastAsia="es-ES"/>
+              <w:lang w:eastAsia="es-SV"/>
               <w14:ligatures w14:val="standardContextual"/>
             </w:rPr>
           </w:pPr>
-          <w:hyperlink w:anchor="_Toc230280263" w:history="1">
-            <w:r>
-              <w:rPr>
-                <w:rStyle w:val="Hyperlink"/>
+          <w:hyperlink w:anchor="_Toc230370788" w:history="1">
+            <w:r>
+              <w:rPr>
+                <w:rStyle w:val="Hipervnculo"/>
                 <w:rFonts w:ascii="Arial" w:hAnsi="Arial" w:cs="Arial"/>
                 <w:noProof/>
               </w:rPr>
@@ -1997,7 +2008,7 @@
                 <w:noProof/>
                 <w:webHidden/>
               </w:rPr>
-              <w:instrText xml:space="preserve"> PAGEREF _Toc230280263 \h </w:instrText>
+              <w:instrText xml:space="preserve"> PAGEREF _Toc230370788 \h </w:instrText>
             </w:r>
             <w:r>
               <w:rPr>
@@ -2030,7 +2041,7 @@
         </w:p>
         <w:p>
           <w:pPr>
-            <w:pStyle w:val="TOC2"/>
+            <w:pStyle w:val="TDC2"/>
             <w:tabs>
               <w:tab w:val="right" w:leader="dot" w:pos="9350"/>
             </w:tabs>
@@ -2040,14 +2051,14 @@
               <w:kern w:val="2"/>
               <w:sz w:val="24"/>
               <w:szCs w:val="24"/>
-              <w:lang w:val="es-ES" w:eastAsia="es-ES"/>
+              <w:lang w:eastAsia="es-SV"/>
               <w14:ligatures w14:val="standardContextual"/>
             </w:rPr>
           </w:pPr>
-          <w:hyperlink w:anchor="_Toc230280264" w:history="1">
-            <w:r>
-              <w:rPr>
-                <w:rStyle w:val="Hyperlink"/>
+          <w:hyperlink w:anchor="_Toc230370789" w:history="1">
+            <w:r>
+              <w:rPr>
+                <w:rStyle w:val="Hipervnculo"/>
                 <w:rFonts w:ascii="Arial" w:hAnsi="Arial" w:cs="Arial"/>
                 <w:noProof/>
               </w:rPr>
@@ -2072,7 +2083,7 @@
                 <w:noProof/>
                 <w:webHidden/>
               </w:rPr>
-              <w:instrText xml:space="preserve"> PAGEREF _Toc230280264 \h </w:instrText>
+              <w:instrText xml:space="preserve"> PAGEREF _Toc230370789 \h </w:instrText>
             </w:r>
             <w:r>
               <w:rPr>
@@ -2105,7 +2116,7 @@
         </w:p>
         <w:p>
           <w:pPr>
-            <w:pStyle w:val="TOC2"/>
+            <w:pStyle w:val="TDC2"/>
             <w:tabs>
               <w:tab w:val="right" w:leader="dot" w:pos="9350"/>
             </w:tabs>
@@ -2115,14 +2126,14 @@
               <w:kern w:val="2"/>
               <w:sz w:val="24"/>
               <w:szCs w:val="24"/>
-              <w:lang w:val="es-ES" w:eastAsia="es-ES"/>
+              <w:lang w:eastAsia="es-SV"/>
               <w14:ligatures w14:val="standardContextual"/>
             </w:rPr>
           </w:pPr>
-          <w:hyperlink w:anchor="_Toc230280265" w:history="1">
-            <w:r>
-              <w:rPr>
-                <w:rStyle w:val="Hyperlink"/>
+          <w:hyperlink w:anchor="_Toc230370790" w:history="1">
+            <w:r>
+              <w:rPr>
+                <w:rStyle w:val="Hipervnculo"/>
                 <w:rFonts w:ascii="Arial" w:hAnsi="Arial" w:cs="Arial"/>
                 <w:noProof/>
               </w:rPr>
@@ -2147,7 +2158,7 @@
                 <w:noProof/>
                 <w:webHidden/>
               </w:rPr>
-              <w:instrText xml:space="preserve"> PAGEREF _Toc230280265 \h </w:instrText>
+              <w:instrText xml:space="preserve"> PAGEREF _Toc230370790 \h </w:instrText>
             </w:r>
             <w:r>
               <w:rPr>
@@ -2180,7 +2191,7 @@
         </w:p>
         <w:p>
           <w:pPr>
-            <w:pStyle w:val="TOC2"/>
+            <w:pStyle w:val="TDC2"/>
             <w:tabs>
               <w:tab w:val="right" w:leader="dot" w:pos="9350"/>
             </w:tabs>
@@ -2190,14 +2201,14 @@
               <w:kern w:val="2"/>
               <w:sz w:val="24"/>
               <w:szCs w:val="24"/>
-              <w:lang w:val="es-ES" w:eastAsia="es-ES"/>
+              <w:lang w:eastAsia="es-SV"/>
               <w14:ligatures w14:val="standardContextual"/>
             </w:rPr>
           </w:pPr>
-          <w:hyperlink w:anchor="_Toc230280266" w:history="1">
-            <w:r>
-              <w:rPr>
-                <w:rStyle w:val="Hyperlink"/>
+          <w:hyperlink w:anchor="_Toc230370791" w:history="1">
+            <w:r>
+              <w:rPr>
+                <w:rStyle w:val="Hipervnculo"/>
                 <w:rFonts w:ascii="Arial" w:hAnsi="Arial" w:cs="Arial"/>
                 <w:noProof/>
               </w:rPr>
@@ -2222,7 +2233,7 @@
                 <w:noProof/>
                 <w:webHidden/>
               </w:rPr>
-              <w:instrText xml:space="preserve"> PAGEREF _Toc230280266 \h </w:instrText>
+              <w:instrText xml:space="preserve"> PAGEREF _Toc230370791 \h </w:instrText>
             </w:r>
             <w:r>
               <w:rPr>
@@ -2255,7 +2266,7 @@
         </w:p>
         <w:p>
           <w:pPr>
-            <w:pStyle w:val="TOC1"/>
+            <w:pStyle w:val="TDC1"/>
             <w:tabs>
               <w:tab w:val="right" w:leader="dot" w:pos="9350"/>
             </w:tabs>
@@ -2265,14 +2276,14 @@
               <w:kern w:val="2"/>
               <w:sz w:val="24"/>
               <w:szCs w:val="24"/>
-              <w:lang w:val="es-ES" w:eastAsia="es-ES"/>
+              <w:lang w:eastAsia="es-SV"/>
               <w14:ligatures w14:val="standardContextual"/>
             </w:rPr>
           </w:pPr>
-          <w:hyperlink w:anchor="_Toc230280267" w:history="1">
-            <w:r>
-              <w:rPr>
-                <w:rStyle w:val="Hyperlink"/>
+          <w:hyperlink w:anchor="_Toc230370792" w:history="1">
+            <w:r>
+              <w:rPr>
+                <w:rStyle w:val="Hipervnculo"/>
                 <w:rFonts w:ascii="Arial" w:hAnsi="Arial" w:cs="Arial"/>
                 <w:b/>
                 <w:bCs/>
@@ -2299,7 +2310,7 @@
                 <w:noProof/>
                 <w:webHidden/>
               </w:rPr>
-              <w:instrText xml:space="preserve"> PAGEREF _Toc230280267 \h </w:instrText>
+              <w:instrText xml:space="preserve"> PAGEREF _Toc230370792 \h </w:instrText>
             </w:r>
             <w:r>
               <w:rPr>
@@ -2319,7 +2330,7 @@
                 <w:noProof/>
                 <w:webHidden/>
               </w:rPr>
-              <w:t>43</w:t>
+              <w:t>42</w:t>
             </w:r>
             <w:r>
               <w:rPr>
@@ -2414,14 +2425,14 @@
     </w:p>
     <w:p>
       <w:pPr>
-        <w:pStyle w:val="Heading1"/>
+        <w:pStyle w:val="Ttulo1"/>
         <w:spacing w:line="360" w:lineRule="auto"/>
         <w:rPr>
           <w:rFonts w:ascii="Arial" w:hAnsi="Arial" w:cs="Arial"/>
           <w:lang w:val="es-SV"/>
         </w:rPr>
       </w:pPr>
-      <w:bookmarkStart w:id="1" w:name="_Toc230280253"/>
+      <w:bookmarkStart w:id="1" w:name="_Toc230370778"/>
       <w:r>
         <w:rPr>
           <w:rFonts w:ascii="Arial" w:hAnsi="Arial" w:cs="Arial"/>
@@ -2432,13 +2443,14 @@
           <w:szCs w:val="24"/>
           <w:lang w:val="es-SV"/>
         </w:rPr>
+        <w:lastRenderedPageBreak/>
         <w:t>Plan de Pruebas</w:t>
       </w:r>
       <w:bookmarkEnd w:id="1"/>
     </w:p>
     <w:p>
       <w:pPr>
-        <w:pStyle w:val="Heading2"/>
+        <w:pStyle w:val="Ttulo2"/>
         <w:rPr>
           <w:rFonts w:ascii="Arial" w:hAnsi="Arial" w:cs="Arial"/>
           <w:color w:val="auto"/>
@@ -2447,7 +2459,7 @@
           <w:lang w:val="es-SV"/>
         </w:rPr>
       </w:pPr>
-      <w:bookmarkStart w:id="2" w:name="_Toc230280254"/>
+      <w:bookmarkStart w:id="2" w:name="_Toc230370779"/>
       <w:r>
         <w:rPr>
           <w:rFonts w:ascii="Arial" w:hAnsi="Arial" w:cs="Arial"/>
@@ -2653,7 +2665,15 @@
           <w:rFonts w:ascii="Arial" w:hAnsi="Arial" w:cs="Arial"/>
           <w:lang w:val="es-ES"/>
         </w:rPr>
-        <w:t xml:space="preserve">Empleado: Este puede subir documentos nuevos al sitio web para que estos puedan ser aprobados por un jefe. Aparte, este empleado tiene la habilidad de ver, en una forma </w:t>
+        <w:t xml:space="preserve">Empleado: Este puede subir documentos nuevos al sitio web para que estos puedan ser aprobados por un jefe. Aparte, este empleado tiene la habilidad de ver, en una </w:t>
+      </w:r>
+      <w:r>
+        <w:rPr>
+          <w:rFonts w:ascii="Arial" w:hAnsi="Arial" w:cs="Arial"/>
+          <w:lang w:val="es-ES"/>
+        </w:rPr>
+        <w:lastRenderedPageBreak/>
+        <w:t xml:space="preserve">forma </w:t>
       </w:r>
       <w:r>
         <w:rPr>
@@ -2806,7 +2826,7 @@
     </w:p>
     <w:p>
       <w:pPr>
-        <w:pStyle w:val="ListParagraph"/>
+        <w:pStyle w:val="Prrafodelista"/>
         <w:numPr>
           <w:ilvl w:val="0"/>
           <w:numId w:val="28"/>
@@ -2826,7 +2846,7 @@
     </w:p>
     <w:p>
       <w:pPr>
-        <w:pStyle w:val="ListParagraph"/>
+        <w:pStyle w:val="Prrafodelista"/>
         <w:numPr>
           <w:ilvl w:val="0"/>
           <w:numId w:val="28"/>
@@ -2846,7 +2866,7 @@
     </w:p>
     <w:p>
       <w:pPr>
-        <w:pStyle w:val="ListParagraph"/>
+        <w:pStyle w:val="Prrafodelista"/>
         <w:numPr>
           <w:ilvl w:val="1"/>
           <w:numId w:val="28"/>
@@ -2866,7 +2886,7 @@
     </w:p>
     <w:p>
       <w:pPr>
-        <w:pStyle w:val="ListParagraph"/>
+        <w:pStyle w:val="Prrafodelista"/>
         <w:numPr>
           <w:ilvl w:val="1"/>
           <w:numId w:val="28"/>
@@ -2886,7 +2906,7 @@
     </w:p>
     <w:p>
       <w:pPr>
-        <w:pStyle w:val="ListParagraph"/>
+        <w:pStyle w:val="Prrafodelista"/>
         <w:numPr>
           <w:ilvl w:val="1"/>
           <w:numId w:val="28"/>
@@ -2906,7 +2926,7 @@
     </w:p>
     <w:p>
       <w:pPr>
-        <w:pStyle w:val="ListParagraph"/>
+        <w:pStyle w:val="Prrafodelista"/>
         <w:numPr>
           <w:ilvl w:val="0"/>
           <w:numId w:val="28"/>
@@ -2926,7 +2946,7 @@
     </w:p>
     <w:p>
       <w:pPr>
-        <w:pStyle w:val="ListParagraph"/>
+        <w:pStyle w:val="Prrafodelista"/>
         <w:numPr>
           <w:ilvl w:val="0"/>
           <w:numId w:val="28"/>
@@ -2946,7 +2966,7 @@
     </w:p>
     <w:p>
       <w:pPr>
-        <w:pStyle w:val="ListParagraph"/>
+        <w:pStyle w:val="Prrafodelista"/>
         <w:numPr>
           <w:ilvl w:val="0"/>
           <w:numId w:val="28"/>
@@ -2961,12 +2981,13 @@
           <w:rFonts w:ascii="Arial" w:hAnsi="Arial" w:cs="Arial"/>
           <w:lang w:val="es-SV"/>
         </w:rPr>
+        <w:lastRenderedPageBreak/>
         <w:t xml:space="preserve">Historial de cambios: Para mantener un buen control de versiones, se debe de generar una bitácora que mantenga el historial de cambios en los documentos, con información como: el usuario que subió el documento, información del cambio y la fecha del cambio. </w:t>
       </w:r>
     </w:p>
     <w:p>
       <w:pPr>
-        <w:pStyle w:val="ListParagraph"/>
+        <w:pStyle w:val="Prrafodelista"/>
         <w:numPr>
           <w:ilvl w:val="0"/>
           <w:numId w:val="28"/>
@@ -2986,7 +3007,7 @@
     </w:p>
     <w:p>
       <w:pPr>
-        <w:pStyle w:val="ListParagraph"/>
+        <w:pStyle w:val="Prrafodelista"/>
         <w:numPr>
           <w:ilvl w:val="0"/>
           <w:numId w:val="28"/>
@@ -3006,7 +3027,7 @@
     </w:p>
     <w:p>
       <w:pPr>
-        <w:pStyle w:val="ListParagraph"/>
+        <w:pStyle w:val="Prrafodelista"/>
         <w:numPr>
           <w:ilvl w:val="0"/>
           <w:numId w:val="28"/>
@@ -3097,7 +3118,7 @@
     </w:p>
     <w:p>
       <w:pPr>
-        <w:pStyle w:val="ListParagraph"/>
+        <w:pStyle w:val="Prrafodelista"/>
         <w:numPr>
           <w:ilvl w:val="0"/>
           <w:numId w:val="29"/>
@@ -3124,7 +3145,7 @@
     </w:p>
     <w:p>
       <w:pPr>
-        <w:pStyle w:val="ListParagraph"/>
+        <w:pStyle w:val="Prrafodelista"/>
         <w:numPr>
           <w:ilvl w:val="1"/>
           <w:numId w:val="29"/>
@@ -3144,7 +3165,7 @@
     </w:p>
     <w:p>
       <w:pPr>
-        <w:pStyle w:val="ListParagraph"/>
+        <w:pStyle w:val="Prrafodelista"/>
         <w:numPr>
           <w:ilvl w:val="1"/>
           <w:numId w:val="29"/>
@@ -3178,7 +3199,7 @@
     </w:p>
     <w:p>
       <w:pPr>
-        <w:pStyle w:val="ListParagraph"/>
+        <w:pStyle w:val="Prrafodelista"/>
         <w:numPr>
           <w:ilvl w:val="0"/>
           <w:numId w:val="29"/>
@@ -3200,12 +3221,20 @@
           <w:rFonts w:ascii="Arial" w:hAnsi="Arial" w:cs="Arial"/>
           <w:lang w:val="es-ES"/>
         </w:rPr>
-        <w:t xml:space="preserve">nuevos documentos, los cuales tendrán que ser aprobados o rechazados por un administrador o jefe antes de que estén disponibles para que se puedan revisar en el sitio web. Esto permita una forma de gestionar y mantener los documentos necesarios, ya que, una vez sean aprobados, los empleados siempre tendrán acceso a estos, por lo que los pueden revisar y evitar errores al ocupar documentos anticuados. </w:t>
-      </w:r>
-    </w:p>
-    <w:p>
-      <w:pPr>
-        <w:pStyle w:val="ListParagraph"/>
+        <w:t xml:space="preserve">nuevos documentos, los cuales tendrán que ser aprobados o rechazados por un administrador o jefe antes de que estén disponibles para que se puedan revisar en el sitio web. Esto permita una forma de gestionar y mantener los documentos necesarios, ya que, una vez </w:t>
+      </w:r>
+      <w:r>
+        <w:rPr>
+          <w:rFonts w:ascii="Arial" w:hAnsi="Arial" w:cs="Arial"/>
+          <w:lang w:val="es-ES"/>
+        </w:rPr>
+        <w:lastRenderedPageBreak/>
+        <w:t xml:space="preserve">sean aprobados, los empleados siempre tendrán acceso a estos, por lo que los pueden revisar y evitar errores al ocupar documentos anticuados. </w:t>
+      </w:r>
+    </w:p>
+    <w:p>
+      <w:pPr>
+        <w:pStyle w:val="Prrafodelista"/>
         <w:numPr>
           <w:ilvl w:val="0"/>
           <w:numId w:val="29"/>
@@ -3239,7 +3268,7 @@
     </w:p>
     <w:p>
       <w:pPr>
-        <w:pStyle w:val="ListParagraph"/>
+        <w:pStyle w:val="Prrafodelista"/>
         <w:numPr>
           <w:ilvl w:val="0"/>
           <w:numId w:val="29"/>
@@ -3294,7 +3323,7 @@
     </w:p>
     <w:p>
       <w:pPr>
-        <w:pStyle w:val="ListParagraph"/>
+        <w:pStyle w:val="Prrafodelista"/>
         <w:numPr>
           <w:ilvl w:val="0"/>
           <w:numId w:val="29"/>
@@ -3346,7 +3375,7 @@
     </w:p>
     <w:p>
       <w:pPr>
-        <w:pStyle w:val="ListParagraph"/>
+        <w:pStyle w:val="Prrafodelista"/>
         <w:numPr>
           <w:ilvl w:val="0"/>
           <w:numId w:val="29"/>
@@ -3368,12 +3397,20 @@
           <w:rFonts w:ascii="Arial" w:hAnsi="Arial" w:cs="Arial"/>
           <w:lang w:val="es-ES"/>
         </w:rPr>
-        <w:t xml:space="preserve">Acceso para ver los documentos y sus respectivas versiones: Como el punto principal de nuestro sitio web es el de permitir una plataforma de gestión documental, es necesario de que se pueda tener acceso no solo a los nuevos documentos que han sido aprobados, pero también a todas las versiones anteriores y las más nuevas de esos respectivos documentos. Una vez un documento nuevo sea aprobado, los usuarios tendrán acceso a este para poder revisar, y cuando una nueva versión de este documento sea aprobada, los usuarios podrán ver la nueva versión, al igual que las versiones anteriores. Esto es con el propósito de reducir error, si un usuario está ocupando la versión 1.2 de un documento, pero recién se aprueba la versión 1.3, el usuario podrá revisar ambas, para poder ver cuáles fueron los cambios y poder así hacer modificaciones en caso de que fueran necesarias. Es importante notar, que esta función depende de que el documento sea aprobado, en caso el documento es rechazado o una nueva versión es rechazada, no se tendrá acceso a ella para los usuarios, lo que ayuda a la gestión documental, ya que no cualquier persona puede subir un documento y que este aparezca como la versión más nueva. Todo documento se debe de revisar y aprobar primero, lo que reduce la redundancia y los errores. </w:t>
-      </w:r>
-    </w:p>
-    <w:p>
-      <w:pPr>
-        <w:pStyle w:val="ListParagraph"/>
+        <w:t xml:space="preserve">Acceso para ver los documentos y sus respectivas versiones: Como el punto principal de nuestro sitio web es el de permitir una plataforma de gestión documental, es necesario de que se pueda tener acceso no solo a los nuevos documentos que han sido aprobados, pero también a todas las versiones anteriores y las más nuevas de esos respectivos documentos. Una vez un documento nuevo sea aprobado, los usuarios tendrán acceso a este para poder revisar, y cuando una nueva versión de este documento sea aprobada, los usuarios podrán ver la nueva versión, al igual que las versiones anteriores. Esto es con el propósito de reducir error, si un usuario está ocupando la versión 1.2 de un documento, pero recién se aprueba la versión 1.3, el usuario podrá revisar </w:t>
+      </w:r>
+      <w:r>
+        <w:rPr>
+          <w:rFonts w:ascii="Arial" w:hAnsi="Arial" w:cs="Arial"/>
+          <w:lang w:val="es-ES"/>
+        </w:rPr>
+        <w:lastRenderedPageBreak/>
+        <w:t xml:space="preserve">ambas, para poder ver cuáles fueron los cambios y poder así hacer modificaciones en caso de que fueran necesarias. Es importante notar, que esta función depende de que el documento sea aprobado, en caso el documento es rechazado o una nueva versión es rechazada, no se tendrá acceso a ella para los usuarios, lo que ayuda a la gestión documental, ya que no cualquier persona puede subir un documento y que este aparezca como la versión más nueva. Todo documento se debe de revisar y aprobar primero, lo que reduce la redundancia y los errores. </w:t>
+      </w:r>
+    </w:p>
+    <w:p>
+      <w:pPr>
+        <w:pStyle w:val="Prrafodelista"/>
         <w:numPr>
           <w:ilvl w:val="0"/>
           <w:numId w:val="29"/>
@@ -3407,7 +3444,7 @@
     </w:p>
     <w:p>
       <w:pPr>
-        <w:pStyle w:val="ListParagraph"/>
+        <w:pStyle w:val="Prrafodelista"/>
         <w:numPr>
           <w:ilvl w:val="0"/>
           <w:numId w:val="29"/>
@@ -3506,7 +3543,7 @@
     </w:p>
     <w:p>
       <w:pPr>
-        <w:pStyle w:val="ListParagraph"/>
+        <w:pStyle w:val="Prrafodelista"/>
         <w:numPr>
           <w:ilvl w:val="0"/>
           <w:numId w:val="29"/>
@@ -3560,6 +3597,7 @@
           <w:b/>
           <w:lang w:val="es-ES"/>
         </w:rPr>
+        <w:lastRenderedPageBreak/>
         <w:t>Limitaciones del sistema:</w:t>
       </w:r>
     </w:p>
@@ -3584,15 +3622,13 @@
         </w:rPr>
         <w:t xml:space="preserve">iene nuestro </w:t>
       </w:r>
-      <w:proofErr w:type="gramStart"/>
-      <w:r>
-        <w:rPr>
-          <w:rFonts w:ascii="Arial" w:hAnsi="Arial" w:cs="Arial"/>
-          <w:lang w:val="es-ES"/>
-        </w:rPr>
-        <w:t>sistema,</w:t>
-      </w:r>
-      <w:proofErr w:type="gramEnd"/>
+      <w:r>
+        <w:rPr>
+          <w:rFonts w:ascii="Arial" w:hAnsi="Arial" w:cs="Arial"/>
+          <w:lang w:val="es-ES"/>
+        </w:rPr>
+        <w:t>sistema</w:t>
+      </w:r>
       <w:r>
         <w:rPr>
           <w:rFonts w:ascii="Arial" w:hAnsi="Arial" w:cs="Arial"/>
@@ -3631,7 +3667,7 @@
     </w:p>
     <w:p>
       <w:pPr>
-        <w:pStyle w:val="Heading2"/>
+        <w:pStyle w:val="Ttulo2"/>
         <w:rPr>
           <w:rFonts w:ascii="Arial" w:hAnsi="Arial" w:cs="Arial"/>
           <w:color w:val="auto"/>
@@ -3640,7 +3676,7 @@
           <w:lang w:val="es-SV"/>
         </w:rPr>
       </w:pPr>
-      <w:bookmarkStart w:id="3" w:name="_Toc230280255"/>
+      <w:bookmarkStart w:id="3" w:name="_Toc230370780"/>
       <w:r>
         <w:rPr>
           <w:rFonts w:ascii="Arial" w:hAnsi="Arial" w:cs="Arial"/>
@@ -3734,7 +3770,7 @@
     </w:p>
     <w:p>
       <w:pPr>
-        <w:pStyle w:val="ListParagraph"/>
+        <w:pStyle w:val="Prrafodelista"/>
         <w:numPr>
           <w:ilvl w:val="0"/>
           <w:numId w:val="30"/>
@@ -3803,7 +3839,7 @@
     </w:p>
     <w:p>
       <w:pPr>
-        <w:pStyle w:val="ListParagraph"/>
+        <w:pStyle w:val="Prrafodelista"/>
         <w:numPr>
           <w:ilvl w:val="0"/>
           <w:numId w:val="30"/>
@@ -3823,7 +3859,7 @@
     </w:p>
     <w:p>
       <w:pPr>
-        <w:pStyle w:val="ListParagraph"/>
+        <w:pStyle w:val="Prrafodelista"/>
         <w:numPr>
           <w:ilvl w:val="0"/>
           <w:numId w:val="30"/>
@@ -3838,7 +3874,15 @@
           <w:rFonts w:ascii="Arial" w:hAnsi="Arial" w:cs="Arial"/>
           <w:lang w:val="es-ES"/>
         </w:rPr>
-        <w:t xml:space="preserve">Subir una nueva versión de un documento: Este caso es muy similar al anterior, con la gran diferencia que no es un documento nuevo, sino una nueva versión de un documento existente. Acá se deberá de seleccionar el documento al cual se le quiere subir la nueva versión, luego se llenará toda la información requerida </w:t>
+        <w:t xml:space="preserve">Subir una nueva versión de un documento: Este caso es muy similar al anterior, con la gran diferencia que no es un documento nuevo, sino una </w:t>
+      </w:r>
+      <w:r>
+        <w:rPr>
+          <w:rFonts w:ascii="Arial" w:hAnsi="Arial" w:cs="Arial"/>
+          <w:lang w:val="es-ES"/>
+        </w:rPr>
+        <w:lastRenderedPageBreak/>
+        <w:t xml:space="preserve">nueva versión de un documento existente. Acá se deberá de seleccionar el documento al cual se le quiere subir la nueva versión, luego se llenará toda la información requerida </w:t>
       </w:r>
       <w:proofErr w:type="gramStart"/>
       <w:r>
@@ -3859,7 +3903,7 @@
     </w:p>
     <w:p>
       <w:pPr>
-        <w:pStyle w:val="ListParagraph"/>
+        <w:pStyle w:val="Prrafodelista"/>
         <w:numPr>
           <w:ilvl w:val="0"/>
           <w:numId w:val="30"/>
@@ -3937,7 +3981,7 @@
     </w:p>
     <w:p>
       <w:pPr>
-        <w:pStyle w:val="ListParagraph"/>
+        <w:pStyle w:val="Prrafodelista"/>
         <w:numPr>
           <w:ilvl w:val="0"/>
           <w:numId w:val="30"/>
@@ -3964,7 +4008,7 @@
     </w:p>
     <w:p>
       <w:pPr>
-        <w:pStyle w:val="ListParagraph"/>
+        <w:pStyle w:val="Prrafodelista"/>
         <w:numPr>
           <w:ilvl w:val="0"/>
           <w:numId w:val="30"/>
@@ -3991,7 +4035,7 @@
     </w:p>
     <w:p>
       <w:pPr>
-        <w:pStyle w:val="ListParagraph"/>
+        <w:pStyle w:val="Prrafodelista"/>
         <w:numPr>
           <w:ilvl w:val="0"/>
           <w:numId w:val="30"/>
@@ -4011,7 +4055,7 @@
     </w:p>
     <w:p>
       <w:pPr>
-        <w:pStyle w:val="ListParagraph"/>
+        <w:pStyle w:val="Prrafodelista"/>
         <w:numPr>
           <w:ilvl w:val="0"/>
           <w:numId w:val="30"/>
@@ -4026,7 +4070,15 @@
           <w:rFonts w:ascii="Arial" w:hAnsi="Arial" w:cs="Arial"/>
           <w:lang w:val="es-ES"/>
         </w:rPr>
-        <w:t xml:space="preserve">Revisar los comentarios: De la misma manera en la cual se deja un comentario, si uno ingresa al área de documentos y elige un documento especifico y su respectiva versión, se pueden ver todos los comentarios </w:t>
+        <w:t xml:space="preserve">Revisar los comentarios: De la misma manera en la cual se deja un comentario, si uno ingresa al área de documentos y elige un documento </w:t>
+      </w:r>
+      <w:r>
+        <w:rPr>
+          <w:rFonts w:ascii="Arial" w:hAnsi="Arial" w:cs="Arial"/>
+          <w:lang w:val="es-ES"/>
+        </w:rPr>
+        <w:lastRenderedPageBreak/>
+        <w:t xml:space="preserve">especifico y su respectiva versión, se pueden ver todos los comentarios </w:t>
       </w:r>
       <w:r>
         <w:rPr>
@@ -4038,7 +4090,7 @@
     </w:p>
     <w:p>
       <w:pPr>
-        <w:pStyle w:val="ListParagraph"/>
+        <w:pStyle w:val="Prrafodelista"/>
         <w:numPr>
           <w:ilvl w:val="0"/>
           <w:numId w:val="30"/>
@@ -4106,7 +4158,7 @@
     </w:p>
     <w:p>
       <w:pPr>
-        <w:pStyle w:val="ListParagraph"/>
+        <w:pStyle w:val="Prrafodelista"/>
         <w:numPr>
           <w:ilvl w:val="0"/>
           <w:numId w:val="31"/>
@@ -4126,7 +4178,7 @@
     </w:p>
     <w:p>
       <w:pPr>
-        <w:pStyle w:val="ListParagraph"/>
+        <w:pStyle w:val="Prrafodelista"/>
         <w:numPr>
           <w:ilvl w:val="1"/>
           <w:numId w:val="31"/>
@@ -4146,7 +4198,7 @@
     </w:p>
     <w:p>
       <w:pPr>
-        <w:pStyle w:val="ListParagraph"/>
+        <w:pStyle w:val="Prrafodelista"/>
         <w:numPr>
           <w:ilvl w:val="1"/>
           <w:numId w:val="31"/>
@@ -4166,7 +4218,7 @@
     </w:p>
     <w:p>
       <w:pPr>
-        <w:pStyle w:val="ListParagraph"/>
+        <w:pStyle w:val="Prrafodelista"/>
         <w:numPr>
           <w:ilvl w:val="1"/>
           <w:numId w:val="31"/>
@@ -4186,7 +4238,7 @@
     </w:p>
     <w:p>
       <w:pPr>
-        <w:pStyle w:val="ListParagraph"/>
+        <w:pStyle w:val="Prrafodelista"/>
         <w:numPr>
           <w:ilvl w:val="0"/>
           <w:numId w:val="31"/>
@@ -4206,7 +4258,7 @@
     </w:p>
     <w:p>
       <w:pPr>
-        <w:pStyle w:val="ListParagraph"/>
+        <w:pStyle w:val="Prrafodelista"/>
         <w:numPr>
           <w:ilvl w:val="1"/>
           <w:numId w:val="31"/>
@@ -4226,7 +4278,7 @@
     </w:p>
     <w:p>
       <w:pPr>
-        <w:pStyle w:val="ListParagraph"/>
+        <w:pStyle w:val="Prrafodelista"/>
         <w:numPr>
           <w:ilvl w:val="1"/>
           <w:numId w:val="31"/>
@@ -4262,7 +4314,7 @@
     </w:p>
     <w:p>
       <w:pPr>
-        <w:pStyle w:val="ListParagraph"/>
+        <w:pStyle w:val="Prrafodelista"/>
         <w:numPr>
           <w:ilvl w:val="1"/>
           <w:numId w:val="31"/>
@@ -4298,7 +4350,7 @@
     </w:p>
     <w:p>
       <w:pPr>
-        <w:pStyle w:val="ListParagraph"/>
+        <w:pStyle w:val="Prrafodelista"/>
         <w:numPr>
           <w:ilvl w:val="1"/>
           <w:numId w:val="31"/>
@@ -4313,6 +4365,7 @@
           <w:rFonts w:ascii="Arial" w:hAnsi="Arial" w:cs="Arial"/>
           <w:lang w:val="es-ES"/>
         </w:rPr>
+        <w:lastRenderedPageBreak/>
         <w:t xml:space="preserve">En caso de que no se seleccione un rol, se debe de mostrar un error </w:t>
       </w:r>
       <w:proofErr w:type="gramStart"/>
@@ -4334,7 +4387,7 @@
     </w:p>
     <w:p>
       <w:pPr>
-        <w:pStyle w:val="ListParagraph"/>
+        <w:pStyle w:val="Prrafodelista"/>
         <w:numPr>
           <w:ilvl w:val="0"/>
           <w:numId w:val="31"/>
@@ -4354,7 +4407,7 @@
     </w:p>
     <w:p>
       <w:pPr>
-        <w:pStyle w:val="ListParagraph"/>
+        <w:pStyle w:val="Prrafodelista"/>
         <w:numPr>
           <w:ilvl w:val="1"/>
           <w:numId w:val="31"/>
@@ -4395,7 +4448,7 @@
     </w:p>
     <w:p>
       <w:pPr>
-        <w:pStyle w:val="ListParagraph"/>
+        <w:pStyle w:val="Prrafodelista"/>
         <w:numPr>
           <w:ilvl w:val="1"/>
           <w:numId w:val="31"/>
@@ -4415,7 +4468,7 @@
     </w:p>
     <w:p>
       <w:pPr>
-        <w:pStyle w:val="ListParagraph"/>
+        <w:pStyle w:val="Prrafodelista"/>
         <w:numPr>
           <w:ilvl w:val="1"/>
           <w:numId w:val="31"/>
@@ -4435,7 +4488,7 @@
     </w:p>
     <w:p>
       <w:pPr>
-        <w:pStyle w:val="ListParagraph"/>
+        <w:pStyle w:val="Prrafodelista"/>
         <w:numPr>
           <w:ilvl w:val="0"/>
           <w:numId w:val="31"/>
@@ -4502,7 +4555,7 @@
     </w:p>
     <w:p>
       <w:pPr>
-        <w:pStyle w:val="ListParagraph"/>
+        <w:pStyle w:val="Prrafodelista"/>
         <w:numPr>
           <w:ilvl w:val="0"/>
           <w:numId w:val="32"/>
@@ -4529,7 +4582,7 @@
     </w:p>
     <w:p>
       <w:pPr>
-        <w:pStyle w:val="ListParagraph"/>
+        <w:pStyle w:val="Prrafodelista"/>
         <w:numPr>
           <w:ilvl w:val="1"/>
           <w:numId w:val="32"/>
@@ -4549,7 +4602,7 @@
     </w:p>
     <w:p>
       <w:pPr>
-        <w:pStyle w:val="ListParagraph"/>
+        <w:pStyle w:val="Prrafodelista"/>
         <w:numPr>
           <w:ilvl w:val="1"/>
           <w:numId w:val="32"/>
@@ -4564,12 +4617,13 @@
           <w:rFonts w:ascii="Arial" w:hAnsi="Arial" w:cs="Arial"/>
           <w:lang w:val="es-ES"/>
         </w:rPr>
+        <w:lastRenderedPageBreak/>
         <w:t xml:space="preserve">Se debe de ocupar un mensaje genérico cuando hay un error al intentar ingresar a la plataforma, de modo que no se pueda saber si la contraseña o el correo es el incorrecto. Lo que evita que los usuarios maliciosos no sepan si el correo existe y la contraseña es la que esta mala, lo que protege la plataforma. </w:t>
       </w:r>
     </w:p>
     <w:p>
       <w:pPr>
-        <w:pStyle w:val="ListParagraph"/>
+        <w:pStyle w:val="Prrafodelista"/>
         <w:numPr>
           <w:ilvl w:val="1"/>
           <w:numId w:val="32"/>
@@ -4589,7 +4643,7 @@
     </w:p>
     <w:p>
       <w:pPr>
-        <w:pStyle w:val="ListParagraph"/>
+        <w:pStyle w:val="Prrafodelista"/>
         <w:numPr>
           <w:ilvl w:val="0"/>
           <w:numId w:val="32"/>
@@ -4637,7 +4691,7 @@
     </w:p>
     <w:p>
       <w:pPr>
-        <w:pStyle w:val="ListParagraph"/>
+        <w:pStyle w:val="Prrafodelista"/>
         <w:numPr>
           <w:ilvl w:val="1"/>
           <w:numId w:val="32"/>
@@ -4657,7 +4711,7 @@
     </w:p>
     <w:p>
       <w:pPr>
-        <w:pStyle w:val="ListParagraph"/>
+        <w:pStyle w:val="Prrafodelista"/>
         <w:numPr>
           <w:ilvl w:val="1"/>
           <w:numId w:val="32"/>
@@ -4677,7 +4731,7 @@
     </w:p>
     <w:p>
       <w:pPr>
-        <w:pStyle w:val="ListParagraph"/>
+        <w:pStyle w:val="Prrafodelista"/>
         <w:numPr>
           <w:ilvl w:val="1"/>
           <w:numId w:val="32"/>
@@ -4731,6 +4785,7 @@
           <w:b/>
           <w:lang w:val="es-ES"/>
         </w:rPr>
+        <w:lastRenderedPageBreak/>
         <w:t>Pruebas de integración</w:t>
       </w:r>
       <w:r>
@@ -4797,7 +4852,7 @@
     </w:p>
     <w:p>
       <w:pPr>
-        <w:pStyle w:val="ListParagraph"/>
+        <w:pStyle w:val="Prrafodelista"/>
         <w:numPr>
           <w:ilvl w:val="0"/>
           <w:numId w:val="33"/>
@@ -4854,7 +4909,7 @@
     </w:p>
     <w:p>
       <w:pPr>
-        <w:pStyle w:val="ListParagraph"/>
+        <w:pStyle w:val="Prrafodelista"/>
         <w:numPr>
           <w:ilvl w:val="0"/>
           <w:numId w:val="33"/>
@@ -4881,7 +4936,7 @@
     </w:p>
     <w:p>
       <w:pPr>
-        <w:pStyle w:val="ListParagraph"/>
+        <w:pStyle w:val="Prrafodelista"/>
         <w:numPr>
           <w:ilvl w:val="0"/>
           <w:numId w:val="33"/>
@@ -4933,7 +4988,7 @@
     </w:p>
     <w:p>
       <w:pPr>
-        <w:pStyle w:val="ListParagraph"/>
+        <w:pStyle w:val="Prrafodelista"/>
         <w:numPr>
           <w:ilvl w:val="0"/>
           <w:numId w:val="33"/>
@@ -4948,6 +5003,7 @@
           <w:rFonts w:ascii="Arial" w:hAnsi="Arial" w:cs="Arial"/>
           <w:lang w:val="es-ES"/>
         </w:rPr>
+        <w:lastRenderedPageBreak/>
         <w:t xml:space="preserve">Revisar y dejar comentarios: En cada documento, se pueden dejar comentarios, los cuales funcionan para hacer o responder preguntas que pueda haber por parte de los usuarios. Para que se guarden y se pueda acceder a estos comentarios, es necesario de que se guarde la información del comentario y el usuario en </w:t>
       </w:r>
       <w:r>
@@ -4967,7 +5023,7 @@
     </w:p>
     <w:p>
       <w:pPr>
-        <w:pStyle w:val="ListParagraph"/>
+        <w:pStyle w:val="Prrafodelista"/>
         <w:numPr>
           <w:ilvl w:val="0"/>
           <w:numId w:val="33"/>
@@ -5040,7 +5096,7 @@
     </w:p>
     <w:p>
       <w:pPr>
-        <w:pStyle w:val="ListParagraph"/>
+        <w:pStyle w:val="Prrafodelista"/>
         <w:numPr>
           <w:ilvl w:val="0"/>
           <w:numId w:val="34"/>
@@ -5060,7 +5116,7 @@
     </w:p>
     <w:p>
       <w:pPr>
-        <w:pStyle w:val="ListParagraph"/>
+        <w:pStyle w:val="Prrafodelista"/>
         <w:numPr>
           <w:ilvl w:val="0"/>
           <w:numId w:val="34"/>
@@ -5080,7 +5136,7 @@
     </w:p>
     <w:p>
       <w:pPr>
-        <w:pStyle w:val="ListParagraph"/>
+        <w:pStyle w:val="Prrafodelista"/>
         <w:numPr>
           <w:ilvl w:val="0"/>
           <w:numId w:val="34"/>
@@ -5100,7 +5156,7 @@
     </w:p>
     <w:p>
       <w:pPr>
-        <w:pStyle w:val="ListParagraph"/>
+        <w:pStyle w:val="Prrafodelista"/>
         <w:numPr>
           <w:ilvl w:val="0"/>
           <w:numId w:val="34"/>
@@ -5120,7 +5176,7 @@
     </w:p>
     <w:p>
       <w:pPr>
-        <w:pStyle w:val="ListParagraph"/>
+        <w:pStyle w:val="Prrafodelista"/>
         <w:numPr>
           <w:ilvl w:val="0"/>
           <w:numId w:val="34"/>
@@ -5135,21 +5191,22 @@
           <w:rFonts w:ascii="Arial" w:hAnsi="Arial" w:cs="Arial"/>
           <w:lang w:val="es-ES"/>
         </w:rPr>
+        <w:lastRenderedPageBreak/>
         <w:t xml:space="preserve">Creación de un usuario: Que un administrador pueda ingresar sesión y crear un nuevo usuario, el cual luego podrá acceder a la plataforma con sus respectivos permisos. </w:t>
       </w:r>
     </w:p>
     <w:p>
       <w:pPr>
-        <w:pStyle w:val="ListParagraph"/>
-        <w:rPr>
-          <w:rFonts w:ascii="Arial" w:hAnsi="Arial" w:cs="Arial"/>
-          <w:lang w:val="es-ES"/>
-        </w:rPr>
-      </w:pPr>
-    </w:p>
-    <w:p>
-      <w:pPr>
-        <w:pStyle w:val="Heading2"/>
+        <w:pStyle w:val="Prrafodelista"/>
+        <w:rPr>
+          <w:rFonts w:ascii="Arial" w:hAnsi="Arial" w:cs="Arial"/>
+          <w:lang w:val="es-ES"/>
+        </w:rPr>
+      </w:pPr>
+    </w:p>
+    <w:p>
+      <w:pPr>
+        <w:pStyle w:val="Ttulo2"/>
         <w:rPr>
           <w:rFonts w:ascii="Arial" w:hAnsi="Arial" w:cs="Arial"/>
           <w:b/>
@@ -5161,7 +5218,7 @@
         </w:rPr>
       </w:pPr>
       <w:bookmarkStart w:id="4" w:name="_Toc229775093"/>
-      <w:bookmarkStart w:id="5" w:name="_Toc230280256"/>
+      <w:bookmarkStart w:id="5" w:name="_Toc230370781"/>
       <w:r>
         <w:rPr>
           <w:rFonts w:ascii="Arial" w:hAnsi="Arial" w:cs="Arial"/>
@@ -5254,7 +5311,7 @@
     </w:p>
     <w:p>
       <w:pPr>
-        <w:pStyle w:val="ListParagraph"/>
+        <w:pStyle w:val="Prrafodelista"/>
         <w:numPr>
           <w:ilvl w:val="0"/>
           <w:numId w:val="35"/>
@@ -5272,7 +5329,7 @@
     </w:p>
     <w:p>
       <w:pPr>
-        <w:pStyle w:val="ListParagraph"/>
+        <w:pStyle w:val="Prrafodelista"/>
         <w:numPr>
           <w:ilvl w:val="0"/>
           <w:numId w:val="35"/>
@@ -5303,7 +5360,7 @@
     </w:p>
     <w:p>
       <w:pPr>
-        <w:pStyle w:val="ListParagraph"/>
+        <w:pStyle w:val="Prrafodelista"/>
         <w:numPr>
           <w:ilvl w:val="0"/>
           <w:numId w:val="36"/>
@@ -5323,7 +5380,7 @@
     </w:p>
     <w:p>
       <w:pPr>
-        <w:pStyle w:val="ListParagraph"/>
+        <w:pStyle w:val="Prrafodelista"/>
         <w:numPr>
           <w:ilvl w:val="0"/>
           <w:numId w:val="36"/>
@@ -5343,7 +5400,7 @@
     </w:p>
     <w:p>
       <w:pPr>
-        <w:pStyle w:val="ListParagraph"/>
+        <w:pStyle w:val="Prrafodelista"/>
         <w:numPr>
           <w:ilvl w:val="0"/>
           <w:numId w:val="36"/>
@@ -5404,7 +5461,7 @@
     </w:p>
     <w:p>
       <w:pPr>
-        <w:pStyle w:val="Heading2"/>
+        <w:pStyle w:val="Ttulo2"/>
         <w:rPr>
           <w:rFonts w:ascii="Arial" w:hAnsi="Arial" w:cs="Arial"/>
           <w:color w:val="auto"/>
@@ -5414,7 +5471,7 @@
         </w:rPr>
       </w:pPr>
       <w:bookmarkStart w:id="6" w:name="_Toc229775094"/>
-      <w:bookmarkStart w:id="7" w:name="_Toc230280257"/>
+      <w:bookmarkStart w:id="7" w:name="_Toc230370782"/>
       <w:r>
         <w:rPr>
           <w:rFonts w:ascii="Arial" w:hAnsi="Arial" w:cs="Arial"/>
@@ -5610,6 +5667,7 @@
           <w:b/>
           <w:lang w:val="es-SV"/>
         </w:rPr>
+        <w:lastRenderedPageBreak/>
         <w:t>Escenario 2</w:t>
       </w:r>
       <w:r>
@@ -6178,6 +6236,7 @@
           <w:b/>
           <w:lang w:val="es-SV"/>
         </w:rPr>
+        <w:lastRenderedPageBreak/>
         <w:t>Y</w:t>
       </w:r>
       <w:r>
@@ -6716,6 +6775,7 @@
           <w:b/>
           <w:lang w:val="es-SV"/>
         </w:rPr>
+        <w:lastRenderedPageBreak/>
         <w:t>Escenario 8</w:t>
       </w:r>
       <w:r>
@@ -7304,30 +7364,37 @@
     </w:p>
     <w:p>
       <w:pPr>
-        <w:pStyle w:val="Heading2"/>
-        <w:rPr>
-          <w:rFonts w:ascii="Arial" w:hAnsi="Arial" w:cs="Arial"/>
+        <w:pStyle w:val="Ttulo2"/>
+        <w:rPr>
+          <w:rFonts w:ascii="Arial" w:hAnsi="Arial" w:cs="Arial"/>
+          <w:b/>
+          <w:bCs/>
           <w:color w:val="000000" w:themeColor="text1"/>
           <w:sz w:val="24"/>
           <w:szCs w:val="24"/>
         </w:rPr>
       </w:pPr>
       <w:bookmarkStart w:id="8" w:name="_Toc229775095"/>
-      <w:bookmarkStart w:id="9" w:name="_Toc230280258"/>
+      <w:bookmarkStart w:id="9" w:name="_Toc230370783"/>
       <w:proofErr w:type="spellStart"/>
       <w:r>
         <w:rPr>
           <w:rFonts w:ascii="Arial" w:hAnsi="Arial" w:cs="Arial"/>
+          <w:b/>
+          <w:bCs/>
           <w:color w:val="000000" w:themeColor="text1"/>
           <w:sz w:val="24"/>
           <w:szCs w:val="24"/>
         </w:rPr>
+        <w:lastRenderedPageBreak/>
         <w:t>Matriz</w:t>
       </w:r>
       <w:proofErr w:type="spellEnd"/>
       <w:r>
         <w:rPr>
           <w:rFonts w:ascii="Arial" w:hAnsi="Arial" w:cs="Arial"/>
+          <w:b/>
+          <w:bCs/>
           <w:color w:val="000000" w:themeColor="text1"/>
           <w:sz w:val="24"/>
           <w:szCs w:val="24"/>
@@ -7338,6 +7405,8 @@
       <w:r>
         <w:rPr>
           <w:rFonts w:ascii="Arial" w:hAnsi="Arial" w:cs="Arial"/>
+          <w:b/>
+          <w:bCs/>
           <w:color w:val="000000" w:themeColor="text1"/>
           <w:sz w:val="24"/>
           <w:szCs w:val="24"/>
@@ -7367,7 +7436,7 @@
     </w:p>
     <w:p>
       <w:pPr>
-        <w:pStyle w:val="Heading2"/>
+        <w:pStyle w:val="Ttulo2"/>
         <w:rPr>
           <w:rFonts w:ascii="Arial" w:hAnsi="Arial" w:cs="Arial"/>
           <w:color w:val="000000" w:themeColor="text1"/>
@@ -7379,7 +7448,7 @@
     </w:p>
     <w:p>
       <w:pPr>
-        <w:pStyle w:val="Heading3"/>
+        <w:pStyle w:val="Ttulo3"/>
         <w:rPr>
           <w:rFonts w:ascii="Arial" w:hAnsi="Arial" w:cs="Arial"/>
           <w:color w:val="000000" w:themeColor="text1"/>
@@ -7389,7 +7458,7 @@
         </w:rPr>
       </w:pPr>
       <w:bookmarkStart w:id="10" w:name="_Toc229775096"/>
-      <w:bookmarkStart w:id="11" w:name="_Toc230280259"/>
+      <w:bookmarkStart w:id="11" w:name="_Toc230370784"/>
       <w:r>
         <w:rPr>
           <w:rFonts w:ascii="Arial" w:hAnsi="Arial" w:cs="Arial"/>
@@ -7428,7 +7497,7 @@
     </w:p>
     <w:tbl>
       <w:tblPr>
-        <w:tblStyle w:val="TableGrid"/>
+        <w:tblStyle w:val="Tablaconcuadrcula"/>
         <w:tblW w:w="11949" w:type="dxa"/>
         <w:tblInd w:w="-1316" w:type="dxa"/>
         <w:tblLook w:val="04A0" w:firstRow="1" w:lastRow="0" w:firstColumn="1" w:lastColumn="0" w:noHBand="0" w:noVBand="1"/>
@@ -7839,7 +7908,7 @@
             <w:hyperlink r:id="rId11" w:history="1">
               <w:r>
                 <w:rPr>
-                  <w:rStyle w:val="Hyperlink"/>
+                  <w:rStyle w:val="Hipervnculo"/>
                   <w:rFonts w:ascii="Arial" w:hAnsi="Arial" w:cs="Arial"/>
                   <w:sz w:val="16"/>
                   <w:lang w:val="es-SV"/>
@@ -8244,6 +8313,7 @@
           <w:noProof/>
           <w:lang w:val="es-SV" w:eastAsia="es-SV"/>
         </w:rPr>
+        <w:lastRenderedPageBreak/>
         <w:drawing>
           <wp:inline distT="0" distB="0" distL="0" distR="0" wp14:anchorId="4E6F1AFE" wp14:editId="176B73F1">
             <wp:extent cx="5943600" cy="2003425"/>
@@ -8383,7 +8453,7 @@
     </w:p>
     <w:tbl>
       <w:tblPr>
-        <w:tblStyle w:val="TableGrid"/>
+        <w:tblStyle w:val="Tablaconcuadrcula"/>
         <w:tblW w:w="11949" w:type="dxa"/>
         <w:tblInd w:w="-1316" w:type="dxa"/>
         <w:tblLook w:val="04A0" w:firstRow="1" w:lastRow="0" w:firstColumn="1" w:lastColumn="0" w:noHBand="0" w:noVBand="1"/>
@@ -8794,7 +8864,7 @@
             <w:hyperlink r:id="rId15" w:history="1">
               <w:r>
                 <w:rPr>
-                  <w:rStyle w:val="Hyperlink"/>
+                  <w:rStyle w:val="Hipervnculo"/>
                   <w:rFonts w:ascii="Arial" w:hAnsi="Arial" w:cs="Arial"/>
                   <w:sz w:val="16"/>
                   <w:lang w:val="es-SV"/>
@@ -9012,6 +9082,7 @@
                 <w:sz w:val="16"/>
                 <w:lang w:val="es-SV"/>
               </w:rPr>
+              <w:lastRenderedPageBreak/>
               <w:t xml:space="preserve">3) </w:t>
             </w:r>
           </w:p>
@@ -9103,6 +9174,7 @@
                 <w:sz w:val="16"/>
                 <w:lang w:val="es-SV"/>
               </w:rPr>
+              <w:lastRenderedPageBreak/>
               <w:t>Se logra subir un nuevo documento a la plataforma, el cual aparece con el estado de pendiente</w:t>
             </w:r>
           </w:p>
@@ -9318,6 +9390,7 @@
           <w:noProof/>
           <w:lang w:val="es-SV" w:eastAsia="es-SV"/>
         </w:rPr>
+        <w:lastRenderedPageBreak/>
         <w:drawing>
           <wp:inline distT="0" distB="0" distL="0" distR="0" wp14:anchorId="58247C55" wp14:editId="0AC29E60">
             <wp:extent cx="4740728" cy="2536493"/>
@@ -9551,12 +9624,13 @@
           <w:rFonts w:ascii="Arial" w:hAnsi="Arial" w:cs="Arial"/>
           <w:lang w:val="es-SV"/>
         </w:rPr>
+        <w:lastRenderedPageBreak/>
         <w:t>Caso de Prueba 3:</w:t>
       </w:r>
     </w:p>
     <w:tbl>
       <w:tblPr>
-        <w:tblStyle w:val="TableGrid"/>
+        <w:tblStyle w:val="Tablaconcuadrcula"/>
         <w:tblW w:w="11949" w:type="dxa"/>
         <w:tblInd w:w="-1316" w:type="dxa"/>
         <w:tblLook w:val="04A0" w:firstRow="1" w:lastRow="0" w:firstColumn="1" w:lastColumn="0" w:noHBand="0" w:noVBand="1"/>
@@ -9993,7 +10067,7 @@
             <w:hyperlink r:id="rId21" w:history="1">
               <w:r>
                 <w:rPr>
-                  <w:rStyle w:val="Hyperlink"/>
+                  <w:rStyle w:val="Hipervnculo"/>
                   <w:rFonts w:ascii="Arial" w:hAnsi="Arial" w:cs="Arial"/>
                   <w:sz w:val="16"/>
                   <w:lang w:val="es-SV"/>
@@ -10479,6 +10553,7 @@
           <w:noProof/>
           <w:lang w:val="es-SV" w:eastAsia="es-SV"/>
         </w:rPr>
+        <w:lastRenderedPageBreak/>
         <w:drawing>
           <wp:inline distT="0" distB="0" distL="0" distR="0" wp14:anchorId="2529C15E" wp14:editId="4DEBF89C">
             <wp:extent cx="5612130" cy="2716530"/>
@@ -10657,12 +10732,13 @@
           <w:rFonts w:ascii="Arial" w:hAnsi="Arial" w:cs="Arial"/>
           <w:lang w:val="es-SV"/>
         </w:rPr>
+        <w:lastRenderedPageBreak/>
         <w:t>Caso de Prueba 4:</w:t>
       </w:r>
     </w:p>
     <w:tbl>
       <w:tblPr>
-        <w:tblStyle w:val="TableGrid"/>
+        <w:tblStyle w:val="Tablaconcuadrcula"/>
         <w:tblW w:w="11949" w:type="dxa"/>
         <w:tblInd w:w="-1316" w:type="dxa"/>
         <w:tblLook w:val="04A0" w:firstRow="1" w:lastRow="0" w:firstColumn="1" w:lastColumn="0" w:noHBand="0" w:noVBand="1"/>
@@ -11099,7 +11175,7 @@
             <w:hyperlink r:id="rId26" w:history="1">
               <w:r>
                 <w:rPr>
-                  <w:rStyle w:val="Hyperlink"/>
+                  <w:rStyle w:val="Hipervnculo"/>
                   <w:rFonts w:ascii="Arial" w:hAnsi="Arial" w:cs="Arial"/>
                   <w:sz w:val="16"/>
                   <w:lang w:val="es-SV"/>
@@ -11585,6 +11661,7 @@
           <w:noProof/>
           <w:lang w:val="es-SV" w:eastAsia="es-SV"/>
         </w:rPr>
+        <w:lastRenderedPageBreak/>
         <w:drawing>
           <wp:inline distT="0" distB="0" distL="0" distR="0" wp14:anchorId="2D9A4525" wp14:editId="125B61D4">
             <wp:extent cx="5293360" cy="1507137"/>
@@ -11655,7 +11732,7 @@
     </w:p>
     <w:tbl>
       <w:tblPr>
-        <w:tblStyle w:val="TableGrid"/>
+        <w:tblStyle w:val="Tablaconcuadrcula"/>
         <w:tblW w:w="11949" w:type="dxa"/>
         <w:tblInd w:w="-1316" w:type="dxa"/>
         <w:tblLook w:val="04A0" w:firstRow="1" w:lastRow="0" w:firstColumn="1" w:lastColumn="0" w:noHBand="0" w:noVBand="1"/>
@@ -12110,7 +12187,7 @@
             <w:hyperlink r:id="rId30" w:history="1">
               <w:r>
                 <w:rPr>
-                  <w:rStyle w:val="Hyperlink"/>
+                  <w:rStyle w:val="Hipervnculo"/>
                   <w:rFonts w:ascii="Arial" w:hAnsi="Arial" w:cs="Arial"/>
                   <w:sz w:val="16"/>
                   <w:lang w:val="es-SV"/>
@@ -12543,6 +12620,7 @@
           <w:noProof/>
           <w:lang w:val="es-SV" w:eastAsia="es-SV"/>
         </w:rPr>
+        <w:lastRenderedPageBreak/>
         <w:drawing>
           <wp:inline distT="0" distB="0" distL="0" distR="0" wp14:anchorId="56C4BD22" wp14:editId="5498A741">
             <wp:extent cx="4683760" cy="1806450"/>
@@ -12712,12 +12790,13 @@
           <w:rFonts w:ascii="Arial" w:hAnsi="Arial" w:cs="Arial"/>
           <w:lang w:val="es-SV"/>
         </w:rPr>
+        <w:lastRenderedPageBreak/>
         <w:t>Caso de Prueba 6:</w:t>
       </w:r>
     </w:p>
     <w:tbl>
       <w:tblPr>
-        <w:tblStyle w:val="TableGrid"/>
+        <w:tblStyle w:val="Tablaconcuadrcula"/>
         <w:tblW w:w="11949" w:type="dxa"/>
         <w:tblInd w:w="-1316" w:type="dxa"/>
         <w:tblLook w:val="04A0" w:firstRow="1" w:lastRow="0" w:firstColumn="1" w:lastColumn="0" w:noHBand="0" w:noVBand="1"/>
@@ -13162,7 +13241,7 @@
             <w:hyperlink r:id="rId34" w:history="1">
               <w:r>
                 <w:rPr>
-                  <w:rStyle w:val="Hyperlink"/>
+                  <w:rStyle w:val="Hipervnculo"/>
                   <w:rFonts w:ascii="Arial" w:hAnsi="Arial" w:cs="Arial"/>
                   <w:sz w:val="16"/>
                   <w:lang w:val="es-SV"/>
@@ -13357,7 +13436,7 @@
             <w:hyperlink r:id="rId35" w:history="1">
               <w:r>
                 <w:rPr>
-                  <w:rStyle w:val="Hyperlink"/>
+                  <w:rStyle w:val="Hipervnculo"/>
                   <w:rFonts w:ascii="Arial" w:hAnsi="Arial" w:cs="Arial"/>
                   <w:sz w:val="16"/>
                   <w:lang w:val="es-SV"/>
@@ -13867,6 +13946,7 @@
           <w:rFonts w:ascii="Arial" w:hAnsi="Arial" w:cs="Arial"/>
           <w:lang w:val="es-SV"/>
         </w:rPr>
+        <w:lastRenderedPageBreak/>
         <w:t>Creación del usuario</w:t>
       </w:r>
     </w:p>
@@ -14099,6 +14179,7 @@
           <w:rFonts w:ascii="Arial" w:hAnsi="Arial" w:cs="Arial"/>
           <w:lang w:val="es-SV"/>
         </w:rPr>
+        <w:lastRenderedPageBreak/>
         <w:t>Base de datos con el nuevo usuario</w:t>
       </w:r>
     </w:p>
@@ -14171,7 +14252,7 @@
     </w:p>
     <w:p>
       <w:pPr>
-        <w:pStyle w:val="Heading3"/>
+        <w:pStyle w:val="Ttulo3"/>
         <w:rPr>
           <w:rFonts w:ascii="Arial" w:hAnsi="Arial" w:cs="Arial"/>
           <w:color w:val="000000" w:themeColor="text1"/>
@@ -14180,7 +14261,7 @@
         </w:rPr>
       </w:pPr>
       <w:bookmarkStart w:id="12" w:name="_Toc229775097"/>
-      <w:bookmarkStart w:id="13" w:name="_Toc230280260"/>
+      <w:bookmarkStart w:id="13" w:name="_Toc230370785"/>
       <w:r>
         <w:rPr>
           <w:rFonts w:ascii="Arial" w:hAnsi="Arial" w:cs="Arial"/>
@@ -14229,7 +14310,7 @@
     </w:p>
     <w:tbl>
       <w:tblPr>
-        <w:tblStyle w:val="TableGrid"/>
+        <w:tblStyle w:val="Tablaconcuadrcula"/>
         <w:tblW w:w="11949" w:type="dxa"/>
         <w:tblInd w:w="-1316" w:type="dxa"/>
         <w:tblLook w:val="04A0" w:firstRow="1" w:lastRow="0" w:firstColumn="1" w:lastColumn="0" w:noHBand="0" w:noVBand="1"/>
@@ -14666,7 +14747,7 @@
             <w:hyperlink r:id="rId41" w:history="1">
               <w:r>
                 <w:rPr>
-                  <w:rStyle w:val="Hyperlink"/>
+                  <w:rStyle w:val="Hipervnculo"/>
                   <w:rFonts w:ascii="Arial" w:hAnsi="Arial" w:cs="Arial"/>
                   <w:sz w:val="16"/>
                   <w:lang w:val="es-SV"/>
@@ -15044,12 +15125,13 @@
           <w:rFonts w:ascii="Arial" w:hAnsi="Arial" w:cs="Arial"/>
           <w:lang w:val="es-SV"/>
         </w:rPr>
+        <w:lastRenderedPageBreak/>
         <w:t>Caso de Prueba 8:</w:t>
       </w:r>
     </w:p>
     <w:tbl>
       <w:tblPr>
-        <w:tblStyle w:val="TableGrid"/>
+        <w:tblStyle w:val="Tablaconcuadrcula"/>
         <w:tblW w:w="11949" w:type="dxa"/>
         <w:tblInd w:w="-1316" w:type="dxa"/>
         <w:tblLook w:val="04A0" w:firstRow="1" w:lastRow="0" w:firstColumn="1" w:lastColumn="0" w:noHBand="0" w:noVBand="1"/>
@@ -15486,7 +15568,7 @@
             <w:hyperlink r:id="rId42" w:history="1">
               <w:r>
                 <w:rPr>
-                  <w:rStyle w:val="Hyperlink"/>
+                  <w:rStyle w:val="Hipervnculo"/>
                   <w:rFonts w:ascii="Arial" w:hAnsi="Arial" w:cs="Arial"/>
                   <w:sz w:val="16"/>
                   <w:lang w:val="es-SV"/>
@@ -15969,12 +16051,13 @@
           <w:rFonts w:ascii="Arial" w:hAnsi="Arial" w:cs="Arial"/>
           <w:lang w:val="es-SV"/>
         </w:rPr>
+        <w:lastRenderedPageBreak/>
         <w:t>Caso de Prueba 9:</w:t>
       </w:r>
     </w:p>
     <w:tbl>
       <w:tblPr>
-        <w:tblStyle w:val="TableGrid"/>
+        <w:tblStyle w:val="Tablaconcuadrcula"/>
         <w:tblW w:w="11949" w:type="dxa"/>
         <w:tblInd w:w="-1316" w:type="dxa"/>
         <w:tblLook w:val="04A0" w:firstRow="1" w:lastRow="0" w:firstColumn="1" w:lastColumn="0" w:noHBand="0" w:noVBand="1"/>
@@ -16411,7 +16494,7 @@
             <w:hyperlink r:id="rId43" w:history="1">
               <w:r>
                 <w:rPr>
-                  <w:rStyle w:val="Hyperlink"/>
+                  <w:rStyle w:val="Hipervnculo"/>
                   <w:rFonts w:ascii="Arial" w:hAnsi="Arial" w:cs="Arial"/>
                   <w:sz w:val="16"/>
                   <w:lang w:val="es-SV"/>
@@ -16951,12 +17034,13 @@
           <w:rFonts w:ascii="Arial" w:hAnsi="Arial" w:cs="Arial"/>
           <w:lang w:val="es-SV"/>
         </w:rPr>
+        <w:lastRenderedPageBreak/>
         <w:t>Caso de Prueba 10:</w:t>
       </w:r>
     </w:p>
     <w:tbl>
       <w:tblPr>
-        <w:tblStyle w:val="TableGrid"/>
+        <w:tblStyle w:val="Tablaconcuadrcula"/>
         <w:tblW w:w="11949" w:type="dxa"/>
         <w:tblInd w:w="-1316" w:type="dxa"/>
         <w:tblLook w:val="04A0" w:firstRow="1" w:lastRow="0" w:firstColumn="1" w:lastColumn="0" w:noHBand="0" w:noVBand="1"/>
@@ -17393,7 +17477,7 @@
             <w:hyperlink r:id="rId44" w:history="1">
               <w:r>
                 <w:rPr>
-                  <w:rStyle w:val="Hyperlink"/>
+                  <w:rStyle w:val="Hipervnculo"/>
                   <w:rFonts w:ascii="Arial" w:hAnsi="Arial" w:cs="Arial"/>
                   <w:sz w:val="16"/>
                   <w:lang w:val="es-SV"/>
@@ -17769,7 +17853,7 @@
     </w:p>
     <w:tbl>
       <w:tblPr>
-        <w:tblStyle w:val="TableGrid"/>
+        <w:tblStyle w:val="Tablaconcuadrcula"/>
         <w:tblW w:w="11949" w:type="dxa"/>
         <w:tblInd w:w="-1316" w:type="dxa"/>
         <w:tblLook w:val="04A0" w:firstRow="1" w:lastRow="0" w:firstColumn="1" w:lastColumn="0" w:noHBand="0" w:noVBand="1"/>
@@ -18198,7 +18282,7 @@
             <w:hyperlink r:id="rId45" w:history="1">
               <w:r>
                 <w:rPr>
-                  <w:rStyle w:val="Hyperlink"/>
+                  <w:rStyle w:val="Hipervnculo"/>
                   <w:rFonts w:ascii="Arial" w:hAnsi="Arial" w:cs="Arial"/>
                   <w:sz w:val="16"/>
                   <w:lang w:val="es-SV"/>
@@ -18544,12 +18628,13 @@
           <w:rFonts w:ascii="Arial" w:hAnsi="Arial" w:cs="Arial"/>
           <w:lang w:val="es-SV"/>
         </w:rPr>
+        <w:lastRenderedPageBreak/>
         <w:t>Caso de Prueba 12:</w:t>
       </w:r>
     </w:p>
     <w:tbl>
       <w:tblPr>
-        <w:tblStyle w:val="TableGrid"/>
+        <w:tblStyle w:val="Tablaconcuadrcula"/>
         <w:tblW w:w="11949" w:type="dxa"/>
         <w:tblInd w:w="-1316" w:type="dxa"/>
         <w:tblLook w:val="04A0" w:firstRow="1" w:lastRow="0" w:firstColumn="1" w:lastColumn="0" w:noHBand="0" w:noVBand="1"/>
@@ -19014,7 +19099,7 @@
             <w:hyperlink r:id="rId46" w:history="1">
               <w:r>
                 <w:rPr>
-                  <w:rStyle w:val="Hyperlink"/>
+                  <w:rStyle w:val="Hipervnculo"/>
                   <w:rFonts w:ascii="Arial" w:hAnsi="Arial" w:cs="Arial"/>
                   <w:sz w:val="16"/>
                   <w:lang w:val="es-SV"/>
@@ -19375,7 +19460,7 @@
     </w:p>
     <w:p>
       <w:pPr>
-        <w:pStyle w:val="Heading1"/>
+        <w:pStyle w:val="Ttulo1"/>
         <w:spacing w:line="360" w:lineRule="auto"/>
         <w:rPr>
           <w:rFonts w:ascii="Arial" w:hAnsi="Arial" w:cs="Arial"/>
@@ -19388,7 +19473,7 @@
         </w:rPr>
       </w:pPr>
       <w:bookmarkStart w:id="14" w:name="_Toc229775098"/>
-      <w:bookmarkStart w:id="15" w:name="_Toc230280261"/>
+      <w:bookmarkStart w:id="15" w:name="_Toc230370786"/>
       <w:r>
         <w:rPr>
           <w:rFonts w:ascii="Arial" w:hAnsi="Arial" w:cs="Arial"/>
@@ -19429,7 +19514,7 @@
     </w:p>
     <w:p>
       <w:pPr>
-        <w:pStyle w:val="Heading2"/>
+        <w:pStyle w:val="Ttulo2"/>
         <w:rPr>
           <w:rFonts w:ascii="Arial" w:hAnsi="Arial" w:cs="Arial"/>
           <w:color w:val="auto"/>
@@ -19439,7 +19524,7 @@
         </w:rPr>
       </w:pPr>
       <w:bookmarkStart w:id="16" w:name="_Toc229775099"/>
-      <w:bookmarkStart w:id="17" w:name="_Toc230280262"/>
+      <w:bookmarkStart w:id="17" w:name="_Toc230370787"/>
       <w:r>
         <w:rPr>
           <w:rFonts w:ascii="Arial" w:hAnsi="Arial" w:cs="Arial"/>
@@ -19516,7 +19601,7 @@
     </w:p>
     <w:p>
       <w:pPr>
-        <w:pStyle w:val="ListParagraph"/>
+        <w:pStyle w:val="Prrafodelista"/>
         <w:numPr>
           <w:ilvl w:val="0"/>
           <w:numId w:val="40"/>
@@ -19531,12 +19616,13 @@
           <w:rFonts w:ascii="Arial" w:hAnsi="Arial" w:cs="Arial"/>
           <w:lang w:val="es-SV"/>
         </w:rPr>
+        <w:lastRenderedPageBreak/>
         <w:t xml:space="preserve">Ingresar a la plataforma por medio de un usuario que tenga el rol de administrador (ya que es el único que puede crear nuevos usuarios). </w:t>
       </w:r>
     </w:p>
     <w:p>
       <w:pPr>
-        <w:pStyle w:val="ListParagraph"/>
+        <w:pStyle w:val="Prrafodelista"/>
         <w:numPr>
           <w:ilvl w:val="0"/>
           <w:numId w:val="40"/>
@@ -19556,7 +19642,7 @@
     </w:p>
     <w:p>
       <w:pPr>
-        <w:pStyle w:val="ListParagraph"/>
+        <w:pStyle w:val="Prrafodelista"/>
         <w:numPr>
           <w:ilvl w:val="0"/>
           <w:numId w:val="40"/>
@@ -19576,7 +19662,7 @@
     </w:p>
     <w:p>
       <w:pPr>
-        <w:pStyle w:val="ListParagraph"/>
+        <w:pStyle w:val="Prrafodelista"/>
         <w:numPr>
           <w:ilvl w:val="0"/>
           <w:numId w:val="40"/>
@@ -19798,6 +19884,7 @@
           <w:noProof/>
           <w:lang w:eastAsia="es-SV"/>
         </w:rPr>
+        <w:lastRenderedPageBreak/>
         <w:drawing>
           <wp:inline distT="0" distB="0" distL="0" distR="0" wp14:anchorId="7D4C050C" wp14:editId="686AA9B3">
             <wp:extent cx="3246120" cy="2965314"/>
@@ -19853,7 +19940,7 @@
     </w:p>
     <w:p>
       <w:pPr>
-        <w:pStyle w:val="Heading2"/>
+        <w:pStyle w:val="Ttulo2"/>
         <w:rPr>
           <w:rFonts w:ascii="Arial" w:hAnsi="Arial" w:cs="Arial"/>
           <w:color w:val="auto"/>
@@ -19863,7 +19950,7 @@
         </w:rPr>
       </w:pPr>
       <w:bookmarkStart w:id="18" w:name="_Toc229775100"/>
-      <w:bookmarkStart w:id="19" w:name="_Toc230280263"/>
+      <w:bookmarkStart w:id="19" w:name="_Toc230370788"/>
       <w:r>
         <w:rPr>
           <w:rFonts w:ascii="Arial" w:hAnsi="Arial" w:cs="Arial"/>
@@ -19924,7 +20011,7 @@
     </w:p>
     <w:p>
       <w:pPr>
-        <w:pStyle w:val="ListParagraph"/>
+        <w:pStyle w:val="Prrafodelista"/>
         <w:numPr>
           <w:ilvl w:val="0"/>
           <w:numId w:val="42"/>
@@ -19944,7 +20031,7 @@
     </w:p>
     <w:p>
       <w:pPr>
-        <w:pStyle w:val="ListParagraph"/>
+        <w:pStyle w:val="Prrafodelista"/>
         <w:numPr>
           <w:ilvl w:val="0"/>
           <w:numId w:val="42"/>
@@ -19964,7 +20051,7 @@
     </w:p>
     <w:p>
       <w:pPr>
-        <w:pStyle w:val="ListParagraph"/>
+        <w:pStyle w:val="Prrafodelista"/>
         <w:numPr>
           <w:ilvl w:val="0"/>
           <w:numId w:val="42"/>
@@ -19984,7 +20071,7 @@
     </w:p>
     <w:p>
       <w:pPr>
-        <w:pStyle w:val="ListParagraph"/>
+        <w:pStyle w:val="Prrafodelista"/>
         <w:numPr>
           <w:ilvl w:val="0"/>
           <w:numId w:val="42"/>
@@ -20089,6 +20176,7 @@
           <w:rFonts w:ascii="Arial" w:hAnsi="Arial" w:cs="Arial"/>
           <w:lang w:val="es-SV"/>
         </w:rPr>
+        <w:lastRenderedPageBreak/>
         <w:t xml:space="preserve">Evidencia: </w:t>
       </w:r>
     </w:p>
@@ -20177,7 +20265,7 @@
     </w:p>
     <w:p>
       <w:pPr>
-        <w:pStyle w:val="Heading2"/>
+        <w:pStyle w:val="Ttulo2"/>
         <w:rPr>
           <w:rFonts w:ascii="Arial" w:hAnsi="Arial" w:cs="Arial"/>
           <w:color w:val="auto"/>
@@ -20187,7 +20275,7 @@
         </w:rPr>
       </w:pPr>
       <w:bookmarkStart w:id="20" w:name="_Toc229775101"/>
-      <w:bookmarkStart w:id="21" w:name="_Toc230280264"/>
+      <w:bookmarkStart w:id="21" w:name="_Toc230370789"/>
       <w:r>
         <w:rPr>
           <w:rFonts w:ascii="Arial" w:hAnsi="Arial" w:cs="Arial"/>
@@ -20248,7 +20336,7 @@
     </w:p>
     <w:p>
       <w:pPr>
-        <w:pStyle w:val="ListParagraph"/>
+        <w:pStyle w:val="Prrafodelista"/>
         <w:numPr>
           <w:ilvl w:val="0"/>
           <w:numId w:val="44"/>
@@ -20268,7 +20356,7 @@
     </w:p>
     <w:p>
       <w:pPr>
-        <w:pStyle w:val="ListParagraph"/>
+        <w:pStyle w:val="Prrafodelista"/>
         <w:numPr>
           <w:ilvl w:val="0"/>
           <w:numId w:val="44"/>
@@ -20288,7 +20376,7 @@
     </w:p>
     <w:p>
       <w:pPr>
-        <w:pStyle w:val="ListParagraph"/>
+        <w:pStyle w:val="Prrafodelista"/>
         <w:numPr>
           <w:ilvl w:val="0"/>
           <w:numId w:val="44"/>
@@ -20308,7 +20396,7 @@
     </w:p>
     <w:p>
       <w:pPr>
-        <w:pStyle w:val="ListParagraph"/>
+        <w:pStyle w:val="Prrafodelista"/>
         <w:numPr>
           <w:ilvl w:val="0"/>
           <w:numId w:val="44"/>
@@ -20328,7 +20416,7 @@
     </w:p>
     <w:p>
       <w:pPr>
-        <w:pStyle w:val="ListParagraph"/>
+        <w:pStyle w:val="Prrafodelista"/>
         <w:numPr>
           <w:ilvl w:val="0"/>
           <w:numId w:val="44"/>
@@ -20348,7 +20436,7 @@
     </w:p>
     <w:p>
       <w:pPr>
-        <w:pStyle w:val="ListParagraph"/>
+        <w:pStyle w:val="Prrafodelista"/>
         <w:numPr>
           <w:ilvl w:val="0"/>
           <w:numId w:val="44"/>
@@ -20486,6 +20574,7 @@
           <w:noProof/>
           <w:lang w:val="es-SV"/>
         </w:rPr>
+        <w:lastRenderedPageBreak/>
         <w:drawing>
           <wp:inline distT="0" distB="0" distL="0" distR="0" wp14:anchorId="4D9BFA27" wp14:editId="73D87B3D">
             <wp:extent cx="3574600" cy="2743200"/>
@@ -20541,7 +20630,7 @@
     </w:p>
     <w:p>
       <w:pPr>
-        <w:pStyle w:val="Heading2"/>
+        <w:pStyle w:val="Ttulo2"/>
         <w:rPr>
           <w:rFonts w:ascii="Arial" w:hAnsi="Arial" w:cs="Arial"/>
           <w:color w:val="auto"/>
@@ -20551,7 +20640,7 @@
         </w:rPr>
       </w:pPr>
       <w:bookmarkStart w:id="22" w:name="_Toc229775102"/>
-      <w:bookmarkStart w:id="23" w:name="_Toc230280265"/>
+      <w:bookmarkStart w:id="23" w:name="_Toc230370790"/>
       <w:r>
         <w:rPr>
           <w:rFonts w:ascii="Arial" w:hAnsi="Arial" w:cs="Arial"/>
@@ -20612,7 +20701,7 @@
     </w:p>
     <w:p>
       <w:pPr>
-        <w:pStyle w:val="ListParagraph"/>
+        <w:pStyle w:val="Prrafodelista"/>
         <w:numPr>
           <w:ilvl w:val="0"/>
           <w:numId w:val="46"/>
@@ -20632,7 +20721,7 @@
     </w:p>
     <w:p>
       <w:pPr>
-        <w:pStyle w:val="ListParagraph"/>
+        <w:pStyle w:val="Prrafodelista"/>
         <w:numPr>
           <w:ilvl w:val="0"/>
           <w:numId w:val="46"/>
@@ -20652,7 +20741,7 @@
     </w:p>
     <w:p>
       <w:pPr>
-        <w:pStyle w:val="ListParagraph"/>
+        <w:pStyle w:val="Prrafodelista"/>
         <w:numPr>
           <w:ilvl w:val="0"/>
           <w:numId w:val="46"/>
@@ -20672,7 +20761,7 @@
     </w:p>
     <w:p>
       <w:pPr>
-        <w:pStyle w:val="ListParagraph"/>
+        <w:pStyle w:val="Prrafodelista"/>
         <w:numPr>
           <w:ilvl w:val="0"/>
           <w:numId w:val="46"/>
@@ -20777,6 +20866,7 @@
           <w:rFonts w:ascii="Arial" w:hAnsi="Arial" w:cs="Arial"/>
           <w:lang w:val="es-SV"/>
         </w:rPr>
+        <w:lastRenderedPageBreak/>
         <w:t xml:space="preserve">Evidencia: </w:t>
       </w:r>
     </w:p>
@@ -20933,7 +21023,7 @@
     </w:p>
     <w:p>
       <w:pPr>
-        <w:pStyle w:val="Heading2"/>
+        <w:pStyle w:val="Ttulo2"/>
         <w:rPr>
           <w:rFonts w:ascii="Arial" w:hAnsi="Arial" w:cs="Arial"/>
           <w:color w:val="auto"/>
@@ -20943,7 +21033,7 @@
         </w:rPr>
       </w:pPr>
       <w:bookmarkStart w:id="24" w:name="_Toc229775103"/>
-      <w:bookmarkStart w:id="25" w:name="_Toc230280266"/>
+      <w:bookmarkStart w:id="25" w:name="_Toc230370791"/>
       <w:r>
         <w:rPr>
           <w:rFonts w:ascii="Arial" w:hAnsi="Arial" w:cs="Arial"/>
@@ -21004,7 +21094,7 @@
     </w:p>
     <w:p>
       <w:pPr>
-        <w:pStyle w:val="ListParagraph"/>
+        <w:pStyle w:val="Prrafodelista"/>
         <w:numPr>
           <w:ilvl w:val="0"/>
           <w:numId w:val="48"/>
@@ -21024,7 +21114,7 @@
     </w:p>
     <w:p>
       <w:pPr>
-        <w:pStyle w:val="ListParagraph"/>
+        <w:pStyle w:val="Prrafodelista"/>
         <w:numPr>
           <w:ilvl w:val="0"/>
           <w:numId w:val="48"/>
@@ -21044,7 +21134,7 @@
     </w:p>
     <w:p>
       <w:pPr>
-        <w:pStyle w:val="ListParagraph"/>
+        <w:pStyle w:val="Prrafodelista"/>
         <w:numPr>
           <w:ilvl w:val="0"/>
           <w:numId w:val="48"/>
@@ -21064,7 +21154,7 @@
     </w:p>
     <w:p>
       <w:pPr>
-        <w:pStyle w:val="ListParagraph"/>
+        <w:pStyle w:val="Prrafodelista"/>
         <w:numPr>
           <w:ilvl w:val="0"/>
           <w:numId w:val="48"/>
@@ -21084,7 +21174,7 @@
     </w:p>
     <w:p>
       <w:pPr>
-        <w:pStyle w:val="ListParagraph"/>
+        <w:pStyle w:val="Prrafodelista"/>
         <w:numPr>
           <w:ilvl w:val="0"/>
           <w:numId w:val="48"/>
@@ -21114,6 +21204,7 @@
           <w:rFonts w:ascii="Arial" w:hAnsi="Arial" w:cs="Arial"/>
           <w:lang w:val="es-SV"/>
         </w:rPr>
+        <w:lastRenderedPageBreak/>
         <w:t xml:space="preserve">Resultado esperado: Que el usuario sea redireccionado a su página principal, donde no aparecen las opciones avanzadas del administrador. </w:t>
       </w:r>
     </w:p>
@@ -21383,6 +21474,7 @@
           <w:noProof/>
           <w:lang w:eastAsia="es-SV"/>
         </w:rPr>
+        <w:lastRenderedPageBreak/>
         <w:drawing>
           <wp:inline distT="0" distB="0" distL="0" distR="0" wp14:anchorId="54693307" wp14:editId="62D76DAE">
             <wp:extent cx="5612130" cy="2263775"/>
@@ -21618,12 +21710,13 @@
           <w:rFonts w:ascii="Arial" w:hAnsi="Arial" w:cs="Arial"/>
           <w:lang w:val="es-SV"/>
         </w:rPr>
+        <w:lastRenderedPageBreak/>
         <w:t xml:space="preserve">Mensaje de correo o contraseña incorrecto al intentar ingresar a la sesión. </w:t>
       </w:r>
     </w:p>
     <w:p>
       <w:pPr>
-        <w:pStyle w:val="ListParagraph"/>
+        <w:pStyle w:val="Prrafodelista"/>
         <w:numPr>
           <w:ilvl w:val="1"/>
           <w:numId w:val="50"/>
@@ -21644,7 +21737,7 @@
     </w:p>
     <w:p>
       <w:pPr>
-        <w:pStyle w:val="ListParagraph"/>
+        <w:pStyle w:val="Prrafodelista"/>
         <w:numPr>
           <w:ilvl w:val="1"/>
           <w:numId w:val="50"/>
@@ -21665,7 +21758,7 @@
     </w:p>
     <w:p>
       <w:pPr>
-        <w:pStyle w:val="ListParagraph"/>
+        <w:pStyle w:val="Prrafodelista"/>
         <w:numPr>
           <w:ilvl w:val="0"/>
           <w:numId w:val="50"/>
@@ -21686,7 +21779,7 @@
     </w:p>
     <w:p>
       <w:pPr>
-        <w:pStyle w:val="ListParagraph"/>
+        <w:pStyle w:val="Prrafodelista"/>
         <w:numPr>
           <w:ilvl w:val="1"/>
           <w:numId w:val="50"/>
@@ -21707,7 +21800,7 @@
     </w:p>
     <w:p>
       <w:pPr>
-        <w:pStyle w:val="ListParagraph"/>
+        <w:pStyle w:val="Prrafodelista"/>
         <w:numPr>
           <w:ilvl w:val="1"/>
           <w:numId w:val="50"/>
@@ -21728,7 +21821,7 @@
     </w:p>
     <w:p>
       <w:pPr>
-        <w:pStyle w:val="ListParagraph"/>
+        <w:pStyle w:val="Prrafodelista"/>
         <w:numPr>
           <w:ilvl w:val="1"/>
           <w:numId w:val="50"/>
@@ -21749,7 +21842,7 @@
     </w:p>
     <w:p>
       <w:pPr>
-        <w:pStyle w:val="ListParagraph"/>
+        <w:pStyle w:val="Prrafodelista"/>
         <w:numPr>
           <w:ilvl w:val="1"/>
           <w:numId w:val="50"/>
@@ -21770,7 +21863,7 @@
     </w:p>
     <w:p>
       <w:pPr>
-        <w:pStyle w:val="ListParagraph"/>
+        <w:pStyle w:val="Prrafodelista"/>
         <w:numPr>
           <w:ilvl w:val="0"/>
           <w:numId w:val="50"/>
@@ -21791,7 +21884,7 @@
     </w:p>
     <w:p>
       <w:pPr>
-        <w:pStyle w:val="ListParagraph"/>
+        <w:pStyle w:val="Prrafodelista"/>
         <w:numPr>
           <w:ilvl w:val="0"/>
           <w:numId w:val="50"/>
@@ -21812,7 +21905,7 @@
     </w:p>
     <w:p>
       <w:pPr>
-        <w:pStyle w:val="ListParagraph"/>
+        <w:pStyle w:val="Prrafodelista"/>
         <w:numPr>
           <w:ilvl w:val="0"/>
           <w:numId w:val="50"/>
@@ -21833,7 +21926,7 @@
     </w:p>
     <w:p>
       <w:pPr>
-        <w:pStyle w:val="ListParagraph"/>
+        <w:pStyle w:val="Prrafodelista"/>
         <w:numPr>
           <w:ilvl w:val="0"/>
           <w:numId w:val="50"/>
@@ -21870,7 +21963,7 @@
     </w:p>
     <w:p>
       <w:pPr>
-        <w:pStyle w:val="ListParagraph"/>
+        <w:pStyle w:val="Prrafodelista"/>
         <w:numPr>
           <w:ilvl w:val="0"/>
           <w:numId w:val="50"/>
@@ -21886,12 +21979,26 @@
           <w:rFonts w:ascii="Arial" w:hAnsi="Arial" w:cs="Arial"/>
           <w:lang w:val="es-SV"/>
         </w:rPr>
-        <w:t xml:space="preserve">El estado de los documentos: Para evitar confusiones y que los usuarios ocupen documentos que aun estén pendientes o que hayan sido rechazados, hemos puesto bien claro y con color los distintos estados de los documentos. Esto es más accesible a la viste de los usuarios y hace el reconocimiento de dichos documentos más fáciles (verde – aprobado, amarillo – pendiente, rojo – rechazad). </w:t>
-      </w:r>
-    </w:p>
-    <w:p>
-      <w:pPr>
-        <w:pStyle w:val="ListParagraph"/>
+        <w:t>El estado de los documentos: Para evitar confusiones y que los usuarios ocupen documentos que aun estén pendientes o que hayan sido rechazados, hemos puesto bien claro y con color los distintos estados de los documentos. Esto es más accesible a la viste de los usuarios y hace el reconocimiento de dichos documentos más fáciles (verde – aprobado, amarillo – pendiente, rojo – rechazad</w:t>
+      </w:r>
+      <w:r>
+        <w:rPr>
+          <w:rFonts w:ascii="Arial" w:hAnsi="Arial" w:cs="Arial"/>
+          <w:lang w:val="es-SV"/>
+        </w:rPr>
+        <w:t>o</w:t>
+      </w:r>
+      <w:r>
+        <w:rPr>
+          <w:rFonts w:ascii="Arial" w:hAnsi="Arial" w:cs="Arial"/>
+          <w:lang w:val="es-SV"/>
+        </w:rPr>
+        <w:t xml:space="preserve">). </w:t>
+      </w:r>
+    </w:p>
+    <w:p>
+      <w:pPr>
+        <w:pStyle w:val="Prrafodelista"/>
         <w:numPr>
           <w:ilvl w:val="0"/>
           <w:numId w:val="50"/>
@@ -21907,30 +22014,8 @@
           <w:rFonts w:ascii="Arial" w:hAnsi="Arial" w:cs="Arial"/>
           <w:lang w:val="es-SV"/>
         </w:rPr>
+        <w:lastRenderedPageBreak/>
         <w:t xml:space="preserve">Confirmaciones: Se confirman las operaciones exitosas por medio de notificaciones, las cuales aseguran a los usuarios de que todo se ha realizado exitosamente. </w:t>
-      </w:r>
-    </w:p>
-    <w:p>
-      <w:pPr>
-        <w:rPr>
-          <w:rFonts w:ascii="Arial" w:hAnsi="Arial" w:cs="Arial"/>
-          <w:lang w:val="es-SV"/>
-        </w:rPr>
-      </w:pPr>
-    </w:p>
-    <w:p>
-      <w:pPr>
-        <w:rPr>
-          <w:rFonts w:ascii="Arial" w:hAnsi="Arial" w:cs="Arial"/>
-          <w:lang w:val="es-SV"/>
-        </w:rPr>
-      </w:pPr>
-      <w:r>
-        <w:rPr>
-          <w:rFonts w:ascii="Arial" w:hAnsi="Arial" w:cs="Arial"/>
-          <w:lang w:val="es-SV"/>
-        </w:rPr>
-        <w:br w:type="page"/>
       </w:r>
     </w:p>
     <w:p>
@@ -21962,7 +22047,7 @@
     </w:p>
     <w:tbl>
       <w:tblPr>
-        <w:tblStyle w:val="TableGrid"/>
+        <w:tblStyle w:val="Tablaconcuadrcula"/>
         <w:tblW w:w="0" w:type="auto"/>
         <w:tblLook w:val="04A0" w:firstRow="1" w:lastRow="0" w:firstColumn="1" w:lastColumn="0" w:noHBand="0" w:noVBand="1"/>
       </w:tblPr>
@@ -23293,47 +23378,7 @@
     </w:tbl>
     <w:p>
       <w:pPr>
-        <w:rPr>
-          <w:rFonts w:ascii="Arial" w:hAnsi="Arial" w:cs="Arial"/>
-          <w:lang w:val="es-SV"/>
-        </w:rPr>
-      </w:pPr>
-    </w:p>
-    <w:p>
-      <w:pPr>
-        <w:rPr>
-          <w:rFonts w:ascii="Arial" w:hAnsi="Arial" w:cs="Arial"/>
-          <w:lang w:val="es-SV"/>
-        </w:rPr>
-      </w:pPr>
-    </w:p>
-    <w:p>
-      <w:pPr>
-        <w:rPr>
-          <w:rFonts w:ascii="Arial" w:hAnsi="Arial" w:cs="Arial"/>
-          <w:lang w:val="es-SV"/>
-        </w:rPr>
-      </w:pPr>
-    </w:p>
-    <w:p>
-      <w:pPr>
-        <w:rPr>
-          <w:rFonts w:ascii="Arial" w:hAnsi="Arial" w:cs="Arial"/>
-          <w:lang w:val="es-SV"/>
-        </w:rPr>
-      </w:pPr>
-    </w:p>
-    <w:p>
-      <w:pPr>
-        <w:rPr>
-          <w:rFonts w:ascii="Arial" w:hAnsi="Arial" w:cs="Arial"/>
-          <w:lang w:val="es-SV"/>
-        </w:rPr>
-      </w:pPr>
-    </w:p>
-    <w:p>
-      <w:pPr>
-        <w:pStyle w:val="Heading1"/>
+        <w:pStyle w:val="Ttulo1"/>
         <w:spacing w:line="360" w:lineRule="auto"/>
         <w:rPr>
           <w:rFonts w:ascii="Arial" w:hAnsi="Arial" w:cs="Arial"/>
@@ -23345,7 +23390,7 @@
           <w:lang w:val="es-SV"/>
         </w:rPr>
       </w:pPr>
-      <w:bookmarkStart w:id="29" w:name="_Toc230280267"/>
+      <w:bookmarkStart w:id="29" w:name="_Toc230370792"/>
       <w:r>
         <w:rPr>
           <w:rFonts w:ascii="Arial" w:hAnsi="Arial" w:cs="Arial"/>
@@ -23356,6 +23401,7 @@
           <w:szCs w:val="24"/>
           <w:lang w:val="es-SV"/>
         </w:rPr>
+        <w:lastRenderedPageBreak/>
         <w:t xml:space="preserve">Repositorio de </w:t>
       </w:r>
       <w:proofErr w:type="spellStart"/>
@@ -23385,7 +23431,7 @@
       <w:hyperlink r:id="rId57" w:history="1">
         <w:r>
           <w:rPr>
-            <w:rStyle w:val="Hyperlink"/>
+            <w:rStyle w:val="Hipervnculo"/>
             <w:rFonts w:ascii="Arial" w:hAnsi="Arial" w:cs="Arial"/>
             <w:color w:val="auto"/>
             <w:lang w:val="es-ES"/>
@@ -23566,13 +23612,13 @@
 <w:hdr xmlns:wpc="http://schemas.microsoft.com/office/word/2010/wordprocessingCanvas" xmlns:cx="http://schemas.microsoft.com/office/drawing/2014/chartex" xmlns:cx1="http://schemas.microsoft.com/office/drawing/2015/9/8/chartex" xmlns:cx2="http://schemas.microsoft.com/office/drawing/2015/10/21/chartex" xmlns:cx3="http://schemas.microsoft.com/office/drawing/2016/5/9/chartex" xmlns:cx4="http://schemas.microsoft.com/office/drawing/2016/5/10/chartex" xmlns:cx5="http://schemas.microsoft.com/office/drawing/2016/5/11/chartex" xmlns:cx6="http://schemas.microsoft.com/office/drawing/2016/5/12/chartex" xmlns:cx7="http://schemas.microsoft.com/office/drawing/2016/5/13/chartex" xmlns:cx8="http://schemas.microsoft.com/office/drawing/2016/5/14/chartex" xmlns:mc="http://schemas.openxmlformats.org/markup-compatibility/2006" xmlns:aink="http://schemas.microsoft.com/office/drawing/2016/ink" xmlns:am3d="http://schemas.microsoft.com/office/drawing/2017/model3d" xmlns:o="urn:schemas-microsoft-com:office:office" xmlns:oel="http://schemas.microsoft.com/office/2019/extlst" xmlns:r="http://schemas.openxmlformats.org/officeDocument/2006/relationships" xmlns:m="http://schemas.openxmlformats.org/officeDocument/2006/math" xmlns:v="urn:schemas-microsoft-com:vml" xmlns:wp14="http://schemas.microsoft.com/office/word/2010/wordprocessingDrawing" xmlns:wp="http://schemas.openxmlformats.org/drawingml/2006/wordprocessingDrawing" xmlns:w10="urn:schemas-microsoft-com:office:word" xmlns:w="http://schemas.openxmlformats.org/wordprocessingml/2006/main" xmlns:w14="http://schemas.microsoft.com/office/word/2010/wordml" xmlns:w15="http://schemas.microsoft.com/office/word/2012/wordml" xmlns:w16cex="http://schemas.microsoft.com/office/word/2018/wordml/cex" xmlns:w16cid="http://schemas.microsoft.com/office/word/2016/wordml/cid" xmlns:w16="http://schemas.microsoft.com/office/word/2018/wordml" xmlns:w16du="http://schemas.microsoft.com/office/word/2023/wordml/word16du" xmlns:w16sdtdh="http://schemas.microsoft.com/office/word/2020/wordml/sdtdatahash" xmlns:w16sdtfl="http://schemas.microsoft.com/office/word/2024/wordml/sdtformatlock" xmlns:w16se="http://schemas.microsoft.com/office/word/2015/wordml/symex" xmlns:wpg="http://schemas.microsoft.com/office/word/2010/wordprocessingGroup" xmlns:wpi="http://schemas.microsoft.com/office/word/2010/wordprocessingInk" xmlns:wne="http://schemas.microsoft.com/office/word/2006/wordml" xmlns:wps="http://schemas.microsoft.com/office/word/2010/wordprocessingShape" mc:Ignorable="w14 w15 w16se w16cid w16 w16cex w16sdtdh w16sdtfl w16du wp14">
   <w:p>
     <w:pPr>
-      <w:pStyle w:val="Header"/>
+      <w:pStyle w:val="Encabezado"/>
       <w:jc w:val="right"/>
     </w:pPr>
   </w:p>
   <w:p>
     <w:pPr>
-      <w:pStyle w:val="Header"/>
+      <w:pStyle w:val="Encabezado"/>
     </w:pPr>
   </w:p>
 </w:hdr>
@@ -23591,7 +23637,7 @@
     <w:sdtContent>
       <w:p>
         <w:pPr>
-          <w:pStyle w:val="Header"/>
+          <w:pStyle w:val="Encabezado"/>
           <w:jc w:val="right"/>
         </w:pPr>
         <w:r>
@@ -23618,7 +23664,7 @@
   </w:sdt>
   <w:p>
     <w:pPr>
-      <w:pStyle w:val="Header"/>
+      <w:pStyle w:val="Encabezado"/>
     </w:pPr>
   </w:p>
 </w:hdr>
@@ -23637,7 +23683,7 @@
     <w:sdtContent>
       <w:p>
         <w:pPr>
-          <w:pStyle w:val="Header"/>
+          <w:pStyle w:val="Encabezado"/>
           <w:jc w:val="right"/>
         </w:pPr>
         <w:r>
@@ -23664,7 +23710,7 @@
   </w:sdt>
   <w:p>
     <w:pPr>
-      <w:pStyle w:val="Header"/>
+      <w:pStyle w:val="Encabezado"/>
     </w:pPr>
   </w:p>
 </w:hdr>
@@ -28986,11 +29032,11 @@
     <w:name w:val="Normal"/>
     <w:qFormat/>
   </w:style>
-  <w:style w:type="paragraph" w:styleId="Heading1">
+  <w:style w:type="paragraph" w:styleId="Ttulo1">
     <w:name w:val="heading 1"/>
     <w:basedOn w:val="Normal"/>
     <w:next w:val="Normal"/>
-    <w:link w:val="Heading1Char"/>
+    <w:link w:val="Ttulo1Car"/>
     <w:uiPriority w:val="9"/>
     <w:qFormat/>
     <w:rsid w:val="00FD2B2A"/>
@@ -29007,11 +29053,11 @@
       <w:szCs w:val="40"/>
     </w:rPr>
   </w:style>
-  <w:style w:type="paragraph" w:styleId="Heading2">
+  <w:style w:type="paragraph" w:styleId="Ttulo2">
     <w:name w:val="heading 2"/>
     <w:basedOn w:val="Normal"/>
     <w:next w:val="Normal"/>
-    <w:link w:val="Heading2Char"/>
+    <w:link w:val="Ttulo2Car"/>
     <w:uiPriority w:val="9"/>
     <w:unhideWhenUsed/>
     <w:qFormat/>
@@ -29029,11 +29075,11 @@
       <w:szCs w:val="32"/>
     </w:rPr>
   </w:style>
-  <w:style w:type="paragraph" w:styleId="Heading3">
+  <w:style w:type="paragraph" w:styleId="Ttulo3">
     <w:name w:val="heading 3"/>
     <w:basedOn w:val="Normal"/>
     <w:next w:val="Normal"/>
-    <w:link w:val="Heading3Char"/>
+    <w:link w:val="Ttulo3Car"/>
     <w:uiPriority w:val="9"/>
     <w:unhideWhenUsed/>
     <w:qFormat/>
@@ -29051,11 +29097,11 @@
       <w:szCs w:val="28"/>
     </w:rPr>
   </w:style>
-  <w:style w:type="paragraph" w:styleId="Heading4">
+  <w:style w:type="paragraph" w:styleId="Ttulo4">
     <w:name w:val="heading 4"/>
     <w:basedOn w:val="Normal"/>
     <w:next w:val="Normal"/>
-    <w:link w:val="Heading4Char"/>
+    <w:link w:val="Ttulo4Car"/>
     <w:uiPriority w:val="9"/>
     <w:semiHidden/>
     <w:unhideWhenUsed/>
@@ -29074,11 +29120,11 @@
       <w:color w:val="0F4761" w:themeColor="accent1" w:themeShade="BF"/>
     </w:rPr>
   </w:style>
-  <w:style w:type="paragraph" w:styleId="Heading5">
+  <w:style w:type="paragraph" w:styleId="Ttulo5">
     <w:name w:val="heading 5"/>
     <w:basedOn w:val="Normal"/>
     <w:next w:val="Normal"/>
-    <w:link w:val="Heading5Char"/>
+    <w:link w:val="Ttulo5Car"/>
     <w:uiPriority w:val="9"/>
     <w:semiHidden/>
     <w:unhideWhenUsed/>
@@ -29095,11 +29141,11 @@
       <w:color w:val="0F4761" w:themeColor="accent1" w:themeShade="BF"/>
     </w:rPr>
   </w:style>
-  <w:style w:type="paragraph" w:styleId="Heading6">
+  <w:style w:type="paragraph" w:styleId="Ttulo6">
     <w:name w:val="heading 6"/>
     <w:basedOn w:val="Normal"/>
     <w:next w:val="Normal"/>
-    <w:link w:val="Heading6Char"/>
+    <w:link w:val="Ttulo6Car"/>
     <w:uiPriority w:val="9"/>
     <w:semiHidden/>
     <w:unhideWhenUsed/>
@@ -29118,11 +29164,11 @@
       <w:color w:val="595959" w:themeColor="text1" w:themeTint="A6"/>
     </w:rPr>
   </w:style>
-  <w:style w:type="paragraph" w:styleId="Heading7">
+  <w:style w:type="paragraph" w:styleId="Ttulo7">
     <w:name w:val="heading 7"/>
     <w:basedOn w:val="Normal"/>
     <w:next w:val="Normal"/>
-    <w:link w:val="Heading7Char"/>
+    <w:link w:val="Ttulo7Car"/>
     <w:uiPriority w:val="9"/>
     <w:semiHidden/>
     <w:unhideWhenUsed/>
@@ -29139,11 +29185,11 @@
       <w:color w:val="595959" w:themeColor="text1" w:themeTint="A6"/>
     </w:rPr>
   </w:style>
-  <w:style w:type="paragraph" w:styleId="Heading8">
+  <w:style w:type="paragraph" w:styleId="Ttulo8">
     <w:name w:val="heading 8"/>
     <w:basedOn w:val="Normal"/>
     <w:next w:val="Normal"/>
-    <w:link w:val="Heading8Char"/>
+    <w:link w:val="Ttulo8Car"/>
     <w:uiPriority w:val="9"/>
     <w:semiHidden/>
     <w:unhideWhenUsed/>
@@ -29162,11 +29208,11 @@
       <w:color w:val="272727" w:themeColor="text1" w:themeTint="D8"/>
     </w:rPr>
   </w:style>
-  <w:style w:type="paragraph" w:styleId="Heading9">
+  <w:style w:type="paragraph" w:styleId="Ttulo9">
     <w:name w:val="heading 9"/>
     <w:basedOn w:val="Normal"/>
     <w:next w:val="Normal"/>
-    <w:link w:val="Heading9Char"/>
+    <w:link w:val="Ttulo9Car"/>
     <w:uiPriority w:val="9"/>
     <w:semiHidden/>
     <w:unhideWhenUsed/>
@@ -29183,13 +29229,13 @@
       <w:color w:val="272727" w:themeColor="text1" w:themeTint="D8"/>
     </w:rPr>
   </w:style>
-  <w:style w:type="character" w:default="1" w:styleId="DefaultParagraphFont">
+  <w:style w:type="character" w:default="1" w:styleId="Fuentedeprrafopredeter">
     <w:name w:val="Default Paragraph Font"/>
     <w:uiPriority w:val="1"/>
     <w:semiHidden/>
     <w:unhideWhenUsed/>
   </w:style>
-  <w:style w:type="table" w:default="1" w:styleId="TableNormal">
+  <w:style w:type="table" w:default="1" w:styleId="Tablanormal">
     <w:name w:val="Normal Table"/>
     <w:uiPriority w:val="99"/>
     <w:semiHidden/>
@@ -29204,16 +29250,16 @@
       </w:tblCellMar>
     </w:tblPr>
   </w:style>
-  <w:style w:type="numbering" w:default="1" w:styleId="NoList">
+  <w:style w:type="numbering" w:default="1" w:styleId="Sinlista">
     <w:name w:val="No List"/>
     <w:uiPriority w:val="99"/>
     <w:semiHidden/>
     <w:unhideWhenUsed/>
   </w:style>
-  <w:style w:type="character" w:customStyle="1" w:styleId="Heading1Char">
-    <w:name w:val="Heading 1 Char"/>
-    <w:basedOn w:val="DefaultParagraphFont"/>
-    <w:link w:val="Heading1"/>
+  <w:style w:type="character" w:customStyle="1" w:styleId="Ttulo1Car">
+    <w:name w:val="Título 1 Car"/>
+    <w:basedOn w:val="Fuentedeprrafopredeter"/>
+    <w:link w:val="Ttulo1"/>
     <w:uiPriority w:val="9"/>
     <w:rsid w:val="00FD2B2A"/>
     <w:rPr>
@@ -29223,10 +29269,10 @@
       <w:szCs w:val="40"/>
     </w:rPr>
   </w:style>
-  <w:style w:type="character" w:customStyle="1" w:styleId="Heading2Char">
-    <w:name w:val="Heading 2 Char"/>
-    <w:basedOn w:val="DefaultParagraphFont"/>
-    <w:link w:val="Heading2"/>
+  <w:style w:type="character" w:customStyle="1" w:styleId="Ttulo2Car">
+    <w:name w:val="Título 2 Car"/>
+    <w:basedOn w:val="Fuentedeprrafopredeter"/>
+    <w:link w:val="Ttulo2"/>
     <w:uiPriority w:val="9"/>
     <w:rsid w:val="00FD2B2A"/>
     <w:rPr>
@@ -29236,10 +29282,10 @@
       <w:szCs w:val="32"/>
     </w:rPr>
   </w:style>
-  <w:style w:type="character" w:customStyle="1" w:styleId="Heading3Char">
-    <w:name w:val="Heading 3 Char"/>
-    <w:basedOn w:val="DefaultParagraphFont"/>
-    <w:link w:val="Heading3"/>
+  <w:style w:type="character" w:customStyle="1" w:styleId="Ttulo3Car">
+    <w:name w:val="Título 3 Car"/>
+    <w:basedOn w:val="Fuentedeprrafopredeter"/>
+    <w:link w:val="Ttulo3"/>
     <w:uiPriority w:val="9"/>
     <w:rsid w:val="00FD2B2A"/>
     <w:rPr>
@@ -29249,10 +29295,10 @@
       <w:szCs w:val="28"/>
     </w:rPr>
   </w:style>
-  <w:style w:type="character" w:customStyle="1" w:styleId="Heading4Char">
-    <w:name w:val="Heading 4 Char"/>
-    <w:basedOn w:val="DefaultParagraphFont"/>
-    <w:link w:val="Heading4"/>
+  <w:style w:type="character" w:customStyle="1" w:styleId="Ttulo4Car">
+    <w:name w:val="Título 4 Car"/>
+    <w:basedOn w:val="Fuentedeprrafopredeter"/>
+    <w:link w:val="Ttulo4"/>
     <w:uiPriority w:val="9"/>
     <w:semiHidden/>
     <w:rsid w:val="00FD2B2A"/>
@@ -29263,10 +29309,10 @@
       <w:color w:val="0F4761" w:themeColor="accent1" w:themeShade="BF"/>
     </w:rPr>
   </w:style>
-  <w:style w:type="character" w:customStyle="1" w:styleId="Heading5Char">
-    <w:name w:val="Heading 5 Char"/>
-    <w:basedOn w:val="DefaultParagraphFont"/>
-    <w:link w:val="Heading5"/>
+  <w:style w:type="character" w:customStyle="1" w:styleId="Ttulo5Car">
+    <w:name w:val="Título 5 Car"/>
+    <w:basedOn w:val="Fuentedeprrafopredeter"/>
+    <w:link w:val="Ttulo5"/>
     <w:uiPriority w:val="9"/>
     <w:semiHidden/>
     <w:rsid w:val="00FD2B2A"/>
@@ -29275,10 +29321,10 @@
       <w:color w:val="0F4761" w:themeColor="accent1" w:themeShade="BF"/>
     </w:rPr>
   </w:style>
-  <w:style w:type="character" w:customStyle="1" w:styleId="Heading6Char">
-    <w:name w:val="Heading 6 Char"/>
-    <w:basedOn w:val="DefaultParagraphFont"/>
-    <w:link w:val="Heading6"/>
+  <w:style w:type="character" w:customStyle="1" w:styleId="Ttulo6Car">
+    <w:name w:val="Título 6 Car"/>
+    <w:basedOn w:val="Fuentedeprrafopredeter"/>
+    <w:link w:val="Ttulo6"/>
     <w:uiPriority w:val="9"/>
     <w:semiHidden/>
     <w:rsid w:val="00FD2B2A"/>
@@ -29289,10 +29335,10 @@
       <w:color w:val="595959" w:themeColor="text1" w:themeTint="A6"/>
     </w:rPr>
   </w:style>
-  <w:style w:type="character" w:customStyle="1" w:styleId="Heading7Char">
-    <w:name w:val="Heading 7 Char"/>
-    <w:basedOn w:val="DefaultParagraphFont"/>
-    <w:link w:val="Heading7"/>
+  <w:style w:type="character" w:customStyle="1" w:styleId="Ttulo7Car">
+    <w:name w:val="Título 7 Car"/>
+    <w:basedOn w:val="Fuentedeprrafopredeter"/>
+    <w:link w:val="Ttulo7"/>
     <w:uiPriority w:val="9"/>
     <w:semiHidden/>
     <w:rsid w:val="00FD2B2A"/>
@@ -29301,10 +29347,10 @@
       <w:color w:val="595959" w:themeColor="text1" w:themeTint="A6"/>
     </w:rPr>
   </w:style>
-  <w:style w:type="character" w:customStyle="1" w:styleId="Heading8Char">
-    <w:name w:val="Heading 8 Char"/>
-    <w:basedOn w:val="DefaultParagraphFont"/>
-    <w:link w:val="Heading8"/>
+  <w:style w:type="character" w:customStyle="1" w:styleId="Ttulo8Car">
+    <w:name w:val="Título 8 Car"/>
+    <w:basedOn w:val="Fuentedeprrafopredeter"/>
+    <w:link w:val="Ttulo8"/>
     <w:uiPriority w:val="9"/>
     <w:semiHidden/>
     <w:rsid w:val="00FD2B2A"/>
@@ -29315,10 +29361,10 @@
       <w:color w:val="272727" w:themeColor="text1" w:themeTint="D8"/>
     </w:rPr>
   </w:style>
-  <w:style w:type="character" w:customStyle="1" w:styleId="Heading9Char">
-    <w:name w:val="Heading 9 Char"/>
-    <w:basedOn w:val="DefaultParagraphFont"/>
-    <w:link w:val="Heading9"/>
+  <w:style w:type="character" w:customStyle="1" w:styleId="Ttulo9Car">
+    <w:name w:val="Título 9 Car"/>
+    <w:basedOn w:val="Fuentedeprrafopredeter"/>
+    <w:link w:val="Ttulo9"/>
     <w:uiPriority w:val="9"/>
     <w:semiHidden/>
     <w:rsid w:val="00FD2B2A"/>
@@ -29327,11 +29373,11 @@
       <w:color w:val="272727" w:themeColor="text1" w:themeTint="D8"/>
     </w:rPr>
   </w:style>
-  <w:style w:type="paragraph" w:styleId="Title">
+  <w:style w:type="paragraph" w:styleId="Ttulo">
     <w:name w:val="Title"/>
     <w:basedOn w:val="Normal"/>
     <w:next w:val="Normal"/>
-    <w:link w:val="TitleChar"/>
+    <w:link w:val="TtuloCar"/>
     <w:uiPriority w:val="10"/>
     <w:qFormat/>
     <w:rsid w:val="00FD2B2A"/>
@@ -29347,10 +29393,10 @@
       <w:szCs w:val="56"/>
     </w:rPr>
   </w:style>
-  <w:style w:type="character" w:customStyle="1" w:styleId="TitleChar">
-    <w:name w:val="Title Char"/>
-    <w:basedOn w:val="DefaultParagraphFont"/>
-    <w:link w:val="Title"/>
+  <w:style w:type="character" w:customStyle="1" w:styleId="TtuloCar">
+    <w:name w:val="Título Car"/>
+    <w:basedOn w:val="Fuentedeprrafopredeter"/>
+    <w:link w:val="Ttulo"/>
     <w:uiPriority w:val="10"/>
     <w:rsid w:val="00FD2B2A"/>
     <w:rPr>
@@ -29361,11 +29407,11 @@
       <w:szCs w:val="56"/>
     </w:rPr>
   </w:style>
-  <w:style w:type="paragraph" w:styleId="Subtitle">
+  <w:style w:type="paragraph" w:styleId="Subttulo">
     <w:name w:val="Subtitle"/>
     <w:basedOn w:val="Normal"/>
     <w:next w:val="Normal"/>
-    <w:link w:val="SubtitleChar"/>
+    <w:link w:val="SubttuloCar"/>
     <w:uiPriority w:val="11"/>
     <w:qFormat/>
     <w:rsid w:val="00FD2B2A"/>
@@ -29382,10 +29428,10 @@
       <w:szCs w:val="28"/>
     </w:rPr>
   </w:style>
-  <w:style w:type="character" w:customStyle="1" w:styleId="SubtitleChar">
-    <w:name w:val="Subtitle Char"/>
-    <w:basedOn w:val="DefaultParagraphFont"/>
-    <w:link w:val="Subtitle"/>
+  <w:style w:type="character" w:customStyle="1" w:styleId="SubttuloCar">
+    <w:name w:val="Subtítulo Car"/>
+    <w:basedOn w:val="Fuentedeprrafopredeter"/>
+    <w:link w:val="Subttulo"/>
     <w:uiPriority w:val="11"/>
     <w:rsid w:val="00FD2B2A"/>
     <w:rPr>
@@ -29396,11 +29442,11 @@
       <w:szCs w:val="28"/>
     </w:rPr>
   </w:style>
-  <w:style w:type="paragraph" w:styleId="Quote">
+  <w:style w:type="paragraph" w:styleId="Cita">
     <w:name w:val="Quote"/>
     <w:basedOn w:val="Normal"/>
     <w:next w:val="Normal"/>
-    <w:link w:val="QuoteChar"/>
+    <w:link w:val="CitaCar"/>
     <w:uiPriority w:val="29"/>
     <w:qFormat/>
     <w:rsid w:val="00FD2B2A"/>
@@ -29414,10 +29460,10 @@
       <w:color w:val="404040" w:themeColor="text1" w:themeTint="BF"/>
     </w:rPr>
   </w:style>
-  <w:style w:type="character" w:customStyle="1" w:styleId="QuoteChar">
-    <w:name w:val="Quote Char"/>
-    <w:basedOn w:val="DefaultParagraphFont"/>
-    <w:link w:val="Quote"/>
+  <w:style w:type="character" w:customStyle="1" w:styleId="CitaCar">
+    <w:name w:val="Cita Car"/>
+    <w:basedOn w:val="Fuentedeprrafopredeter"/>
+    <w:link w:val="Cita"/>
     <w:uiPriority w:val="29"/>
     <w:rsid w:val="00FD2B2A"/>
     <w:rPr>
@@ -29426,7 +29472,7 @@
       <w:color w:val="404040" w:themeColor="text1" w:themeTint="BF"/>
     </w:rPr>
   </w:style>
-  <w:style w:type="paragraph" w:styleId="ListParagraph">
+  <w:style w:type="paragraph" w:styleId="Prrafodelista">
     <w:name w:val="List Paragraph"/>
     <w:basedOn w:val="Normal"/>
     <w:uiPriority w:val="34"/>
@@ -29437,9 +29483,9 @@
       <w:contextualSpacing/>
     </w:pPr>
   </w:style>
-  <w:style w:type="character" w:styleId="IntenseEmphasis">
+  <w:style w:type="character" w:styleId="nfasisintenso">
     <w:name w:val="Intense Emphasis"/>
-    <w:basedOn w:val="DefaultParagraphFont"/>
+    <w:basedOn w:val="Fuentedeprrafopredeter"/>
     <w:uiPriority w:val="21"/>
     <w:qFormat/>
     <w:rsid w:val="00FD2B2A"/>
@@ -29449,11 +29495,11 @@
       <w:color w:val="0F4761" w:themeColor="accent1" w:themeShade="BF"/>
     </w:rPr>
   </w:style>
-  <w:style w:type="paragraph" w:styleId="IntenseQuote">
+  <w:style w:type="paragraph" w:styleId="Citadestacada">
     <w:name w:val="Intense Quote"/>
     <w:basedOn w:val="Normal"/>
     <w:next w:val="Normal"/>
-    <w:link w:val="IntenseQuoteChar"/>
+    <w:link w:val="CitadestacadaCar"/>
     <w:uiPriority w:val="30"/>
     <w:qFormat/>
     <w:rsid w:val="00FD2B2A"/>
@@ -29472,10 +29518,10 @@
       <w:color w:val="0F4761" w:themeColor="accent1" w:themeShade="BF"/>
     </w:rPr>
   </w:style>
-  <w:style w:type="character" w:customStyle="1" w:styleId="IntenseQuoteChar">
-    <w:name w:val="Intense Quote Char"/>
-    <w:basedOn w:val="DefaultParagraphFont"/>
-    <w:link w:val="IntenseQuote"/>
+  <w:style w:type="character" w:customStyle="1" w:styleId="CitadestacadaCar">
+    <w:name w:val="Cita destacada Car"/>
+    <w:basedOn w:val="Fuentedeprrafopredeter"/>
+    <w:link w:val="Citadestacada"/>
     <w:uiPriority w:val="30"/>
     <w:rsid w:val="00FD2B2A"/>
     <w:rPr>
@@ -29484,9 +29530,9 @@
       <w:color w:val="0F4761" w:themeColor="accent1" w:themeShade="BF"/>
     </w:rPr>
   </w:style>
-  <w:style w:type="character" w:styleId="IntenseReference">
+  <w:style w:type="character" w:styleId="Referenciaintensa">
     <w:name w:val="Intense Reference"/>
-    <w:basedOn w:val="DefaultParagraphFont"/>
+    <w:basedOn w:val="Fuentedeprrafopredeter"/>
     <w:uiPriority w:val="32"/>
     <w:qFormat/>
     <w:rsid w:val="00FD2B2A"/>
@@ -29500,8 +29546,8 @@
   </w:style>
   <w:style w:type="table" w:customStyle="1" w:styleId="TableGrid1">
     <w:name w:val="Table Grid1"/>
-    <w:basedOn w:val="TableNormal"/>
-    <w:next w:val="TableGrid"/>
+    <w:basedOn w:val="Tablanormal"/>
+    <w:next w:val="Tablaconcuadrcula"/>
     <w:uiPriority w:val="39"/>
     <w:rsid w:val="00FD1669"/>
     <w:pPr>
@@ -29526,9 +29572,9 @@
       </w:tblBorders>
     </w:tblPr>
   </w:style>
-  <w:style w:type="character" w:styleId="Hyperlink">
+  <w:style w:type="character" w:styleId="Hipervnculo">
     <w:name w:val="Hyperlink"/>
-    <w:basedOn w:val="DefaultParagraphFont"/>
+    <w:basedOn w:val="Fuentedeprrafopredeter"/>
     <w:uiPriority w:val="99"/>
     <w:unhideWhenUsed/>
     <w:rsid w:val="00FD1669"/>
@@ -29537,9 +29583,9 @@
       <w:u w:val="single"/>
     </w:rPr>
   </w:style>
-  <w:style w:type="paragraph" w:styleId="TOCHeading">
+  <w:style w:type="paragraph" w:styleId="TtuloTDC">
     <w:name w:val="TOC Heading"/>
-    <w:basedOn w:val="Heading1"/>
+    <w:basedOn w:val="Ttulo1"/>
     <w:next w:val="Normal"/>
     <w:uiPriority w:val="39"/>
     <w:unhideWhenUsed/>
@@ -29560,7 +29606,7 @@
       <w14:ligatures w14:val="none"/>
     </w:rPr>
   </w:style>
-  <w:style w:type="paragraph" w:styleId="TOC2">
+  <w:style w:type="paragraph" w:styleId="TDC2">
     <w:name w:val="toc 2"/>
     <w:basedOn w:val="Normal"/>
     <w:next w:val="Normal"/>
@@ -29581,7 +29627,7 @@
       <w14:ligatures w14:val="none"/>
     </w:rPr>
   </w:style>
-  <w:style w:type="paragraph" w:styleId="TOC1">
+  <w:style w:type="paragraph" w:styleId="TDC1">
     <w:name w:val="toc 1"/>
     <w:basedOn w:val="Normal"/>
     <w:next w:val="Normal"/>
@@ -29601,7 +29647,7 @@
       <w14:ligatures w14:val="none"/>
     </w:rPr>
   </w:style>
-  <w:style w:type="paragraph" w:styleId="TOC3">
+  <w:style w:type="paragraph" w:styleId="TDC3">
     <w:name w:val="toc 3"/>
     <w:basedOn w:val="Normal"/>
     <w:next w:val="Normal"/>
@@ -29622,9 +29668,9 @@
       <w14:ligatures w14:val="none"/>
     </w:rPr>
   </w:style>
-  <w:style w:type="table" w:styleId="TableGrid">
+  <w:style w:type="table" w:styleId="Tablaconcuadrcula">
     <w:name w:val="Table Grid"/>
-    <w:basedOn w:val="TableNormal"/>
+    <w:basedOn w:val="Tablanormal"/>
     <w:uiPriority w:val="39"/>
     <w:rsid w:val="00FD1669"/>
     <w:pPr>
@@ -29641,10 +29687,10 @@
       </w:tblBorders>
     </w:tblPr>
   </w:style>
-  <w:style w:type="paragraph" w:styleId="Header">
+  <w:style w:type="paragraph" w:styleId="Encabezado">
     <w:name w:val="header"/>
     <w:basedOn w:val="Normal"/>
-    <w:link w:val="HeaderChar"/>
+    <w:link w:val="EncabezadoCar"/>
     <w:uiPriority w:val="99"/>
     <w:unhideWhenUsed/>
     <w:rsid w:val="008724CC"/>
@@ -29656,17 +29702,17 @@
       <w:spacing w:after="0" w:line="240" w:lineRule="auto"/>
     </w:pPr>
   </w:style>
-  <w:style w:type="character" w:customStyle="1" w:styleId="HeaderChar">
-    <w:name w:val="Header Char"/>
-    <w:basedOn w:val="DefaultParagraphFont"/>
-    <w:link w:val="Header"/>
+  <w:style w:type="character" w:customStyle="1" w:styleId="EncabezadoCar">
+    <w:name w:val="Encabezado Car"/>
+    <w:basedOn w:val="Fuentedeprrafopredeter"/>
+    <w:link w:val="Encabezado"/>
     <w:uiPriority w:val="99"/>
     <w:rsid w:val="008724CC"/>
   </w:style>
-  <w:style w:type="paragraph" w:styleId="Footer">
+  <w:style w:type="paragraph" w:styleId="Piedepgina">
     <w:name w:val="footer"/>
     <w:basedOn w:val="Normal"/>
-    <w:link w:val="FooterChar"/>
+    <w:link w:val="PiedepginaCar"/>
     <w:uiPriority w:val="99"/>
     <w:unhideWhenUsed/>
     <w:rsid w:val="008724CC"/>
@@ -29678,16 +29724,16 @@
       <w:spacing w:after="0" w:line="240" w:lineRule="auto"/>
     </w:pPr>
   </w:style>
-  <w:style w:type="character" w:customStyle="1" w:styleId="FooterChar">
-    <w:name w:val="Footer Char"/>
-    <w:basedOn w:val="DefaultParagraphFont"/>
-    <w:link w:val="Footer"/>
+  <w:style w:type="character" w:customStyle="1" w:styleId="PiedepginaCar">
+    <w:name w:val="Pie de página Car"/>
+    <w:basedOn w:val="Fuentedeprrafopredeter"/>
+    <w:link w:val="Piedepgina"/>
     <w:uiPriority w:val="99"/>
     <w:rsid w:val="008724CC"/>
   </w:style>
   <w:style w:type="character" w:customStyle="1" w:styleId="Mencinsinresolver1">
     <w:name w:val="Mención sin resolver1"/>
-    <w:basedOn w:val="DefaultParagraphFont"/>
+    <w:basedOn w:val="Fuentedeprrafopredeter"/>
     <w:uiPriority w:val="99"/>
     <w:semiHidden/>
     <w:unhideWhenUsed/>
@@ -29697,10 +29743,10 @@
       <w:shd w:val="clear" w:color="auto" w:fill="E1DFDD"/>
     </w:rPr>
   </w:style>
-  <w:style w:type="paragraph" w:styleId="FootnoteText">
+  <w:style w:type="paragraph" w:styleId="Textonotapie">
     <w:name w:val="footnote text"/>
     <w:basedOn w:val="Normal"/>
-    <w:link w:val="FootnoteTextChar"/>
+    <w:link w:val="TextonotapieCar"/>
     <w:uiPriority w:val="99"/>
     <w:semiHidden/>
     <w:unhideWhenUsed/>
@@ -29713,10 +29759,10 @@
       <w:szCs w:val="20"/>
     </w:rPr>
   </w:style>
-  <w:style w:type="character" w:customStyle="1" w:styleId="FootnoteTextChar">
-    <w:name w:val="Footnote Text Char"/>
-    <w:basedOn w:val="DefaultParagraphFont"/>
-    <w:link w:val="FootnoteText"/>
+  <w:style w:type="character" w:customStyle="1" w:styleId="TextonotapieCar">
+    <w:name w:val="Texto nota pie Car"/>
+    <w:basedOn w:val="Fuentedeprrafopredeter"/>
+    <w:link w:val="Textonotapie"/>
     <w:uiPriority w:val="99"/>
     <w:semiHidden/>
     <w:rsid w:val="00C94EB4"/>
@@ -29725,9 +29771,9 @@
       <w:szCs w:val="20"/>
     </w:rPr>
   </w:style>
-  <w:style w:type="character" w:styleId="FootnoteReference">
+  <w:style w:type="character" w:styleId="Refdenotaalpie">
     <w:name w:val="footnote reference"/>
-    <w:basedOn w:val="DefaultParagraphFont"/>
+    <w:basedOn w:val="Fuentedeprrafopredeter"/>
     <w:uiPriority w:val="99"/>
     <w:semiHidden/>
     <w:unhideWhenUsed/>
@@ -29736,9 +29782,9 @@
       <w:vertAlign w:val="superscript"/>
     </w:rPr>
   </w:style>
-  <w:style w:type="character" w:styleId="FollowedHyperlink">
+  <w:style w:type="character" w:styleId="Hipervnculovisitado">
     <w:name w:val="FollowedHyperlink"/>
-    <w:basedOn w:val="DefaultParagraphFont"/>
+    <w:basedOn w:val="Fuentedeprrafopredeter"/>
     <w:uiPriority w:val="99"/>
     <w:semiHidden/>
     <w:unhideWhenUsed/>
@@ -29748,9 +29794,9 @@
       <w:u w:val="single"/>
     </w:rPr>
   </w:style>
-  <w:style w:type="character" w:styleId="UnresolvedMention">
+  <w:style w:type="character" w:styleId="Mencinsinresolver">
     <w:name w:val="Unresolved Mention"/>
-    <w:basedOn w:val="DefaultParagraphFont"/>
+    <w:basedOn w:val="Fuentedeprrafopredeter"/>
     <w:uiPriority w:val="99"/>
     <w:semiHidden/>
     <w:unhideWhenUsed/>

</xml_diff>